<commit_message>
update CV to include ASTRO abstracts
</commit_message>
<xml_diff>
--- a/Clincal_CV/BMAnderson CV.docx
+++ b/Clincal_CV/BMAnderson CV.docx
@@ -526,7 +526,23 @@
           <w:rFonts w:ascii="Times New Roman" w:hAnsi="Times New Roman" w:cs="Times New Roman"/>
           <w:color w:val="000000" w:themeColor="text1"/>
         </w:rPr>
-        <w:t xml:space="preserve"> for improving patient safety and plan quality in radiation oncology. Facilitating the implementation of </w:t>
+        <w:t xml:space="preserve"> for improving patient safety and </w:t>
+      </w:r>
+      <w:proofErr w:type="gramStart"/>
+      <w:r>
+        <w:rPr>
+          <w:rFonts w:ascii="Times New Roman" w:hAnsi="Times New Roman" w:cs="Times New Roman"/>
+          <w:color w:val="000000" w:themeColor="text1"/>
+        </w:rPr>
+        <w:t>plan</w:t>
+      </w:r>
+      <w:proofErr w:type="gramEnd"/>
+      <w:r>
+        <w:rPr>
+          <w:rFonts w:ascii="Times New Roman" w:hAnsi="Times New Roman" w:cs="Times New Roman"/>
+          <w:color w:val="000000" w:themeColor="text1"/>
+        </w:rPr>
+        <w:t xml:space="preserve"> quality in radiation oncology. Facilitating the implementation of </w:t>
       </w:r>
       <w:r>
         <w:rPr>
@@ -810,7 +826,23 @@
           <w:rFonts w:ascii="Times New Roman" w:hAnsi="Times New Roman" w:cs="Times New Roman"/>
           <w:color w:val="000000" w:themeColor="text1"/>
         </w:rPr>
-        <w:t>American Association of Physicists in Medicine (AAPM) Summer Undergraduate Fellowship Program: 10 week program designed to gain experience in medical physics; work spent commissioning new Elekta linear accelerator in Eureka, CA (2014)</w:t>
+        <w:t xml:space="preserve">American Association of Physicists in Medicine (AAPM) Summer Undergraduate Fellowship Program: </w:t>
+      </w:r>
+      <w:proofErr w:type="gramStart"/>
+      <w:r>
+        <w:rPr>
+          <w:rFonts w:ascii="Times New Roman" w:hAnsi="Times New Roman" w:cs="Times New Roman"/>
+          <w:color w:val="000000" w:themeColor="text1"/>
+        </w:rPr>
+        <w:t>10 week</w:t>
+      </w:r>
+      <w:proofErr w:type="gramEnd"/>
+      <w:r>
+        <w:rPr>
+          <w:rFonts w:ascii="Times New Roman" w:hAnsi="Times New Roman" w:cs="Times New Roman"/>
+          <w:color w:val="000000" w:themeColor="text1"/>
+        </w:rPr>
+        <w:t xml:space="preserve"> program designed to gain experience in medical physics; work spent commissioning new Elekta linear accelerator in Eureka, CA (2014)</w:t>
       </w:r>
     </w:p>
     <w:p>
@@ -1062,8 +1094,17 @@
           <w:rFonts w:ascii="Times New Roman" w:hAnsi="Times New Roman" w:cs="Times New Roman"/>
           <w:color w:val="000000" w:themeColor="text1"/>
         </w:rPr>
-        <w:t>True Beam: resident responsibility</w:t>
-      </w:r>
+        <w:t xml:space="preserve">True Beam: </w:t>
+      </w:r>
+      <w:proofErr w:type="gramStart"/>
+      <w:r>
+        <w:rPr>
+          <w:rFonts w:ascii="Times New Roman" w:hAnsi="Times New Roman" w:cs="Times New Roman"/>
+          <w:color w:val="000000" w:themeColor="text1"/>
+        </w:rPr>
+        <w:t>resident responsibility</w:t>
+      </w:r>
+      <w:proofErr w:type="gramEnd"/>
       <w:r>
         <w:rPr>
           <w:rFonts w:ascii="Times New Roman" w:hAnsi="Times New Roman" w:cs="Times New Roman"/>
@@ -2241,7 +2282,23 @@
           <w:rFonts w:ascii="Times New Roman" w:hAnsi="Times New Roman" w:cs="Times New Roman"/>
           <w:color w:val="000000" w:themeColor="text1"/>
         </w:rPr>
-        <w:t>: Inherent frames of reference are needed to be broken prior to registration of MR and CT images in the UCSD clinic. This tool automatically breaks the inherent registration among the MR images in an efficient manner</w:t>
+        <w:t xml:space="preserve">: Inherent frames of reference </w:t>
+      </w:r>
+      <w:proofErr w:type="gramStart"/>
+      <w:r>
+        <w:rPr>
+          <w:rFonts w:ascii="Times New Roman" w:hAnsi="Times New Roman" w:cs="Times New Roman"/>
+          <w:color w:val="000000" w:themeColor="text1"/>
+        </w:rPr>
+        <w:t>are needed</w:t>
+      </w:r>
+      <w:proofErr w:type="gramEnd"/>
+      <w:r>
+        <w:rPr>
+          <w:rFonts w:ascii="Times New Roman" w:hAnsi="Times New Roman" w:cs="Times New Roman"/>
+          <w:color w:val="000000" w:themeColor="text1"/>
+        </w:rPr>
+        <w:t xml:space="preserve"> to be broken prior to registration of MR and CT images in the UCSD clinic. This tool automatically breaks the inherent registration among the MR images in an efficient manner</w:t>
       </w:r>
       <w:r>
         <w:rPr>
@@ -2499,7 +2556,15 @@
           <w:rFonts w:ascii="Times New Roman" w:hAnsi="Times New Roman" w:cs="Times New Roman"/>
           <w:color w:val="000000" w:themeColor="text1"/>
         </w:rPr>
-        <w:t xml:space="preserve"> place</w:t>
+        <w:t xml:space="preserve"> </w:t>
+      </w:r>
+      <w:proofErr w:type="gramStart"/>
+      <w:r>
+        <w:rPr>
+          <w:rFonts w:ascii="Times New Roman" w:hAnsi="Times New Roman" w:cs="Times New Roman"/>
+          <w:color w:val="000000" w:themeColor="text1"/>
+        </w:rPr>
+        <w:t>place</w:t>
       </w:r>
       <w:r>
         <w:rPr>
@@ -2513,7 +2578,15 @@
           <w:rFonts w:ascii="Times New Roman" w:hAnsi="Times New Roman" w:cs="Times New Roman"/>
           <w:color w:val="000000" w:themeColor="text1"/>
         </w:rPr>
-        <w:t>‘Why is scientific communication important?’</w:t>
+        <w:t>‘</w:t>
+      </w:r>
+      <w:proofErr w:type="gramEnd"/>
+      <w:r>
+        <w:rPr>
+          <w:rFonts w:ascii="Times New Roman" w:hAnsi="Times New Roman" w:cs="Times New Roman"/>
+          <w:color w:val="000000" w:themeColor="text1"/>
+        </w:rPr>
+        <w:t>Why is scientific communication important?’</w:t>
       </w:r>
       <w:r>
         <w:rPr>
@@ -2920,9 +2993,18 @@
           <w:rFonts w:ascii="Times New Roman" w:hAnsi="Times New Roman" w:cs="Times New Roman"/>
           <w:color w:val="000000" w:themeColor="text1"/>
         </w:rPr>
-        <w:t xml:space="preserve"> Part of this work is also in implementing automated treatment checks ‘</w:t>
+        <w:t xml:space="preserve"> Part of this work is also in implementing automated treatment </w:t>
+      </w:r>
+      <w:proofErr w:type="gramStart"/>
+      <w:r>
+        <w:rPr>
+          <w:rFonts w:ascii="Times New Roman" w:hAnsi="Times New Roman" w:cs="Times New Roman"/>
+          <w:color w:val="000000" w:themeColor="text1"/>
+        </w:rPr>
+        <w:t>checks ‘</w:t>
       </w:r>
       <w:proofErr w:type="spellStart"/>
+      <w:proofErr w:type="gramEnd"/>
       <w:r>
         <w:rPr>
           <w:rFonts w:ascii="Times New Roman" w:hAnsi="Times New Roman" w:cs="Times New Roman"/>
@@ -2936,7 +3018,39 @@
           <w:rFonts w:ascii="Times New Roman" w:hAnsi="Times New Roman" w:cs="Times New Roman"/>
           <w:color w:val="000000" w:themeColor="text1"/>
         </w:rPr>
-        <w:t>’ to provide added support to the dosimetrists and physicists.</w:t>
+        <w:t>’</w:t>
+      </w:r>
+      <w:proofErr w:type="gramStart"/>
+      <w:r>
+        <w:rPr>
+          <w:rFonts w:ascii="Times New Roman" w:hAnsi="Times New Roman" w:cs="Times New Roman"/>
+          <w:color w:val="000000" w:themeColor="text1"/>
+        </w:rPr>
+        <w:t xml:space="preserve"> to</w:t>
+      </w:r>
+      <w:proofErr w:type="gramEnd"/>
+      <w:r>
+        <w:rPr>
+          <w:rFonts w:ascii="Times New Roman" w:hAnsi="Times New Roman" w:cs="Times New Roman"/>
+          <w:color w:val="000000" w:themeColor="text1"/>
+        </w:rPr>
+        <w:t xml:space="preserve"> provide added support to </w:t>
+      </w:r>
+      <w:proofErr w:type="gramStart"/>
+      <w:r>
+        <w:rPr>
+          <w:rFonts w:ascii="Times New Roman" w:hAnsi="Times New Roman" w:cs="Times New Roman"/>
+          <w:color w:val="000000" w:themeColor="text1"/>
+        </w:rPr>
+        <w:t>the dosimetrists</w:t>
+      </w:r>
+      <w:proofErr w:type="gramEnd"/>
+      <w:r>
+        <w:rPr>
+          <w:rFonts w:ascii="Times New Roman" w:hAnsi="Times New Roman" w:cs="Times New Roman"/>
+          <w:color w:val="000000" w:themeColor="text1"/>
+        </w:rPr>
+        <w:t xml:space="preserve"> and physicists.</w:t>
       </w:r>
     </w:p>
     <w:p>
@@ -3155,12 +3269,21 @@
         </w:rPr>
         <w:t xml:space="preserve">MD Anderson, </w:t>
       </w:r>
-      <w:r>
-        <w:rPr>
-          <w:rFonts w:ascii="Times New Roman" w:hAnsi="Times New Roman" w:cs="Times New Roman"/>
-          <w:color w:val="000000" w:themeColor="text1"/>
-        </w:rPr>
-        <w:t xml:space="preserve">Master’s Thesis: </w:t>
+      <w:proofErr w:type="gramStart"/>
+      <w:r>
+        <w:rPr>
+          <w:rFonts w:ascii="Times New Roman" w:hAnsi="Times New Roman" w:cs="Times New Roman"/>
+          <w:color w:val="000000" w:themeColor="text1"/>
+        </w:rPr>
+        <w:t>Master’s</w:t>
+      </w:r>
+      <w:proofErr w:type="gramEnd"/>
+      <w:r>
+        <w:rPr>
+          <w:rFonts w:ascii="Times New Roman" w:hAnsi="Times New Roman" w:cs="Times New Roman"/>
+          <w:color w:val="000000" w:themeColor="text1"/>
+        </w:rPr>
+        <w:t xml:space="preserve"> Thesis: </w:t>
       </w:r>
       <w:r>
         <w:rPr>
@@ -3222,42 +3345,28 @@
           <w:rFonts w:ascii="Times New Roman" w:hAnsi="Times New Roman" w:cs="Times New Roman"/>
           <w:color w:val="000000" w:themeColor="text1"/>
         </w:rPr>
-        <w:t>Mass</w:t>
-      </w:r>
-      <w:r>
-        <w:rPr>
-          <w:rFonts w:ascii="Times New Roman" w:hAnsi="Times New Roman" w:cs="Times New Roman"/>
-          <w:color w:val="000000" w:themeColor="text1"/>
-        </w:rPr>
-        <w:t>achusetts</w:t>
-      </w:r>
-      <w:r>
-        <w:rPr>
-          <w:rFonts w:ascii="Times New Roman" w:hAnsi="Times New Roman" w:cs="Times New Roman"/>
-          <w:color w:val="000000" w:themeColor="text1"/>
-        </w:rPr>
-        <w:t xml:space="preserve"> General </w:t>
-      </w:r>
-      <w:r>
-        <w:rPr>
-          <w:rFonts w:ascii="Times New Roman" w:hAnsi="Times New Roman" w:cs="Times New Roman"/>
-          <w:color w:val="000000" w:themeColor="text1"/>
-        </w:rPr>
-        <w:t xml:space="preserve">Hospital &amp; </w:t>
-      </w:r>
-      <w:r>
-        <w:rPr>
-          <w:rFonts w:ascii="Times New Roman" w:hAnsi="Times New Roman" w:cs="Times New Roman"/>
-          <w:color w:val="000000" w:themeColor="text1"/>
-        </w:rPr>
-        <w:t>Brigham</w:t>
-      </w:r>
-      <w:r>
-        <w:rPr>
-          <w:rFonts w:ascii="Times New Roman" w:hAnsi="Times New Roman" w:cs="Times New Roman"/>
-          <w:color w:val="000000" w:themeColor="text1"/>
-        </w:rPr>
-        <w:t>, Radiation Oncology Medical Physics Seminar Series (12/2025): “Building AI for the Clinic: When to use it and when to avoid it”</w:t>
+        <w:t xml:space="preserve">Winter Institute of Medical Physics (WIMP) </w:t>
+      </w:r>
+      <w:r>
+        <w:rPr>
+          <w:rFonts w:ascii="Times New Roman" w:hAnsi="Times New Roman" w:cs="Times New Roman"/>
+          <w:color w:val="000000" w:themeColor="text1"/>
+        </w:rPr>
+        <w:t>(02/2026)</w:t>
+      </w:r>
+      <w:r>
+        <w:rPr>
+          <w:rFonts w:ascii="Times New Roman" w:hAnsi="Times New Roman" w:cs="Times New Roman"/>
+          <w:color w:val="000000" w:themeColor="text1"/>
+        </w:rPr>
+        <w:t xml:space="preserve">: </w:t>
+      </w:r>
+      <w:r>
+        <w:rPr>
+          <w:rFonts w:ascii="Times New Roman" w:hAnsi="Times New Roman" w:cs="Times New Roman"/>
+          <w:color w:val="000000" w:themeColor="text1"/>
+        </w:rPr>
+        <w:t xml:space="preserve">“Making the Schedule: Optimizing Fairness as Best We Can” </w:t>
       </w:r>
     </w:p>
     <w:p>
@@ -3280,7 +3389,42 @@
           <w:rFonts w:ascii="Times New Roman" w:hAnsi="Times New Roman" w:cs="Times New Roman"/>
           <w:color w:val="000000" w:themeColor="text1"/>
         </w:rPr>
-        <w:t>MD Anderson, Image Guided Cancer Therapy Research Program &amp; CCSG Image-Guided Interventions &amp; Insights Program (06/2025): “Radiation Oncology &amp; Data Science: Successes, Failures, and Lessons Learned”</w:t>
+        <w:t>Mass</w:t>
+      </w:r>
+      <w:r>
+        <w:rPr>
+          <w:rFonts w:ascii="Times New Roman" w:hAnsi="Times New Roman" w:cs="Times New Roman"/>
+          <w:color w:val="000000" w:themeColor="text1"/>
+        </w:rPr>
+        <w:t>achusetts</w:t>
+      </w:r>
+      <w:r>
+        <w:rPr>
+          <w:rFonts w:ascii="Times New Roman" w:hAnsi="Times New Roman" w:cs="Times New Roman"/>
+          <w:color w:val="000000" w:themeColor="text1"/>
+        </w:rPr>
+        <w:t xml:space="preserve"> General </w:t>
+      </w:r>
+      <w:r>
+        <w:rPr>
+          <w:rFonts w:ascii="Times New Roman" w:hAnsi="Times New Roman" w:cs="Times New Roman"/>
+          <w:color w:val="000000" w:themeColor="text1"/>
+        </w:rPr>
+        <w:t xml:space="preserve">Hospital &amp; </w:t>
+      </w:r>
+      <w:r>
+        <w:rPr>
+          <w:rFonts w:ascii="Times New Roman" w:hAnsi="Times New Roman" w:cs="Times New Roman"/>
+          <w:color w:val="000000" w:themeColor="text1"/>
+        </w:rPr>
+        <w:t>Brigham</w:t>
+      </w:r>
+      <w:r>
+        <w:rPr>
+          <w:rFonts w:ascii="Times New Roman" w:hAnsi="Times New Roman" w:cs="Times New Roman"/>
+          <w:color w:val="000000" w:themeColor="text1"/>
+        </w:rPr>
+        <w:t>, Radiation Oncology Medical Physics Seminar Series (12/2025): “Building AI for the Clinic: When to use it and when to avoid it”</w:t>
       </w:r>
     </w:p>
     <w:p>
@@ -3303,7 +3447,7 @@
           <w:rFonts w:ascii="Times New Roman" w:hAnsi="Times New Roman" w:cs="Times New Roman"/>
           <w:color w:val="000000" w:themeColor="text1"/>
         </w:rPr>
-        <w:t>University of North Carolina, Chapel Hill Research Retreat (05/2025): “Standardizing for Success: The Future of Radiation Oncology Data”</w:t>
+        <w:t>MD Anderson, Image Guided Cancer Therapy Research Program &amp; CCSG Image-Guided Interventions &amp; Insights Program (06/2025): “Radiation Oncology &amp; Data Science: Successes, Failures, and Lessons Learned”</w:t>
       </w:r>
     </w:p>
     <w:p>
@@ -3326,7 +3470,7 @@
           <w:rFonts w:ascii="Times New Roman" w:hAnsi="Times New Roman" w:cs="Times New Roman"/>
           <w:color w:val="000000" w:themeColor="text1"/>
         </w:rPr>
-        <w:t>Winter Institute of Medical Physics (WIMP) Workshop (02/2025)</w:t>
+        <w:t>University of North Carolina, Chapel Hill Research Retreat (05/2025): “Standardizing for Success: The Future of Radiation Oncology Data”</w:t>
       </w:r>
     </w:p>
     <w:p>
@@ -3349,7 +3493,7 @@
           <w:rFonts w:ascii="Times New Roman" w:hAnsi="Times New Roman" w:cs="Times New Roman"/>
           <w:color w:val="000000" w:themeColor="text1"/>
         </w:rPr>
-        <w:t>Healthcare Data &amp; Analytics Association (HDAA): “Building Data Highways: Mining our Treatment Planning System” (09/2024)</w:t>
+        <w:t>Winter Institute of Medical Physics (WIMP) Workshop (02/2025)</w:t>
       </w:r>
     </w:p>
     <w:p>
@@ -3372,98 +3516,7 @@
           <w:rFonts w:ascii="Times New Roman" w:hAnsi="Times New Roman" w:cs="Times New Roman"/>
           <w:color w:val="000000" w:themeColor="text1"/>
         </w:rPr>
-        <w:t>U</w:t>
-      </w:r>
-      <w:r>
-        <w:rPr>
-          <w:rFonts w:ascii="Times New Roman" w:hAnsi="Times New Roman" w:cs="Times New Roman"/>
-          <w:color w:val="000000" w:themeColor="text1"/>
-        </w:rPr>
-        <w:t>niversity of North Carolina,</w:t>
-      </w:r>
-      <w:r>
-        <w:rPr>
-          <w:rFonts w:ascii="Times New Roman" w:hAnsi="Times New Roman" w:cs="Times New Roman"/>
-          <w:color w:val="000000" w:themeColor="text1"/>
-        </w:rPr>
-        <w:t xml:space="preserve"> The Analytics Community (TAC)</w:t>
-      </w:r>
-      <w:r>
-        <w:rPr>
-          <w:rFonts w:ascii="Times New Roman" w:hAnsi="Times New Roman" w:cs="Times New Roman"/>
-          <w:color w:val="000000" w:themeColor="text1"/>
-        </w:rPr>
-        <w:t>:</w:t>
-      </w:r>
-      <w:r>
-        <w:rPr>
-          <w:rFonts w:ascii="Times New Roman" w:hAnsi="Times New Roman" w:cs="Times New Roman"/>
-          <w:color w:val="000000" w:themeColor="text1"/>
-        </w:rPr>
-        <w:t xml:space="preserve"> “</w:t>
-      </w:r>
-      <w:r>
-        <w:rPr>
-          <w:rFonts w:ascii="Times New Roman" w:hAnsi="Times New Roman" w:cs="Times New Roman"/>
-          <w:color w:val="000000" w:themeColor="text1"/>
-        </w:rPr>
-        <w:t xml:space="preserve">Getting more out of </w:t>
-      </w:r>
-      <w:r>
-        <w:rPr>
-          <w:rFonts w:ascii="Times New Roman" w:hAnsi="Times New Roman" w:cs="Times New Roman"/>
-          <w:color w:val="000000" w:themeColor="text1"/>
-        </w:rPr>
-        <w:t xml:space="preserve">our </w:t>
-      </w:r>
-      <w:r>
-        <w:rPr>
-          <w:rFonts w:ascii="Times New Roman" w:hAnsi="Times New Roman" w:cs="Times New Roman"/>
-          <w:color w:val="000000" w:themeColor="text1"/>
-        </w:rPr>
-        <w:t>H</w:t>
-      </w:r>
-      <w:r>
-        <w:rPr>
-          <w:rFonts w:ascii="Times New Roman" w:hAnsi="Times New Roman" w:cs="Times New Roman"/>
-          <w:color w:val="000000" w:themeColor="text1"/>
-        </w:rPr>
-        <w:t xml:space="preserve">ealthcare </w:t>
-      </w:r>
-      <w:r>
-        <w:rPr>
-          <w:rFonts w:ascii="Times New Roman" w:hAnsi="Times New Roman" w:cs="Times New Roman"/>
-          <w:color w:val="000000" w:themeColor="text1"/>
-        </w:rPr>
-        <w:t>I</w:t>
-      </w:r>
-      <w:r>
-        <w:rPr>
-          <w:rFonts w:ascii="Times New Roman" w:hAnsi="Times New Roman" w:cs="Times New Roman"/>
-          <w:color w:val="000000" w:themeColor="text1"/>
-        </w:rPr>
-        <w:t>nfrastructure</w:t>
-      </w:r>
-      <w:r>
-        <w:rPr>
-          <w:rFonts w:ascii="Times New Roman" w:hAnsi="Times New Roman" w:cs="Times New Roman"/>
-          <w:color w:val="000000" w:themeColor="text1"/>
-        </w:rPr>
-        <w:t>” (0</w:t>
-      </w:r>
-      <w:r>
-        <w:rPr>
-          <w:rFonts w:ascii="Times New Roman" w:hAnsi="Times New Roman" w:cs="Times New Roman"/>
-          <w:color w:val="000000" w:themeColor="text1"/>
-        </w:rPr>
-        <w:t>8</w:t>
-      </w:r>
-      <w:r>
-        <w:rPr>
-          <w:rFonts w:ascii="Times New Roman" w:hAnsi="Times New Roman" w:cs="Times New Roman"/>
-          <w:color w:val="000000" w:themeColor="text1"/>
-        </w:rPr>
-        <w:t>/2024)</w:t>
+        <w:t>Healthcare Data &amp; Analytics Association (HDAA): “Building Data Highways: Mining our Treatment Planning System” (09/2024)</w:t>
       </w:r>
     </w:p>
     <w:p>
@@ -3486,7 +3539,98 @@
           <w:rFonts w:ascii="Times New Roman" w:hAnsi="Times New Roman" w:cs="Times New Roman"/>
           <w:color w:val="000000" w:themeColor="text1"/>
         </w:rPr>
-        <w:t>AAPM, Therapy Symposium: Therapeutic Planning, Delivery, Adaptation: “AI for segmentation and Registration” (07/2024)</w:t>
+        <w:t>U</w:t>
+      </w:r>
+      <w:r>
+        <w:rPr>
+          <w:rFonts w:ascii="Times New Roman" w:hAnsi="Times New Roman" w:cs="Times New Roman"/>
+          <w:color w:val="000000" w:themeColor="text1"/>
+        </w:rPr>
+        <w:t>niversity of North Carolina,</w:t>
+      </w:r>
+      <w:r>
+        <w:rPr>
+          <w:rFonts w:ascii="Times New Roman" w:hAnsi="Times New Roman" w:cs="Times New Roman"/>
+          <w:color w:val="000000" w:themeColor="text1"/>
+        </w:rPr>
+        <w:t xml:space="preserve"> The Analytics Community (TAC)</w:t>
+      </w:r>
+      <w:r>
+        <w:rPr>
+          <w:rFonts w:ascii="Times New Roman" w:hAnsi="Times New Roman" w:cs="Times New Roman"/>
+          <w:color w:val="000000" w:themeColor="text1"/>
+        </w:rPr>
+        <w:t>:</w:t>
+      </w:r>
+      <w:r>
+        <w:rPr>
+          <w:rFonts w:ascii="Times New Roman" w:hAnsi="Times New Roman" w:cs="Times New Roman"/>
+          <w:color w:val="000000" w:themeColor="text1"/>
+        </w:rPr>
+        <w:t xml:space="preserve"> “</w:t>
+      </w:r>
+      <w:r>
+        <w:rPr>
+          <w:rFonts w:ascii="Times New Roman" w:hAnsi="Times New Roman" w:cs="Times New Roman"/>
+          <w:color w:val="000000" w:themeColor="text1"/>
+        </w:rPr>
+        <w:t xml:space="preserve">Getting more out of </w:t>
+      </w:r>
+      <w:r>
+        <w:rPr>
+          <w:rFonts w:ascii="Times New Roman" w:hAnsi="Times New Roman" w:cs="Times New Roman"/>
+          <w:color w:val="000000" w:themeColor="text1"/>
+        </w:rPr>
+        <w:t xml:space="preserve">our </w:t>
+      </w:r>
+      <w:r>
+        <w:rPr>
+          <w:rFonts w:ascii="Times New Roman" w:hAnsi="Times New Roman" w:cs="Times New Roman"/>
+          <w:color w:val="000000" w:themeColor="text1"/>
+        </w:rPr>
+        <w:t>H</w:t>
+      </w:r>
+      <w:r>
+        <w:rPr>
+          <w:rFonts w:ascii="Times New Roman" w:hAnsi="Times New Roman" w:cs="Times New Roman"/>
+          <w:color w:val="000000" w:themeColor="text1"/>
+        </w:rPr>
+        <w:t xml:space="preserve">ealthcare </w:t>
+      </w:r>
+      <w:r>
+        <w:rPr>
+          <w:rFonts w:ascii="Times New Roman" w:hAnsi="Times New Roman" w:cs="Times New Roman"/>
+          <w:color w:val="000000" w:themeColor="text1"/>
+        </w:rPr>
+        <w:t>I</w:t>
+      </w:r>
+      <w:r>
+        <w:rPr>
+          <w:rFonts w:ascii="Times New Roman" w:hAnsi="Times New Roman" w:cs="Times New Roman"/>
+          <w:color w:val="000000" w:themeColor="text1"/>
+        </w:rPr>
+        <w:t>nfrastructure</w:t>
+      </w:r>
+      <w:r>
+        <w:rPr>
+          <w:rFonts w:ascii="Times New Roman" w:hAnsi="Times New Roman" w:cs="Times New Roman"/>
+          <w:color w:val="000000" w:themeColor="text1"/>
+        </w:rPr>
+        <w:t>” (0</w:t>
+      </w:r>
+      <w:r>
+        <w:rPr>
+          <w:rFonts w:ascii="Times New Roman" w:hAnsi="Times New Roman" w:cs="Times New Roman"/>
+          <w:color w:val="000000" w:themeColor="text1"/>
+        </w:rPr>
+        <w:t>8</w:t>
+      </w:r>
+      <w:r>
+        <w:rPr>
+          <w:rFonts w:ascii="Times New Roman" w:hAnsi="Times New Roman" w:cs="Times New Roman"/>
+          <w:color w:val="000000" w:themeColor="text1"/>
+        </w:rPr>
+        <w:t>/2024)</w:t>
       </w:r>
     </w:p>
     <w:p>
@@ -3510,21 +3654,7 @@
           <w:color w:val="000000" w:themeColor="text1"/>
         </w:rPr>
         <w:lastRenderedPageBreak/>
-        <w:t>Georgia Institute of Technology, invited lecturer: “</w:t>
-      </w:r>
-      <w:r>
-        <w:rPr>
-          <w:rFonts w:ascii="Times New Roman" w:hAnsi="Times New Roman" w:cs="Times New Roman"/>
-          <w:color w:val="000000" w:themeColor="text1"/>
-        </w:rPr>
-        <w:t>Reimagining Medical Physics: A Deeper Dive into Deep Learning</w:t>
-      </w:r>
-      <w:r>
-        <w:rPr>
-          <w:rFonts w:ascii="Times New Roman" w:hAnsi="Times New Roman" w:cs="Times New Roman"/>
-          <w:color w:val="000000" w:themeColor="text1"/>
-        </w:rPr>
-        <w:t>” (11/2023)</w:t>
+        <w:t>AAPM, Therapy Symposium: Therapeutic Planning, Delivery, Adaptation: “AI for segmentation and Registration” (07/2024)</w:t>
       </w:r>
     </w:p>
     <w:p>
@@ -3547,21 +3677,21 @@
           <w:rFonts w:ascii="Times New Roman" w:hAnsi="Times New Roman" w:cs="Times New Roman"/>
           <w:color w:val="000000" w:themeColor="text1"/>
         </w:rPr>
-        <w:t>ESTRO-AAPM, Joint Symposium Session: “</w:t>
-      </w:r>
-      <w:r>
-        <w:rPr>
-          <w:rFonts w:ascii="Times New Roman" w:hAnsi="Times New Roman" w:cs="Times New Roman"/>
-          <w:color w:val="000000" w:themeColor="text1"/>
-        </w:rPr>
-        <w:t>Estro-AAPM: Big data, Big Headache”</w:t>
-      </w:r>
-      <w:r>
-        <w:rPr>
-          <w:rFonts w:ascii="Times New Roman" w:hAnsi="Times New Roman" w:cs="Times New Roman"/>
-          <w:color w:val="000000" w:themeColor="text1"/>
-        </w:rPr>
-        <w:t>, Title “Dealing with public datasets” (05/2023)</w:t>
+        <w:t>Georgia Institute of Technology, invited lecturer: “</w:t>
+      </w:r>
+      <w:r>
+        <w:rPr>
+          <w:rFonts w:ascii="Times New Roman" w:hAnsi="Times New Roman" w:cs="Times New Roman"/>
+          <w:color w:val="000000" w:themeColor="text1"/>
+        </w:rPr>
+        <w:t>Reimagining Medical Physics: A Deeper Dive into Deep Learning</w:t>
+      </w:r>
+      <w:r>
+        <w:rPr>
+          <w:rFonts w:ascii="Times New Roman" w:hAnsi="Times New Roman" w:cs="Times New Roman"/>
+          <w:color w:val="000000" w:themeColor="text1"/>
+        </w:rPr>
+        <w:t>” (11/2023)</w:t>
       </w:r>
     </w:p>
     <w:p>
@@ -3584,28 +3714,21 @@
           <w:rFonts w:ascii="Times New Roman" w:hAnsi="Times New Roman" w:cs="Times New Roman"/>
           <w:color w:val="000000" w:themeColor="text1"/>
         </w:rPr>
-        <w:t xml:space="preserve">MD Anderson, </w:t>
-      </w:r>
-      <w:r>
-        <w:rPr>
-          <w:rFonts w:ascii="Times New Roman" w:hAnsi="Times New Roman" w:cs="Times New Roman"/>
-          <w:color w:val="000000" w:themeColor="text1"/>
-        </w:rPr>
-        <w:t>Image Guided Cancer Therapy Workshop</w:t>
-      </w:r>
-      <w:r>
-        <w:rPr>
-          <w:rFonts w:ascii="Times New Roman" w:hAnsi="Times New Roman" w:cs="Times New Roman"/>
-          <w:color w:val="000000" w:themeColor="text1"/>
-        </w:rPr>
-        <w:t xml:space="preserve">: </w:t>
-      </w:r>
-      <w:r>
-        <w:rPr>
-          <w:rFonts w:ascii="Times New Roman" w:hAnsi="Times New Roman" w:cs="Times New Roman"/>
-          <w:color w:val="000000" w:themeColor="text1"/>
-        </w:rPr>
-        <w:t>“Getting Started with Artificial Intelligence”, Workshop and presentation (11/2021)</w:t>
+        <w:t>ESTRO-AAPM, Joint Symposium Session: “</w:t>
+      </w:r>
+      <w:r>
+        <w:rPr>
+          <w:rFonts w:ascii="Times New Roman" w:hAnsi="Times New Roman" w:cs="Times New Roman"/>
+          <w:color w:val="000000" w:themeColor="text1"/>
+        </w:rPr>
+        <w:t>Estro-AAPM: Big data, Big Headache”</w:t>
+      </w:r>
+      <w:r>
+        <w:rPr>
+          <w:rFonts w:ascii="Times New Roman" w:hAnsi="Times New Roman" w:cs="Times New Roman"/>
+          <w:color w:val="000000" w:themeColor="text1"/>
+        </w:rPr>
+        <w:t>, Title “Dealing with public datasets” (05/2023)</w:t>
       </w:r>
     </w:p>
     <w:p>
@@ -3628,7 +3751,14 @@
           <w:rFonts w:ascii="Times New Roman" w:hAnsi="Times New Roman" w:cs="Times New Roman"/>
           <w:color w:val="000000" w:themeColor="text1"/>
         </w:rPr>
-        <w:t>Winter Institute of Medical Physics</w:t>
+        <w:t xml:space="preserve">MD Anderson, </w:t>
+      </w:r>
+      <w:r>
+        <w:rPr>
+          <w:rFonts w:ascii="Times New Roman" w:hAnsi="Times New Roman" w:cs="Times New Roman"/>
+          <w:color w:val="000000" w:themeColor="text1"/>
+        </w:rPr>
+        <w:t>Image Guided Cancer Therapy Workshop</w:t>
       </w:r>
       <w:r>
         <w:rPr>
@@ -3642,23 +3772,7 @@
           <w:rFonts w:ascii="Times New Roman" w:hAnsi="Times New Roman" w:cs="Times New Roman"/>
           <w:color w:val="000000" w:themeColor="text1"/>
         </w:rPr>
-        <w:t xml:space="preserve">“Getting Started with Deep Learning: </w:t>
-      </w:r>
-      <w:proofErr w:type="spellStart"/>
-      <w:r>
-        <w:rPr>
-          <w:rFonts w:ascii="Times New Roman" w:hAnsi="Times New Roman" w:cs="Times New Roman"/>
-          <w:color w:val="000000" w:themeColor="text1"/>
-        </w:rPr>
-        <w:t>Dicom</w:t>
-      </w:r>
-      <w:proofErr w:type="spellEnd"/>
-      <w:r>
-        <w:rPr>
-          <w:rFonts w:ascii="Times New Roman" w:hAnsi="Times New Roman" w:cs="Times New Roman"/>
-          <w:color w:val="000000" w:themeColor="text1"/>
-        </w:rPr>
-        <w:t xml:space="preserve"> to Predictions” Workshop and presentation (02/2020)</w:t>
+        <w:t>“Getting Started with Artificial Intelligence”, Workshop and presentation (11/2021)</w:t>
       </w:r>
     </w:p>
     <w:p>
@@ -3681,21 +3795,7 @@
           <w:rFonts w:ascii="Times New Roman" w:hAnsi="Times New Roman" w:cs="Times New Roman"/>
           <w:color w:val="000000" w:themeColor="text1"/>
         </w:rPr>
-        <w:t>MD Anderson</w:t>
-      </w:r>
-      <w:r>
-        <w:rPr>
-          <w:rFonts w:ascii="Times New Roman" w:hAnsi="Times New Roman" w:cs="Times New Roman"/>
-          <w:color w:val="000000" w:themeColor="text1"/>
-        </w:rPr>
-        <w:t xml:space="preserve">, </w:t>
-      </w:r>
-      <w:r>
-        <w:rPr>
-          <w:rFonts w:ascii="Times New Roman" w:hAnsi="Times New Roman" w:cs="Times New Roman"/>
-          <w:color w:val="000000" w:themeColor="text1"/>
-        </w:rPr>
-        <w:t>Image Guided Cancer Therapy Research Program</w:t>
+        <w:t>Winter Institute of Medical Physics</w:t>
       </w:r>
       <w:r>
         <w:rPr>
@@ -3709,7 +3809,23 @@
           <w:rFonts w:ascii="Times New Roman" w:hAnsi="Times New Roman" w:cs="Times New Roman"/>
           <w:color w:val="000000" w:themeColor="text1"/>
         </w:rPr>
-        <w:t>“How to Get Started in AI”, Workshop and presentation (01/2020)</w:t>
+        <w:t xml:space="preserve">“Getting Started with Deep Learning: </w:t>
+      </w:r>
+      <w:proofErr w:type="spellStart"/>
+      <w:r>
+        <w:rPr>
+          <w:rFonts w:ascii="Times New Roman" w:hAnsi="Times New Roman" w:cs="Times New Roman"/>
+          <w:color w:val="000000" w:themeColor="text1"/>
+        </w:rPr>
+        <w:t>Dicom</w:t>
+      </w:r>
+      <w:proofErr w:type="spellEnd"/>
+      <w:r>
+        <w:rPr>
+          <w:rFonts w:ascii="Times New Roman" w:hAnsi="Times New Roman" w:cs="Times New Roman"/>
+          <w:color w:val="000000" w:themeColor="text1"/>
+        </w:rPr>
+        <w:t xml:space="preserve"> to Predictions” Workshop and presentation (02/2020)</w:t>
       </w:r>
     </w:p>
     <w:p>
@@ -3732,7 +3848,7 @@
           <w:rFonts w:ascii="Times New Roman" w:hAnsi="Times New Roman" w:cs="Times New Roman"/>
           <w:color w:val="000000" w:themeColor="text1"/>
         </w:rPr>
-        <w:t>North Central Chapter AAPM</w:t>
+        <w:t>MD Anderson</w:t>
       </w:r>
       <w:r>
         <w:rPr>
@@ -3746,7 +3862,7 @@
           <w:rFonts w:ascii="Times New Roman" w:hAnsi="Times New Roman" w:cs="Times New Roman"/>
           <w:color w:val="000000" w:themeColor="text1"/>
         </w:rPr>
-        <w:t>Keynote Lecturer</w:t>
+        <w:t>Image Guided Cancer Therapy Research Program</w:t>
       </w:r>
       <w:r>
         <w:rPr>
@@ -3760,7 +3876,7 @@
           <w:rFonts w:ascii="Times New Roman" w:hAnsi="Times New Roman" w:cs="Times New Roman"/>
           <w:color w:val="000000" w:themeColor="text1"/>
         </w:rPr>
-        <w:t>“Introduction to Deep Learning: Everything I wish I’d known sooner” (11/2019)</w:t>
+        <w:t>“How to Get Started in AI”, Workshop and presentation (01/2020)</w:t>
       </w:r>
     </w:p>
     <w:p>
@@ -3783,7 +3899,7 @@
           <w:rFonts w:ascii="Times New Roman" w:hAnsi="Times New Roman" w:cs="Times New Roman"/>
           <w:color w:val="000000" w:themeColor="text1"/>
         </w:rPr>
-        <w:t>Rice University</w:t>
+        <w:t>North Central Chapter AAPM</w:t>
       </w:r>
       <w:r>
         <w:rPr>
@@ -3797,14 +3913,21 @@
           <w:rFonts w:ascii="Times New Roman" w:hAnsi="Times New Roman" w:cs="Times New Roman"/>
           <w:color w:val="000000" w:themeColor="text1"/>
         </w:rPr>
-        <w:t>Guest Lecturer</w:t>
-      </w:r>
-      <w:r>
-        <w:rPr>
-          <w:rFonts w:ascii="Times New Roman" w:hAnsi="Times New Roman" w:cs="Times New Roman"/>
-          <w:color w:val="000000" w:themeColor="text1"/>
-        </w:rPr>
-        <w:t xml:space="preserve"> ELEC/ COMP 576: “Introduction to Deep Learning” (09/2019)</w:t>
+        <w:t>Keynote Lecturer</w:t>
+      </w:r>
+      <w:r>
+        <w:rPr>
+          <w:rFonts w:ascii="Times New Roman" w:hAnsi="Times New Roman" w:cs="Times New Roman"/>
+          <w:color w:val="000000" w:themeColor="text1"/>
+        </w:rPr>
+        <w:t xml:space="preserve">: </w:t>
+      </w:r>
+      <w:r>
+        <w:rPr>
+          <w:rFonts w:ascii="Times New Roman" w:hAnsi="Times New Roman" w:cs="Times New Roman"/>
+          <w:color w:val="000000" w:themeColor="text1"/>
+        </w:rPr>
+        <w:t>“Introduction to Deep Learning: Everything I wish I’d known sooner” (11/2019)</w:t>
       </w:r>
     </w:p>
     <w:p>
@@ -3827,6 +3950,50 @@
           <w:rFonts w:ascii="Times New Roman" w:hAnsi="Times New Roman" w:cs="Times New Roman"/>
           <w:color w:val="000000" w:themeColor="text1"/>
         </w:rPr>
+        <w:t>Rice University</w:t>
+      </w:r>
+      <w:r>
+        <w:rPr>
+          <w:rFonts w:ascii="Times New Roman" w:hAnsi="Times New Roman" w:cs="Times New Roman"/>
+          <w:color w:val="000000" w:themeColor="text1"/>
+        </w:rPr>
+        <w:t xml:space="preserve">, </w:t>
+      </w:r>
+      <w:r>
+        <w:rPr>
+          <w:rFonts w:ascii="Times New Roman" w:hAnsi="Times New Roman" w:cs="Times New Roman"/>
+          <w:color w:val="000000" w:themeColor="text1"/>
+        </w:rPr>
+        <w:t>Guest Lecturer</w:t>
+      </w:r>
+      <w:r>
+        <w:rPr>
+          <w:rFonts w:ascii="Times New Roman" w:hAnsi="Times New Roman" w:cs="Times New Roman"/>
+          <w:color w:val="000000" w:themeColor="text1"/>
+        </w:rPr>
+        <w:t xml:space="preserve"> ELEC/ COMP 576: “Introduction to Deep Learning” (09/2019)</w:t>
+      </w:r>
+    </w:p>
+    <w:p>
+      <w:pPr>
+        <w:pStyle w:val="ListParagraph"/>
+        <w:keepNext/>
+        <w:keepLines/>
+        <w:numPr>
+          <w:ilvl w:val="0"/>
+          <w:numId w:val="7"/>
+        </w:numPr>
+        <w:spacing w:after="60"/>
+        <w:rPr>
+          <w:rFonts w:ascii="Times New Roman" w:hAnsi="Times New Roman" w:cs="Times New Roman"/>
+          <w:color w:val="000000" w:themeColor="text1"/>
+        </w:rPr>
+      </w:pPr>
+      <w:r>
+        <w:rPr>
+          <w:rFonts w:ascii="Times New Roman" w:hAnsi="Times New Roman" w:cs="Times New Roman"/>
+          <w:color w:val="000000" w:themeColor="text1"/>
+        </w:rPr>
         <w:t xml:space="preserve">MD Anderson, </w:t>
       </w:r>
       <w:r>
@@ -4274,23 +4441,7 @@
           <w:rFonts w:ascii="Times New Roman" w:hAnsi="Times New Roman" w:cs="Times New Roman"/>
           <w:color w:val="000000" w:themeColor="text1"/>
         </w:rPr>
-        <w:t xml:space="preserve">, </w:t>
-      </w:r>
-      <w:proofErr w:type="spellStart"/>
-      <w:r>
-        <w:rPr>
-          <w:rFonts w:ascii="Times New Roman" w:hAnsi="Times New Roman" w:cs="Times New Roman"/>
-          <w:color w:val="000000" w:themeColor="text1"/>
-        </w:rPr>
-        <w:t>Bojechko</w:t>
-      </w:r>
-      <w:proofErr w:type="spellEnd"/>
-      <w:r>
-        <w:rPr>
-          <w:rFonts w:ascii="Times New Roman" w:hAnsi="Times New Roman" w:cs="Times New Roman"/>
-          <w:color w:val="000000" w:themeColor="text1"/>
-        </w:rPr>
-        <w:t xml:space="preserve"> C. </w:t>
+        <w:t xml:space="preserve">, Bojechko C. </w:t>
       </w:r>
       <w:r>
         <w:rPr>
@@ -4345,23 +4496,7 @@
           <w:rFonts w:ascii="Times New Roman" w:hAnsi="Times New Roman" w:cs="Times New Roman"/>
           <w:color w:val="000000" w:themeColor="text1"/>
         </w:rPr>
-        <w:t xml:space="preserve">, Moore L., </w:t>
-      </w:r>
-      <w:proofErr w:type="spellStart"/>
-      <w:r>
-        <w:rPr>
-          <w:rFonts w:ascii="Times New Roman" w:hAnsi="Times New Roman" w:cs="Times New Roman"/>
-          <w:color w:val="000000" w:themeColor="text1"/>
-        </w:rPr>
-        <w:t>Bojechko</w:t>
-      </w:r>
-      <w:proofErr w:type="spellEnd"/>
-      <w:r>
-        <w:rPr>
-          <w:rFonts w:ascii="Times New Roman" w:hAnsi="Times New Roman" w:cs="Times New Roman"/>
-          <w:color w:val="000000" w:themeColor="text1"/>
-        </w:rPr>
-        <w:t xml:space="preserve"> C. </w:t>
+        <w:t xml:space="preserve">, Moore L., Bojechko C. </w:t>
       </w:r>
       <w:r>
         <w:rPr>
@@ -4409,23 +4544,7 @@
           <w:rFonts w:ascii="Times New Roman" w:hAnsi="Times New Roman" w:cs="Times New Roman"/>
           <w:color w:val="000000" w:themeColor="text1"/>
         </w:rPr>
-        <w:t xml:space="preserve"> Padilla L, Ryckman J, Covington E, Hong DS, Woods K, Katz MS, Estes C, Moore K, </w:t>
-      </w:r>
-      <w:proofErr w:type="spellStart"/>
-      <w:r>
-        <w:rPr>
-          <w:rFonts w:ascii="Times New Roman" w:hAnsi="Times New Roman" w:cs="Times New Roman"/>
-          <w:color w:val="000000" w:themeColor="text1"/>
-        </w:rPr>
-        <w:t>Bojechko</w:t>
-      </w:r>
-      <w:proofErr w:type="spellEnd"/>
-      <w:r>
-        <w:rPr>
-          <w:rFonts w:ascii="Times New Roman" w:hAnsi="Times New Roman" w:cs="Times New Roman"/>
-          <w:color w:val="000000" w:themeColor="text1"/>
-        </w:rPr>
-        <w:t xml:space="preserve"> C. </w:t>
+        <w:t xml:space="preserve"> Padilla L, Ryckman J, Covington E, Hong DS, Woods K, Katz MS, Estes C, Moore K, Bojechko C. </w:t>
       </w:r>
       <w:r>
         <w:rPr>
@@ -6323,13 +6442,23 @@
         </w:rPr>
         <w:t xml:space="preserve">. </w:t>
       </w:r>
+      <w:proofErr w:type="gramStart"/>
       <w:r>
         <w:rPr>
           <w:rFonts w:ascii="Times New Roman" w:hAnsi="Times New Roman" w:cs="Times New Roman"/>
           <w:iCs/>
           <w:color w:val="000000" w:themeColor="text1"/>
         </w:rPr>
-        <w:t>Medical Imaging 2018: Image-Guided Procedures, Robotic Interventions, and Modeling</w:t>
+        <w:t>Medical Imaging 2018</w:t>
+      </w:r>
+      <w:proofErr w:type="gramEnd"/>
+      <w:r>
+        <w:rPr>
+          <w:rFonts w:ascii="Times New Roman" w:hAnsi="Times New Roman" w:cs="Times New Roman"/>
+          <w:iCs/>
+          <w:color w:val="000000" w:themeColor="text1"/>
+        </w:rPr>
+        <w:t>: Image-Guided Procedures, Robotic Interventions, and Modeling</w:t>
       </w:r>
       <w:r>
         <w:rPr>
@@ -6832,8 +6961,9 @@
           <w:szCs w:val="24"/>
           <w:u w:val="single"/>
         </w:rPr>
-        <w:t>Presenting Author</w:t>
-      </w:r>
+        <w:t xml:space="preserve">Presenting </w:t>
+      </w:r>
+      <w:proofErr w:type="gramStart"/>
       <w:r>
         <w:rPr>
           <w:rFonts w:ascii="Times New Roman" w:hAnsi="Times New Roman" w:cs="Times New Roman"/>
@@ -6843,7 +6973,7 @@
           <w:szCs w:val="24"/>
           <w:u w:val="single"/>
         </w:rPr>
-        <w:t>)</w:t>
+        <w:t>Author</w:t>
       </w:r>
       <w:r>
         <w:rPr>
@@ -6854,7 +6984,30 @@
           <w:szCs w:val="24"/>
           <w:u w:val="single"/>
         </w:rPr>
-        <w:t>_________________________________________________</w:t>
+        <w:t>)</w:t>
+      </w:r>
+      <w:r>
+        <w:rPr>
+          <w:rFonts w:ascii="Times New Roman" w:hAnsi="Times New Roman" w:cs="Times New Roman"/>
+          <w:b/>
+          <w:color w:val="000000" w:themeColor="text1"/>
+          <w:sz w:val="24"/>
+          <w:szCs w:val="24"/>
+          <w:u w:val="single"/>
+        </w:rPr>
+        <w:t>_</w:t>
+      </w:r>
+      <w:proofErr w:type="gramEnd"/>
+      <w:r>
+        <w:rPr>
+          <w:rFonts w:ascii="Times New Roman" w:hAnsi="Times New Roman" w:cs="Times New Roman"/>
+          <w:b/>
+          <w:color w:val="000000" w:themeColor="text1"/>
+          <w:sz w:val="24"/>
+          <w:szCs w:val="24"/>
+          <w:u w:val="single"/>
+        </w:rPr>
+        <w:t>________________________________________________</w:t>
       </w:r>
     </w:p>
     <w:p>
@@ -6886,23 +7039,7 @@
           <w:rFonts w:ascii="Times New Roman" w:hAnsi="Times New Roman"/>
           <w:color w:val="000000" w:themeColor="text1"/>
         </w:rPr>
-        <w:t xml:space="preserve"> Moore K., Padilla L., </w:t>
-      </w:r>
-      <w:proofErr w:type="spellStart"/>
-      <w:r>
-        <w:rPr>
-          <w:rFonts w:ascii="Times New Roman" w:hAnsi="Times New Roman"/>
-          <w:color w:val="000000" w:themeColor="text1"/>
-        </w:rPr>
-        <w:t>Bojechko</w:t>
-      </w:r>
-      <w:proofErr w:type="spellEnd"/>
-      <w:r>
-        <w:rPr>
-          <w:rFonts w:ascii="Times New Roman" w:hAnsi="Times New Roman"/>
-          <w:color w:val="000000" w:themeColor="text1"/>
-        </w:rPr>
-        <w:t xml:space="preserve"> C. </w:t>
+        <w:t xml:space="preserve"> Moore K., Padilla L., Bojechko C. </w:t>
       </w:r>
       <w:r>
         <w:rPr>
@@ -6950,25 +7087,7 @@
           <w:bCs/>
           <w:color w:val="000000" w:themeColor="text1"/>
         </w:rPr>
-        <w:t xml:space="preserve">Moore K., </w:t>
-      </w:r>
-      <w:proofErr w:type="spellStart"/>
-      <w:r>
-        <w:rPr>
-          <w:rFonts w:ascii="Times New Roman" w:hAnsi="Times New Roman"/>
-          <w:bCs/>
-          <w:color w:val="000000" w:themeColor="text1"/>
-        </w:rPr>
-        <w:t>Bojechko</w:t>
-      </w:r>
-      <w:proofErr w:type="spellEnd"/>
-      <w:r>
-        <w:rPr>
-          <w:rFonts w:ascii="Times New Roman" w:hAnsi="Times New Roman"/>
-          <w:bCs/>
-          <w:color w:val="000000" w:themeColor="text1"/>
-        </w:rPr>
-        <w:t xml:space="preserve"> C. </w:t>
+        <w:t xml:space="preserve">Moore K., Bojechko C. </w:t>
       </w:r>
       <w:r>
         <w:rPr>
@@ -7304,7 +7423,27 @@
           <w:color w:val="000000" w:themeColor="text1"/>
           <w:shd w:val="clear" w:color="auto" w:fill="FFFFFF"/>
         </w:rPr>
-        <w:t xml:space="preserve">Deep Learning for Rapid Deformable Image Registration of Liver CT Scans </w:t>
+        <w:t xml:space="preserve">Deep Learning for Rapid Deformable Image Registration of Liver </w:t>
+      </w:r>
+      <w:proofErr w:type="gramStart"/>
+      <w:r>
+        <w:rPr>
+          <w:rFonts w:ascii="Times New Roman" w:hAnsi="Times New Roman" w:cs="Times New Roman"/>
+          <w:i/>
+          <w:color w:val="000000" w:themeColor="text1"/>
+          <w:shd w:val="clear" w:color="auto" w:fill="FFFFFF"/>
+        </w:rPr>
+        <w:t>CT Scans</w:t>
+      </w:r>
+      <w:proofErr w:type="gramEnd"/>
+      <w:r>
+        <w:rPr>
+          <w:rFonts w:ascii="Times New Roman" w:hAnsi="Times New Roman" w:cs="Times New Roman"/>
+          <w:i/>
+          <w:color w:val="000000" w:themeColor="text1"/>
+          <w:shd w:val="clear" w:color="auto" w:fill="FFFFFF"/>
+        </w:rPr>
+        <w:t xml:space="preserve"> </w:t>
       </w:r>
       <w:r>
         <w:rPr>
@@ -7961,8 +8100,9 @@
           <w:szCs w:val="24"/>
           <w:u w:val="single"/>
         </w:rPr>
-        <w:t xml:space="preserve"> (Presenting Author)</w:t>
-      </w:r>
+        <w:t xml:space="preserve"> (Presenting </w:t>
+      </w:r>
+      <w:proofErr w:type="gramStart"/>
       <w:r>
         <w:rPr>
           <w:rFonts w:ascii="Times New Roman" w:hAnsi="Times New Roman" w:cs="Times New Roman"/>
@@ -7972,7 +8112,30 @@
           <w:szCs w:val="24"/>
           <w:u w:val="single"/>
         </w:rPr>
-        <w:t>_________________________________________________</w:t>
+        <w:t>Author)</w:t>
+      </w:r>
+      <w:r>
+        <w:rPr>
+          <w:rFonts w:ascii="Times New Roman" w:hAnsi="Times New Roman" w:cs="Times New Roman"/>
+          <w:b/>
+          <w:color w:val="000000" w:themeColor="text1"/>
+          <w:sz w:val="24"/>
+          <w:szCs w:val="24"/>
+          <w:u w:val="single"/>
+        </w:rPr>
+        <w:t>_</w:t>
+      </w:r>
+      <w:proofErr w:type="gramEnd"/>
+      <w:r>
+        <w:rPr>
+          <w:rFonts w:ascii="Times New Roman" w:hAnsi="Times New Roman" w:cs="Times New Roman"/>
+          <w:b/>
+          <w:color w:val="000000" w:themeColor="text1"/>
+          <w:sz w:val="24"/>
+          <w:szCs w:val="24"/>
+          <w:u w:val="single"/>
+        </w:rPr>
+        <w:t>________________________________________________</w:t>
       </w:r>
     </w:p>
     <w:p>
@@ -8375,7 +8538,16 @@
           <w:i/>
           <w:color w:val="000000" w:themeColor="text1"/>
         </w:rPr>
-        <w:t>Setting up the pipeline of data to TensorFlow .</w:t>
+        <w:t xml:space="preserve">Setting up the pipeline of data to </w:t>
+      </w:r>
+      <w:proofErr w:type="gramStart"/>
+      <w:r>
+        <w:rPr>
+          <w:rFonts w:ascii="Times New Roman" w:hAnsi="Times New Roman" w:cs="Times New Roman"/>
+          <w:i/>
+          <w:color w:val="000000" w:themeColor="text1"/>
+        </w:rPr>
+        <w:t>TensorFlow .</w:t>
       </w:r>
       <w:proofErr w:type="spellStart"/>
       <w:r>
@@ -8387,6 +8559,7 @@
         <w:t>tfrecords</w:t>
       </w:r>
       <w:proofErr w:type="spellEnd"/>
+      <w:proofErr w:type="gramEnd"/>
       <w:r>
         <w:rPr>
           <w:rFonts w:ascii="Times New Roman" w:hAnsi="Times New Roman" w:cs="Times New Roman"/>
@@ -8603,102 +8776,77 @@
         </w:numPr>
         <w:spacing w:after="120"/>
         <w:rPr>
-          <w:rFonts w:ascii="Times New Roman" w:hAnsi="Times New Roman"/>
-          <w:color w:val="000000" w:themeColor="text1"/>
-        </w:rPr>
-      </w:pPr>
-      <w:r>
-        <w:rPr>
-          <w:rFonts w:ascii="Times New Roman" w:hAnsi="Times New Roman"/>
+          <w:rFonts w:ascii="Times New Roman" w:eastAsia="Times New Roman" w:hAnsi="Times New Roman" w:cs="Times New Roman"/>
+          <w:color w:val="000000" w:themeColor="text1"/>
+        </w:rPr>
+      </w:pPr>
+      <w:r>
+        <w:rPr>
+          <w:rFonts w:ascii="Times New Roman" w:eastAsia="Times New Roman" w:hAnsi="Times New Roman" w:cs="Times New Roman"/>
+          <w:color w:val="000000" w:themeColor="text1"/>
+        </w:rPr>
+        <w:t xml:space="preserve">Abdou M., Stark J., Kim S., Zegers B., </w:t>
+      </w:r>
+      <w:r>
+        <w:rPr>
+          <w:rFonts w:ascii="Times New Roman" w:eastAsia="Times New Roman" w:hAnsi="Times New Roman" w:cs="Times New Roman"/>
+          <w:b/>
           <w:bCs/>
           <w:color w:val="000000" w:themeColor="text1"/>
         </w:rPr>
-        <w:t xml:space="preserve">Woodland M, Wood J, </w:t>
-      </w:r>
-      <w:r>
-        <w:rPr>
-          <w:rFonts w:ascii="Times New Roman" w:hAnsi="Times New Roman"/>
+        <w:t>Anderson B.</w:t>
+      </w:r>
+      <w:r>
+        <w:rPr>
+          <w:rFonts w:ascii="Times New Roman" w:eastAsia="Times New Roman" w:hAnsi="Times New Roman" w:cs="Times New Roman"/>
           <w:b/>
-          <w:color w:val="000000" w:themeColor="text1"/>
-        </w:rPr>
-        <w:t xml:space="preserve">Anderson B.M, </w:t>
-      </w:r>
-      <w:r>
-        <w:rPr>
-          <w:rFonts w:ascii="Times New Roman" w:hAnsi="Times New Roman"/>
           <w:bCs/>
           <w:color w:val="000000" w:themeColor="text1"/>
         </w:rPr>
-        <w:t xml:space="preserve">Kundu S., Lin E., Koay E., </w:t>
-      </w:r>
-      <w:proofErr w:type="spellStart"/>
-      <w:r>
-        <w:rPr>
-          <w:rFonts w:ascii="Times New Roman" w:hAnsi="Times New Roman"/>
+        <w:t>M</w:t>
+      </w:r>
+      <w:r>
+        <w:rPr>
+          <w:rFonts w:ascii="Times New Roman" w:eastAsia="Times New Roman" w:hAnsi="Times New Roman" w:cs="Times New Roman"/>
+          <w:b/>
           <w:bCs/>
           <w:color w:val="000000" w:themeColor="text1"/>
         </w:rPr>
-        <w:t>Odisio</w:t>
-      </w:r>
-      <w:proofErr w:type="spellEnd"/>
-      <w:r>
-        <w:rPr>
-          <w:rFonts w:ascii="Times New Roman" w:hAnsi="Times New Roman"/>
-          <w:bCs/>
-          <w:color w:val="000000" w:themeColor="text1"/>
-        </w:rPr>
-        <w:t xml:space="preserve"> O., Chung C., Kang H., Venkateson A., </w:t>
-      </w:r>
-      <w:proofErr w:type="spellStart"/>
-      <w:r>
-        <w:rPr>
-          <w:rFonts w:ascii="Times New Roman" w:hAnsi="Times New Roman"/>
-          <w:bCs/>
-          <w:color w:val="000000" w:themeColor="text1"/>
-        </w:rPr>
-        <w:t>Yedururi</w:t>
-      </w:r>
-      <w:proofErr w:type="spellEnd"/>
-      <w:r>
-        <w:rPr>
-          <w:rFonts w:ascii="Times New Roman" w:hAnsi="Times New Roman"/>
-          <w:bCs/>
-          <w:color w:val="000000" w:themeColor="text1"/>
-        </w:rPr>
-        <w:t xml:space="preserve"> S., De B., Lin Y., Patel A., Brock KK</w:t>
-      </w:r>
-      <w:r>
-        <w:rPr>
-          <w:rFonts w:ascii="Times New Roman" w:hAnsi="Times New Roman"/>
-          <w:bCs/>
-          <w:color w:val="000000" w:themeColor="text1"/>
-        </w:rPr>
-        <w:t>.</w:t>
-      </w:r>
-      <w:r>
-        <w:rPr>
-          <w:rFonts w:ascii="Times New Roman" w:hAnsi="Times New Roman"/>
-          <w:b/>
-          <w:color w:val="000000" w:themeColor="text1"/>
-        </w:rPr>
-        <w:t xml:space="preserve"> </w:t>
-      </w:r>
-      <w:r>
-        <w:rPr>
-          <w:rFonts w:ascii="Times New Roman" w:hAnsi="Times New Roman"/>
-          <w:bCs/>
+        <w:t xml:space="preserve">. </w:t>
+      </w:r>
+      <w:r>
+        <w:rPr>
+          <w:rFonts w:ascii="Times New Roman" w:eastAsia="Times New Roman" w:hAnsi="Times New Roman" w:cs="Times New Roman"/>
           <w:i/>
           <w:iCs/>
           <w:color w:val="000000" w:themeColor="text1"/>
         </w:rPr>
-        <w:t xml:space="preserve">Comparing Transfer Learning, Data Augmentation, and Data Expansion in the Improvement of Medical Image Generation </w:t>
-      </w:r>
-      <w:r>
-        <w:rPr>
-          <w:rFonts w:ascii="Times New Roman" w:hAnsi="Times New Roman"/>
-          <w:color w:val="000000" w:themeColor="text1"/>
-        </w:rPr>
-        <w:t>AAPM Annual Conference 07/2022</w:t>
+        <w:t xml:space="preserve">Root Cause Analysis of Unscheduled Replans Across 19,249 Radiation Therapy Plans: A Five-Year Single-Institution </w:t>
+      </w:r>
+      <w:r>
+        <w:rPr>
+          <w:rFonts w:ascii="Times New Roman" w:eastAsia="Times New Roman" w:hAnsi="Times New Roman" w:cs="Times New Roman"/>
+          <w:i/>
+          <w:iCs/>
+          <w:color w:val="000000" w:themeColor="text1"/>
+        </w:rPr>
+        <w:t>Review</w:t>
+      </w:r>
+      <w:r>
+        <w:rPr>
+          <w:rFonts w:ascii="Times New Roman" w:eastAsia="Times New Roman" w:hAnsi="Times New Roman" w:cs="Times New Roman"/>
+          <w:i/>
+          <w:iCs/>
+          <w:color w:val="000000" w:themeColor="text1"/>
+        </w:rPr>
+        <w:t xml:space="preserve"> </w:t>
+      </w:r>
+      <w:r>
+        <w:rPr>
+          <w:rFonts w:ascii="Times New Roman" w:eastAsia="Times New Roman" w:hAnsi="Times New Roman" w:cs="Times New Roman"/>
+          <w:color w:val="000000" w:themeColor="text1"/>
+        </w:rPr>
+        <w:t>ASTRO Annual Conference 02/2026</w:t>
       </w:r>
     </w:p>
     <w:p>
@@ -8721,55 +8869,7 @@
           <w:rFonts w:ascii="Times New Roman" w:eastAsia="Times New Roman" w:hAnsi="Times New Roman" w:cs="Times New Roman"/>
           <w:color w:val="000000" w:themeColor="text1"/>
         </w:rPr>
-        <w:t xml:space="preserve">Rigaud, B., </w:t>
-      </w:r>
-      <w:proofErr w:type="spellStart"/>
-      <w:r>
-        <w:rPr>
-          <w:rFonts w:ascii="Times New Roman" w:eastAsia="Times New Roman" w:hAnsi="Times New Roman" w:cs="Times New Roman"/>
-          <w:color w:val="000000" w:themeColor="text1"/>
-        </w:rPr>
-        <w:t>Kirimli</w:t>
-      </w:r>
-      <w:proofErr w:type="spellEnd"/>
-      <w:r>
-        <w:rPr>
-          <w:rFonts w:ascii="Times New Roman" w:eastAsia="Times New Roman" w:hAnsi="Times New Roman" w:cs="Times New Roman"/>
-          <w:color w:val="000000" w:themeColor="text1"/>
-        </w:rPr>
-        <w:t xml:space="preserve"> E., </w:t>
-      </w:r>
-      <w:proofErr w:type="spellStart"/>
-      <w:r>
-        <w:rPr>
-          <w:rFonts w:ascii="Times New Roman" w:eastAsia="Times New Roman" w:hAnsi="Times New Roman" w:cs="Times New Roman"/>
-          <w:color w:val="000000" w:themeColor="text1"/>
-        </w:rPr>
-        <w:t>Yedururi</w:t>
-      </w:r>
-      <w:proofErr w:type="spellEnd"/>
-      <w:r>
-        <w:rPr>
-          <w:rFonts w:ascii="Times New Roman" w:eastAsia="Times New Roman" w:hAnsi="Times New Roman" w:cs="Times New Roman"/>
-          <w:color w:val="000000" w:themeColor="text1"/>
-        </w:rPr>
-        <w:t xml:space="preserve"> S., </w:t>
-      </w:r>
-      <w:proofErr w:type="spellStart"/>
-      <w:r>
-        <w:rPr>
-          <w:rFonts w:ascii="Times New Roman" w:eastAsia="Times New Roman" w:hAnsi="Times New Roman" w:cs="Times New Roman"/>
-          <w:color w:val="000000" w:themeColor="text1"/>
-        </w:rPr>
-        <w:t>Cazoulat</w:t>
-      </w:r>
-      <w:proofErr w:type="spellEnd"/>
-      <w:r>
-        <w:rPr>
-          <w:rFonts w:ascii="Times New Roman" w:eastAsia="Times New Roman" w:hAnsi="Times New Roman" w:cs="Times New Roman"/>
-          <w:color w:val="000000" w:themeColor="text1"/>
-        </w:rPr>
-        <w:t xml:space="preserve"> G., </w:t>
+        <w:t xml:space="preserve">Gao, Y., Wells, D., Bhattacharya, S., Repka, MC., Lavrova, L., </w:t>
       </w:r>
       <w:r>
         <w:rPr>
@@ -8778,45 +8878,46 @@
           <w:bCs/>
           <w:color w:val="000000" w:themeColor="text1"/>
         </w:rPr>
-        <w:t>Anderson B.M.,</w:t>
+        <w:t>Anderson</w:t>
       </w:r>
       <w:r>
         <w:rPr>
           <w:rFonts w:ascii="Times New Roman" w:eastAsia="Times New Roman" w:hAnsi="Times New Roman" w:cs="Times New Roman"/>
-          <w:color w:val="000000" w:themeColor="text1"/>
-        </w:rPr>
-        <w:t xml:space="preserve"> Zaid M., </w:t>
-      </w:r>
-      <w:proofErr w:type="spellStart"/>
+          <w:b/>
+          <w:bCs/>
+          <w:color w:val="000000" w:themeColor="text1"/>
+        </w:rPr>
+        <w:t xml:space="preserve"> B.M</w:t>
+      </w:r>
       <w:r>
         <w:rPr>
           <w:rFonts w:ascii="Times New Roman" w:eastAsia="Times New Roman" w:hAnsi="Times New Roman" w:cs="Times New Roman"/>
           <w:color w:val="000000" w:themeColor="text1"/>
         </w:rPr>
-        <w:t>Elganainy</w:t>
-      </w:r>
-      <w:proofErr w:type="spellEnd"/>
+        <w:t>, Das, SD, Rajasekar, A., Byrd, E., McGurk, R., Dooley, J., Adapa, K., Wright, JL., Marks, LB., Mazur, LM.</w:t>
+      </w:r>
       <w:r>
         <w:rPr>
           <w:rFonts w:ascii="Times New Roman" w:eastAsia="Times New Roman" w:hAnsi="Times New Roman" w:cs="Times New Roman"/>
           <w:color w:val="000000" w:themeColor="text1"/>
         </w:rPr>
-        <w:t xml:space="preserve"> D., Koay E., Brock KK. </w:t>
+        <w:t xml:space="preserve"> </w:t>
       </w:r>
       <w:r>
         <w:rPr>
           <w:rFonts w:ascii="Times New Roman" w:eastAsia="Times New Roman" w:hAnsi="Times New Roman" w:cs="Times New Roman"/>
           <w:i/>
-          <w:color w:val="000000" w:themeColor="text1"/>
-        </w:rPr>
-        <w:t>Evaluation of Deep Learning-Based Automatic Segmentation of the Pancreas</w:t>
+          <w:iCs/>
+          <w:color w:val="000000" w:themeColor="text1"/>
+        </w:rPr>
+        <w:t>Deep Learning-Based Pelvic Vessel Auto-Segmentation for Standarized Lymph Node Delineation in Prostate Cancer Radiotherapy</w:t>
       </w:r>
       <w:r>
         <w:rPr>
           <w:rFonts w:ascii="Times New Roman" w:eastAsia="Times New Roman" w:hAnsi="Times New Roman" w:cs="Times New Roman"/>
           <w:color w:val="000000" w:themeColor="text1"/>
         </w:rPr>
-        <w:t xml:space="preserve"> AAPM Annual Conference. Virtual, 07/2021</w:t>
+        <w:t xml:space="preserve"> ASTRO Annual Conference 02/2026</w:t>
       </w:r>
     </w:p>
     <w:p>
@@ -8839,23 +8940,7 @@
           <w:rFonts w:ascii="Times New Roman" w:eastAsia="Times New Roman" w:hAnsi="Times New Roman" w:cs="Times New Roman"/>
           <w:color w:val="000000" w:themeColor="text1"/>
         </w:rPr>
-        <w:t xml:space="preserve">McCulloch, M., </w:t>
-      </w:r>
-      <w:proofErr w:type="spellStart"/>
-      <w:r>
-        <w:rPr>
-          <w:rFonts w:ascii="Times New Roman" w:eastAsia="Times New Roman" w:hAnsi="Times New Roman" w:cs="Times New Roman"/>
-          <w:color w:val="000000" w:themeColor="text1"/>
-        </w:rPr>
-        <w:t>Cazoulat</w:t>
-      </w:r>
-      <w:proofErr w:type="spellEnd"/>
-      <w:r>
-        <w:rPr>
-          <w:rFonts w:ascii="Times New Roman" w:eastAsia="Times New Roman" w:hAnsi="Times New Roman" w:cs="Times New Roman"/>
-          <w:color w:val="000000" w:themeColor="text1"/>
-        </w:rPr>
-        <w:t xml:space="preserve"> G., Rigaud B., </w:t>
+        <w:t xml:space="preserve">Das S., Dong F., Morse R., </w:t>
       </w:r>
       <w:r>
         <w:rPr>
@@ -8864,77 +8949,30 @@
           <w:bCs/>
           <w:color w:val="000000" w:themeColor="text1"/>
         </w:rPr>
-        <w:t xml:space="preserve">Anderson B.M., </w:t>
-      </w:r>
-      <w:proofErr w:type="spellStart"/>
+        <w:t>Anderson B.M.,</w:t>
+      </w:r>
       <w:r>
         <w:rPr>
           <w:rFonts w:ascii="Times New Roman" w:eastAsia="Times New Roman" w:hAnsi="Times New Roman" w:cs="Times New Roman"/>
           <w:color w:val="000000" w:themeColor="text1"/>
         </w:rPr>
-        <w:t>Kirimli</w:t>
-      </w:r>
-      <w:proofErr w:type="spellEnd"/>
-      <w:r>
-        <w:rPr>
-          <w:rFonts w:ascii="Times New Roman" w:eastAsia="Times New Roman" w:hAnsi="Times New Roman" w:cs="Times New Roman"/>
-          <w:color w:val="000000" w:themeColor="text1"/>
-        </w:rPr>
-        <w:t xml:space="preserve"> E., </w:t>
-      </w:r>
-      <w:proofErr w:type="spellStart"/>
-      <w:r>
-        <w:rPr>
-          <w:rFonts w:ascii="Times New Roman" w:eastAsia="Times New Roman" w:hAnsi="Times New Roman" w:cs="Times New Roman"/>
-          <w:color w:val="000000" w:themeColor="text1"/>
-        </w:rPr>
-        <w:t>Gryshkevych</w:t>
-      </w:r>
-      <w:proofErr w:type="spellEnd"/>
-      <w:r>
-        <w:rPr>
-          <w:rFonts w:ascii="Times New Roman" w:eastAsia="Times New Roman" w:hAnsi="Times New Roman" w:cs="Times New Roman"/>
-          <w:color w:val="000000" w:themeColor="text1"/>
-        </w:rPr>
-        <w:t xml:space="preserve"> S., Svensson S., Ohrt A., Chopra A., Mathew R., Zaid M., </w:t>
-      </w:r>
-      <w:proofErr w:type="spellStart"/>
-      <w:r>
-        <w:rPr>
-          <w:rFonts w:ascii="Times New Roman" w:eastAsia="Times New Roman" w:hAnsi="Times New Roman" w:cs="Times New Roman"/>
-          <w:color w:val="000000" w:themeColor="text1"/>
-        </w:rPr>
-        <w:t>Elganainy</w:t>
-      </w:r>
-      <w:proofErr w:type="spellEnd"/>
-      <w:r>
-        <w:rPr>
-          <w:rFonts w:ascii="Times New Roman" w:eastAsia="Times New Roman" w:hAnsi="Times New Roman" w:cs="Times New Roman"/>
-          <w:color w:val="000000" w:themeColor="text1"/>
-        </w:rPr>
-        <w:t xml:space="preserve"> D., ,Balter P., Koay E., Brock KK.</w:t>
-      </w:r>
-      <w:r>
-        <w:rPr>
-          <w:rFonts w:ascii="Times New Roman" w:eastAsia="Times New Roman" w:hAnsi="Times New Roman" w:cs="Times New Roman"/>
-          <w:color w:val="000000" w:themeColor="text1"/>
-        </w:rPr>
-        <w:t xml:space="preserve"> </w:t>
+        <w:t xml:space="preserve"> Chera B., Shen C., Repka M., Yarbrough W., Hackman T., Blumberg J., Lumley C., Weiss J., Patel S., Sheth S., Chen X. </w:t>
       </w:r>
       <w:r>
         <w:rPr>
           <w:rFonts w:ascii="Times New Roman" w:eastAsia="Times New Roman" w:hAnsi="Times New Roman" w:cs="Times New Roman"/>
           <w:i/>
-          <w:color w:val="000000" w:themeColor="text1"/>
-        </w:rPr>
-        <w:t xml:space="preserve">Use of Deep Learning Segmentation and Biomechanical Models to Improve Dose Accumulation Accuracy in GI Structures </w:t>
+          <w:iCs/>
+          <w:color w:val="000000" w:themeColor="text1"/>
+        </w:rPr>
+        <w:t>Predicting Dysphagia and Identifying Anatomical Regions Responsible for Dysphagia Following Intensity-Modulated Radiation Therapy (IMRT) for Oropharyngeal Carcinoma</w:t>
       </w:r>
       <w:r>
         <w:rPr>
           <w:rFonts w:ascii="Times New Roman" w:eastAsia="Times New Roman" w:hAnsi="Times New Roman" w:cs="Times New Roman"/>
           <w:color w:val="000000" w:themeColor="text1"/>
         </w:rPr>
-        <w:t>AAPM Annual Conference. Virtual, 07/2021</w:t>
+        <w:t xml:space="preserve"> ASTRO Annual Conference 02/2026</w:t>
       </w:r>
     </w:p>
     <w:p>
@@ -8957,19 +8995,173 @@
           <w:rFonts w:ascii="Times New Roman" w:eastAsia="Times New Roman" w:hAnsi="Times New Roman" w:cs="Times New Roman"/>
           <w:color w:val="000000" w:themeColor="text1"/>
         </w:rPr>
-        <w:t xml:space="preserve">Reber, B., </w:t>
+        <w:t>Sousa</w:t>
+      </w:r>
+      <w:r>
+        <w:rPr>
+          <w:rFonts w:ascii="Times New Roman" w:eastAsia="Times New Roman" w:hAnsi="Times New Roman" w:cs="Times New Roman"/>
+          <w:color w:val="000000" w:themeColor="text1"/>
+        </w:rPr>
+        <w:t xml:space="preserve"> C.</w:t>
+      </w:r>
+      <w:r>
+        <w:rPr>
+          <w:rFonts w:ascii="Times New Roman" w:eastAsia="Times New Roman" w:hAnsi="Times New Roman" w:cs="Times New Roman"/>
+          <w:color w:val="000000" w:themeColor="text1"/>
+        </w:rPr>
+        <w:t>, Doss</w:t>
+      </w:r>
+      <w:r>
+        <w:rPr>
+          <w:rFonts w:ascii="Times New Roman" w:eastAsia="Times New Roman" w:hAnsi="Times New Roman" w:cs="Times New Roman"/>
+          <w:color w:val="000000" w:themeColor="text1"/>
+        </w:rPr>
+        <w:t xml:space="preserve"> V.</w:t>
+      </w:r>
+      <w:r>
+        <w:rPr>
+          <w:rFonts w:ascii="Times New Roman" w:eastAsia="Times New Roman" w:hAnsi="Times New Roman" w:cs="Times New Roman"/>
+          <w:color w:val="000000" w:themeColor="text1"/>
+        </w:rPr>
+        <w:t>, Hales</w:t>
+      </w:r>
+      <w:r>
+        <w:rPr>
+          <w:rFonts w:ascii="Times New Roman" w:eastAsia="Times New Roman" w:hAnsi="Times New Roman" w:cs="Times New Roman"/>
+          <w:color w:val="000000" w:themeColor="text1"/>
+        </w:rPr>
+        <w:t xml:space="preserve"> E.</w:t>
+      </w:r>
+      <w:r>
+        <w:rPr>
+          <w:rFonts w:ascii="Times New Roman" w:eastAsia="Times New Roman" w:hAnsi="Times New Roman" w:cs="Times New Roman"/>
+          <w:color w:val="000000" w:themeColor="text1"/>
+        </w:rPr>
+        <w:t>, Hagan</w:t>
+      </w:r>
+      <w:r>
+        <w:rPr>
+          <w:rFonts w:ascii="Times New Roman" w:eastAsia="Times New Roman" w:hAnsi="Times New Roman" w:cs="Times New Roman"/>
+          <w:color w:val="000000" w:themeColor="text1"/>
+        </w:rPr>
+        <w:t xml:space="preserve"> E.</w:t>
+      </w:r>
+      <w:r>
+        <w:rPr>
+          <w:rFonts w:ascii="Times New Roman" w:eastAsia="Times New Roman" w:hAnsi="Times New Roman" w:cs="Times New Roman"/>
+          <w:color w:val="000000" w:themeColor="text1"/>
+        </w:rPr>
+        <w:t>, Gebre</w:t>
+      </w:r>
+      <w:r>
+        <w:rPr>
+          <w:rFonts w:ascii="Times New Roman" w:eastAsia="Times New Roman" w:hAnsi="Times New Roman" w:cs="Times New Roman"/>
+          <w:color w:val="000000" w:themeColor="text1"/>
+        </w:rPr>
+        <w:t xml:space="preserve"> T.</w:t>
+      </w:r>
+      <w:r>
+        <w:rPr>
+          <w:rFonts w:ascii="Times New Roman" w:eastAsia="Times New Roman" w:hAnsi="Times New Roman" w:cs="Times New Roman"/>
+          <w:color w:val="000000" w:themeColor="text1"/>
+        </w:rPr>
+        <w:t xml:space="preserve">, </w:t>
+      </w:r>
+      <w:proofErr w:type="spellStart"/>
+      <w:r>
+        <w:rPr>
+          <w:rFonts w:ascii="Times New Roman" w:eastAsia="Times New Roman" w:hAnsi="Times New Roman" w:cs="Times New Roman"/>
+          <w:color w:val="000000" w:themeColor="text1"/>
+        </w:rPr>
+        <w:t>Obaideen</w:t>
+      </w:r>
+      <w:proofErr w:type="spellEnd"/>
+      <w:r>
+        <w:rPr>
+          <w:rFonts w:ascii="Times New Roman" w:eastAsia="Times New Roman" w:hAnsi="Times New Roman" w:cs="Times New Roman"/>
+          <w:color w:val="000000" w:themeColor="text1"/>
+        </w:rPr>
+        <w:t xml:space="preserve"> A.</w:t>
+      </w:r>
+      <w:r>
+        <w:rPr>
+          <w:rFonts w:ascii="Times New Roman" w:eastAsia="Times New Roman" w:hAnsi="Times New Roman" w:cs="Times New Roman"/>
+          <w:color w:val="000000" w:themeColor="text1"/>
+        </w:rPr>
+        <w:t xml:space="preserve">, </w:t>
+      </w:r>
+      <w:proofErr w:type="spellStart"/>
+      <w:r>
+        <w:rPr>
+          <w:rFonts w:ascii="Times New Roman" w:eastAsia="Times New Roman" w:hAnsi="Times New Roman" w:cs="Times New Roman"/>
+          <w:color w:val="000000" w:themeColor="text1"/>
+        </w:rPr>
+        <w:t>Negassa</w:t>
+      </w:r>
+      <w:proofErr w:type="spellEnd"/>
+      <w:r>
+        <w:rPr>
+          <w:rFonts w:ascii="Times New Roman" w:eastAsia="Times New Roman" w:hAnsi="Times New Roman" w:cs="Times New Roman"/>
+          <w:color w:val="000000" w:themeColor="text1"/>
+        </w:rPr>
+        <w:t xml:space="preserve"> M.</w:t>
+      </w:r>
+      <w:r>
+        <w:rPr>
+          <w:rFonts w:ascii="Times New Roman" w:eastAsia="Times New Roman" w:hAnsi="Times New Roman" w:cs="Times New Roman"/>
+          <w:color w:val="000000" w:themeColor="text1"/>
+        </w:rPr>
+        <w:t>,</w:t>
+      </w:r>
+      <w:r>
+        <w:rPr>
+          <w:rFonts w:ascii="Times New Roman" w:eastAsia="Times New Roman" w:hAnsi="Times New Roman" w:cs="Times New Roman"/>
+          <w:color w:val="000000" w:themeColor="text1"/>
+        </w:rPr>
+        <w:t xml:space="preserve"> </w:t>
+      </w:r>
+      <w:r>
+        <w:rPr>
+          <w:rFonts w:ascii="Times New Roman" w:eastAsia="Times New Roman" w:hAnsi="Times New Roman" w:cs="Times New Roman"/>
+          <w:color w:val="000000" w:themeColor="text1"/>
+        </w:rPr>
+        <w:t>Liu</w:t>
+      </w:r>
+      <w:r>
+        <w:rPr>
+          <w:rFonts w:ascii="Times New Roman" w:eastAsia="Times New Roman" w:hAnsi="Times New Roman" w:cs="Times New Roman"/>
+          <w:color w:val="000000" w:themeColor="text1"/>
+        </w:rPr>
+        <w:t xml:space="preserve"> D.</w:t>
+      </w:r>
+      <w:r>
+        <w:rPr>
+          <w:rFonts w:ascii="Times New Roman" w:eastAsia="Times New Roman" w:hAnsi="Times New Roman" w:cs="Times New Roman"/>
+          <w:color w:val="000000" w:themeColor="text1"/>
+        </w:rPr>
+        <w:t xml:space="preserve">, </w:t>
       </w:r>
       <w:r>
         <w:rPr>
           <w:rFonts w:ascii="Times New Roman" w:eastAsia="Times New Roman" w:hAnsi="Times New Roman" w:cs="Times New Roman"/>
           <w:b/>
-          <w:color w:val="000000" w:themeColor="text1"/>
-        </w:rPr>
-        <w:t>Anderson, B.M.</w:t>
+          <w:bCs/>
+          <w:color w:val="000000" w:themeColor="text1"/>
+        </w:rPr>
+        <w:t>Anderson B</w:t>
       </w:r>
       <w:r>
         <w:rPr>
           <w:rFonts w:ascii="Times New Roman" w:eastAsia="Times New Roman" w:hAnsi="Times New Roman" w:cs="Times New Roman"/>
+          <w:b/>
+          <w:bCs/>
+          <w:color w:val="000000" w:themeColor="text1"/>
+        </w:rPr>
+        <w:t>.M</w:t>
+      </w:r>
+      <w:r>
+        <w:rPr>
+          <w:rFonts w:ascii="Times New Roman" w:eastAsia="Times New Roman" w:hAnsi="Times New Roman" w:cs="Times New Roman"/>
           <w:color w:val="000000" w:themeColor="text1"/>
         </w:rPr>
         <w:t xml:space="preserve">, </w:t>
@@ -8979,29 +9171,142 @@
           <w:rFonts w:ascii="Times New Roman" w:eastAsia="Times New Roman" w:hAnsi="Times New Roman" w:cs="Times New Roman"/>
           <w:color w:val="000000" w:themeColor="text1"/>
         </w:rPr>
-        <w:t>Mohamed A., Van Dijk L., Rigaud B., McCulloch M., He Y., Woodland M., Fuller C., Lai S., Brock KK</w:t>
+        <w:t>Kooner</w:t>
       </w:r>
       <w:r>
         <w:rPr>
           <w:rFonts w:ascii="Times New Roman" w:eastAsia="Times New Roman" w:hAnsi="Times New Roman" w:cs="Times New Roman"/>
           <w:color w:val="000000" w:themeColor="text1"/>
         </w:rPr>
+        <w:t xml:space="preserve">, </w:t>
+      </w:r>
+      <w:r>
+        <w:rPr>
+          <w:rFonts w:ascii="Times New Roman" w:eastAsia="Times New Roman" w:hAnsi="Times New Roman" w:cs="Times New Roman"/>
+          <w:color w:val="000000" w:themeColor="text1"/>
+        </w:rPr>
+        <w:t>Hu</w:t>
+      </w:r>
+      <w:r>
+        <w:rPr>
+          <w:rFonts w:ascii="Times New Roman" w:eastAsia="Times New Roman" w:hAnsi="Times New Roman" w:cs="Times New Roman"/>
+          <w:color w:val="000000" w:themeColor="text1"/>
+        </w:rPr>
+        <w:t xml:space="preserve"> C.</w:t>
+      </w:r>
+      <w:r>
+        <w:rPr>
+          <w:rFonts w:ascii="Times New Roman" w:eastAsia="Times New Roman" w:hAnsi="Times New Roman" w:cs="Times New Roman"/>
+          <w:color w:val="000000" w:themeColor="text1"/>
+        </w:rPr>
+        <w:t>, Li</w:t>
+      </w:r>
+      <w:r>
+        <w:rPr>
+          <w:rFonts w:ascii="Times New Roman" w:eastAsia="Times New Roman" w:hAnsi="Times New Roman" w:cs="Times New Roman"/>
+          <w:color w:val="000000" w:themeColor="text1"/>
+        </w:rPr>
+        <w:t xml:space="preserve"> H.</w:t>
+      </w:r>
+      <w:r>
+        <w:rPr>
+          <w:rFonts w:ascii="Times New Roman" w:eastAsia="Times New Roman" w:hAnsi="Times New Roman" w:cs="Times New Roman"/>
+          <w:color w:val="000000" w:themeColor="text1"/>
+        </w:rPr>
+        <w:t xml:space="preserve">, Viswanathan </w:t>
+      </w:r>
+      <w:r>
+        <w:rPr>
+          <w:rFonts w:ascii="Times New Roman" w:eastAsia="Times New Roman" w:hAnsi="Times New Roman" w:cs="Times New Roman"/>
+          <w:color w:val="000000" w:themeColor="text1"/>
+        </w:rPr>
+        <w:t>A.</w:t>
+      </w:r>
+      <w:r>
+        <w:rPr>
+          <w:rFonts w:ascii="Times New Roman" w:eastAsia="Times New Roman" w:hAnsi="Times New Roman" w:cs="Times New Roman"/>
+          <w:color w:val="000000" w:themeColor="text1"/>
+        </w:rPr>
+        <w:t>, Jia</w:t>
+      </w:r>
+      <w:r>
+        <w:rPr>
+          <w:rFonts w:ascii="Times New Roman" w:eastAsia="Times New Roman" w:hAnsi="Times New Roman" w:cs="Times New Roman"/>
+          <w:color w:val="000000" w:themeColor="text1"/>
+        </w:rPr>
+        <w:t xml:space="preserve"> X.</w:t>
+      </w:r>
+      <w:r>
+        <w:rPr>
+          <w:rFonts w:ascii="Times New Roman" w:eastAsia="Times New Roman" w:hAnsi="Times New Roman" w:cs="Times New Roman"/>
+          <w:color w:val="000000" w:themeColor="text1"/>
+        </w:rPr>
+        <w:t>, Hales</w:t>
+      </w:r>
+      <w:r>
+        <w:rPr>
+          <w:rFonts w:ascii="Times New Roman" w:eastAsia="Times New Roman" w:hAnsi="Times New Roman" w:cs="Times New Roman"/>
+          <w:color w:val="000000" w:themeColor="text1"/>
+        </w:rPr>
+        <w:t xml:space="preserve"> R.</w:t>
+      </w:r>
+      <w:r>
+        <w:rPr>
+          <w:rFonts w:ascii="Times New Roman" w:eastAsia="Times New Roman" w:hAnsi="Times New Roman" w:cs="Times New Roman"/>
+          <w:color w:val="000000" w:themeColor="text1"/>
+        </w:rPr>
+        <w:t>, Voong</w:t>
+      </w:r>
+      <w:r>
+        <w:rPr>
+          <w:rFonts w:ascii="Times New Roman" w:eastAsia="Times New Roman" w:hAnsi="Times New Roman" w:cs="Times New Roman"/>
+          <w:color w:val="000000" w:themeColor="text1"/>
+        </w:rPr>
         <w:t xml:space="preserve"> </w:t>
+      </w:r>
+      <w:r>
+        <w:rPr>
+          <w:rFonts w:ascii="Times New Roman" w:eastAsia="Times New Roman" w:hAnsi="Times New Roman" w:cs="Times New Roman"/>
+          <w:color w:val="000000" w:themeColor="text1"/>
+        </w:rPr>
+        <w:t>K. R, McNutt</w:t>
+      </w:r>
+      <w:r>
+        <w:rPr>
+          <w:rFonts w:ascii="Times New Roman" w:eastAsia="Times New Roman" w:hAnsi="Times New Roman" w:cs="Times New Roman"/>
+          <w:color w:val="000000" w:themeColor="text1"/>
+        </w:rPr>
+        <w:t xml:space="preserve"> T.</w:t>
+      </w:r>
+      <w:r>
+        <w:rPr>
+          <w:rFonts w:ascii="Times New Roman" w:eastAsia="Times New Roman" w:hAnsi="Times New Roman" w:cs="Times New Roman"/>
+          <w:color w:val="000000" w:themeColor="text1"/>
+        </w:rPr>
+        <w:t>, Ger</w:t>
+      </w:r>
+      <w:r>
+        <w:rPr>
+          <w:rFonts w:ascii="Times New Roman" w:eastAsia="Times New Roman" w:hAnsi="Times New Roman" w:cs="Times New Roman"/>
+          <w:color w:val="000000" w:themeColor="text1"/>
+        </w:rPr>
+        <w:t xml:space="preserve"> R. </w:t>
       </w:r>
       <w:r>
         <w:rPr>
           <w:rFonts w:ascii="Times New Roman" w:eastAsia="Times New Roman" w:hAnsi="Times New Roman" w:cs="Times New Roman"/>
           <w:i/>
-          <w:color w:val="000000" w:themeColor="text1"/>
-        </w:rPr>
-        <w:t xml:space="preserve">Predicting Osteoradionecrosis From Head and Neck Radiotherapy Using a Residual convolutional Neural Network </w:t>
+          <w:iCs/>
+          <w:color w:val="000000" w:themeColor="text1"/>
+        </w:rPr>
+        <w:t>Cumulative EQD2 Esophageal Dose and Severe Toxicity After Thoracic Reirradiation</w:t>
       </w:r>
       <w:r>
         <w:rPr>
           <w:rFonts w:ascii="Times New Roman" w:eastAsia="Times New Roman" w:hAnsi="Times New Roman" w:cs="Times New Roman"/>
           <w:color w:val="000000" w:themeColor="text1"/>
         </w:rPr>
-        <w:t>AAPM Annual Conference. Virtual, 07/2021</w:t>
+        <w:t xml:space="preserve"> ASTRO Annual Conference 02/2026</w:t>
       </w:r>
     </w:p>
     <w:p>
@@ -9015,46 +9320,102 @@
         </w:numPr>
         <w:spacing w:after="120"/>
         <w:rPr>
-          <w:rFonts w:ascii="Times New Roman" w:hAnsi="Times New Roman" w:cs="Times New Roman"/>
-          <w:color w:val="000000" w:themeColor="text1"/>
-        </w:rPr>
-      </w:pPr>
-      <w:r>
-        <w:rPr>
-          <w:rFonts w:ascii="Times New Roman" w:hAnsi="Times New Roman" w:cs="Times New Roman"/>
-          <w:color w:val="000000" w:themeColor="text1"/>
-        </w:rPr>
-        <w:t xml:space="preserve">Brock, K., </w:t>
-      </w:r>
-      <w:r>
-        <w:rPr>
-          <w:rFonts w:ascii="Times New Roman" w:hAnsi="Times New Roman" w:cs="Times New Roman"/>
+          <w:rFonts w:ascii="Times New Roman" w:hAnsi="Times New Roman"/>
+          <w:color w:val="000000" w:themeColor="text1"/>
+        </w:rPr>
+      </w:pPr>
+      <w:r>
+        <w:rPr>
+          <w:rFonts w:ascii="Times New Roman" w:hAnsi="Times New Roman"/>
+          <w:bCs/>
+          <w:color w:val="000000" w:themeColor="text1"/>
+        </w:rPr>
+        <w:t xml:space="preserve">Woodland M, Wood J, </w:t>
+      </w:r>
+      <w:r>
+        <w:rPr>
+          <w:rFonts w:ascii="Times New Roman" w:hAnsi="Times New Roman"/>
           <w:b/>
           <w:color w:val="000000" w:themeColor="text1"/>
         </w:rPr>
-        <w:t>Anderson, B.M.</w:t>
-      </w:r>
-      <w:r>
-        <w:rPr>
-          <w:rFonts w:ascii="Times New Roman" w:hAnsi="Times New Roman" w:cs="Times New Roman"/>
-          <w:color w:val="000000" w:themeColor="text1"/>
-        </w:rPr>
-        <w:t xml:space="preserve">, et al </w:t>
-      </w:r>
-      <w:r>
-        <w:rPr>
-          <w:rFonts w:ascii="Times New Roman" w:hAnsi="Times New Roman" w:cs="Times New Roman"/>
+        <w:t xml:space="preserve">Anderson B.M, </w:t>
+      </w:r>
+      <w:r>
+        <w:rPr>
+          <w:rFonts w:ascii="Times New Roman" w:hAnsi="Times New Roman"/>
+          <w:bCs/>
+          <w:color w:val="000000" w:themeColor="text1"/>
+        </w:rPr>
+        <w:t xml:space="preserve">Kundu S., Lin E., Koay E., </w:t>
+      </w:r>
+      <w:proofErr w:type="spellStart"/>
+      <w:r>
+        <w:rPr>
+          <w:rFonts w:ascii="Times New Roman" w:hAnsi="Times New Roman"/>
+          <w:bCs/>
+          <w:color w:val="000000" w:themeColor="text1"/>
+        </w:rPr>
+        <w:t>Odisio</w:t>
+      </w:r>
+      <w:proofErr w:type="spellEnd"/>
+      <w:r>
+        <w:rPr>
+          <w:rFonts w:ascii="Times New Roman" w:hAnsi="Times New Roman"/>
+          <w:bCs/>
+          <w:color w:val="000000" w:themeColor="text1"/>
+        </w:rPr>
+        <w:t xml:space="preserve"> O., Chung C., Kang H., Venkateson A., </w:t>
+      </w:r>
+      <w:proofErr w:type="spellStart"/>
+      <w:r>
+        <w:rPr>
+          <w:rFonts w:ascii="Times New Roman" w:hAnsi="Times New Roman"/>
+          <w:bCs/>
+          <w:color w:val="000000" w:themeColor="text1"/>
+        </w:rPr>
+        <w:t>Yedururi</w:t>
+      </w:r>
+      <w:proofErr w:type="spellEnd"/>
+      <w:r>
+        <w:rPr>
+          <w:rFonts w:ascii="Times New Roman" w:hAnsi="Times New Roman"/>
+          <w:bCs/>
+          <w:color w:val="000000" w:themeColor="text1"/>
+        </w:rPr>
+        <w:t xml:space="preserve"> S., De B., Lin Y., Patel A., Brock KK</w:t>
+      </w:r>
+      <w:r>
+        <w:rPr>
+          <w:rFonts w:ascii="Times New Roman" w:hAnsi="Times New Roman"/>
+          <w:bCs/>
+          <w:color w:val="000000" w:themeColor="text1"/>
+        </w:rPr>
+        <w:t>.</w:t>
+      </w:r>
+      <w:r>
+        <w:rPr>
+          <w:rFonts w:ascii="Times New Roman" w:hAnsi="Times New Roman"/>
+          <w:b/>
+          <w:color w:val="000000" w:themeColor="text1"/>
+        </w:rPr>
+        <w:t xml:space="preserve"> </w:t>
+      </w:r>
+      <w:r>
+        <w:rPr>
+          <w:rFonts w:ascii="Times New Roman" w:hAnsi="Times New Roman"/>
+          <w:bCs/>
           <w:i/>
-          <w:color w:val="000000" w:themeColor="text1"/>
-        </w:rPr>
-        <w:t xml:space="preserve">Anatomical Modeling to Improve the Precision of Image Guided Liver Ablation </w:t>
-      </w:r>
-      <w:r>
-        <w:rPr>
-          <w:rFonts w:ascii="Times New Roman" w:hAnsi="Times New Roman" w:cs="Times New Roman"/>
-          <w:color w:val="000000" w:themeColor="text1"/>
-        </w:rPr>
-        <w:t>Image-Guided Therapy Workshop Rockville, MD. 04/2020</w:t>
+          <w:iCs/>
+          <w:color w:val="000000" w:themeColor="text1"/>
+        </w:rPr>
+        <w:t xml:space="preserve">Comparing Transfer Learning, Data Augmentation, and Data Expansion in the Improvement of Medical Image Generation </w:t>
+      </w:r>
+      <w:r>
+        <w:rPr>
+          <w:rFonts w:ascii="Times New Roman" w:hAnsi="Times New Roman"/>
+          <w:color w:val="000000" w:themeColor="text1"/>
+        </w:rPr>
+        <w:t>AAPM Annual Conference 07/2022</w:t>
       </w:r>
     </w:p>
     <w:p>
@@ -9068,46 +9429,111 @@
         </w:numPr>
         <w:spacing w:after="120"/>
         <w:rPr>
-          <w:rFonts w:ascii="Times New Roman" w:hAnsi="Times New Roman" w:cs="Times New Roman"/>
-          <w:color w:val="000000" w:themeColor="text1"/>
-        </w:rPr>
-      </w:pPr>
-      <w:r>
-        <w:rPr>
-          <w:rFonts w:ascii="Times New Roman" w:hAnsi="Times New Roman" w:cs="Times New Roman"/>
-          <w:color w:val="000000" w:themeColor="text1"/>
-        </w:rPr>
-        <w:t xml:space="preserve">Owens, C., Gupta, A., Shrestha, S., </w:t>
-      </w:r>
-      <w:r>
-        <w:rPr>
-          <w:rFonts w:ascii="Times New Roman" w:hAnsi="Times New Roman" w:cs="Times New Roman"/>
+          <w:rFonts w:ascii="Times New Roman" w:eastAsia="Times New Roman" w:hAnsi="Times New Roman" w:cs="Times New Roman"/>
+          <w:color w:val="000000" w:themeColor="text1"/>
+        </w:rPr>
+      </w:pPr>
+      <w:r>
+        <w:rPr>
+          <w:rFonts w:ascii="Times New Roman" w:eastAsia="Times New Roman" w:hAnsi="Times New Roman" w:cs="Times New Roman"/>
+          <w:color w:val="000000" w:themeColor="text1"/>
+        </w:rPr>
+        <w:t xml:space="preserve">Rigaud, B., </w:t>
+      </w:r>
+      <w:proofErr w:type="spellStart"/>
+      <w:r>
+        <w:rPr>
+          <w:rFonts w:ascii="Times New Roman" w:eastAsia="Times New Roman" w:hAnsi="Times New Roman" w:cs="Times New Roman"/>
+          <w:color w:val="000000" w:themeColor="text1"/>
+        </w:rPr>
+        <w:t>Kirimli</w:t>
+      </w:r>
+      <w:proofErr w:type="spellEnd"/>
+      <w:r>
+        <w:rPr>
+          <w:rFonts w:ascii="Times New Roman" w:eastAsia="Times New Roman" w:hAnsi="Times New Roman" w:cs="Times New Roman"/>
+          <w:color w:val="000000" w:themeColor="text1"/>
+        </w:rPr>
+        <w:t xml:space="preserve"> E., </w:t>
+      </w:r>
+      <w:proofErr w:type="spellStart"/>
+      <w:r>
+        <w:rPr>
+          <w:rFonts w:ascii="Times New Roman" w:eastAsia="Times New Roman" w:hAnsi="Times New Roman" w:cs="Times New Roman"/>
+          <w:color w:val="000000" w:themeColor="text1"/>
+        </w:rPr>
+        <w:t>Yedururi</w:t>
+      </w:r>
+      <w:proofErr w:type="spellEnd"/>
+      <w:r>
+        <w:rPr>
+          <w:rFonts w:ascii="Times New Roman" w:eastAsia="Times New Roman" w:hAnsi="Times New Roman" w:cs="Times New Roman"/>
+          <w:color w:val="000000" w:themeColor="text1"/>
+        </w:rPr>
+        <w:t xml:space="preserve"> S., </w:t>
+      </w:r>
+      <w:proofErr w:type="spellStart"/>
+      <w:r>
+        <w:rPr>
+          <w:rFonts w:ascii="Times New Roman" w:eastAsia="Times New Roman" w:hAnsi="Times New Roman" w:cs="Times New Roman"/>
+          <w:color w:val="000000" w:themeColor="text1"/>
+        </w:rPr>
+        <w:t>Cazoulat</w:t>
+      </w:r>
+      <w:proofErr w:type="spellEnd"/>
+      <w:r>
+        <w:rPr>
+          <w:rFonts w:ascii="Times New Roman" w:eastAsia="Times New Roman" w:hAnsi="Times New Roman" w:cs="Times New Roman"/>
+          <w:color w:val="000000" w:themeColor="text1"/>
+        </w:rPr>
+        <w:t xml:space="preserve"> G., </w:t>
+      </w:r>
+      <w:r>
+        <w:rPr>
+          <w:rFonts w:ascii="Times New Roman" w:eastAsia="Times New Roman" w:hAnsi="Times New Roman" w:cs="Times New Roman"/>
           <w:b/>
-          <w:color w:val="000000" w:themeColor="text1"/>
-        </w:rPr>
-        <w:t>Anderson, B.M.</w:t>
-      </w:r>
-      <w:r>
-        <w:rPr>
-          <w:rFonts w:ascii="Times New Roman" w:hAnsi="Times New Roman" w:cs="Times New Roman"/>
-          <w:color w:val="000000" w:themeColor="text1"/>
-        </w:rPr>
-        <w:t xml:space="preserve">, et al </w:t>
-      </w:r>
-      <w:r>
-        <w:rPr>
-          <w:rFonts w:ascii="Times New Roman" w:hAnsi="Times New Roman" w:cs="Times New Roman"/>
+          <w:bCs/>
+          <w:color w:val="000000" w:themeColor="text1"/>
+        </w:rPr>
+        <w:t>Anderson B.M.,</w:t>
+      </w:r>
+      <w:r>
+        <w:rPr>
+          <w:rFonts w:ascii="Times New Roman" w:eastAsia="Times New Roman" w:hAnsi="Times New Roman" w:cs="Times New Roman"/>
+          <w:color w:val="000000" w:themeColor="text1"/>
+        </w:rPr>
+        <w:t xml:space="preserve"> Zaid M., </w:t>
+      </w:r>
+      <w:proofErr w:type="spellStart"/>
+      <w:r>
+        <w:rPr>
+          <w:rFonts w:ascii="Times New Roman" w:eastAsia="Times New Roman" w:hAnsi="Times New Roman" w:cs="Times New Roman"/>
+          <w:color w:val="000000" w:themeColor="text1"/>
+        </w:rPr>
+        <w:t>Elganainy</w:t>
+      </w:r>
+      <w:proofErr w:type="spellEnd"/>
+      <w:r>
+        <w:rPr>
+          <w:rFonts w:ascii="Times New Roman" w:eastAsia="Times New Roman" w:hAnsi="Times New Roman" w:cs="Times New Roman"/>
+          <w:color w:val="000000" w:themeColor="text1"/>
+        </w:rPr>
+        <w:t xml:space="preserve"> D., Koay E., Brock KK. </w:t>
+      </w:r>
+      <w:r>
+        <w:rPr>
+          <w:rFonts w:ascii="Times New Roman" w:eastAsia="Times New Roman" w:hAnsi="Times New Roman" w:cs="Times New Roman"/>
           <w:i/>
           <w:color w:val="000000" w:themeColor="text1"/>
         </w:rPr>
-        <w:t>Development of a colon model for colon dosimetry in late effect studies</w:t>
-      </w:r>
-      <w:r>
-        <w:rPr>
-          <w:rFonts w:ascii="Times New Roman" w:hAnsi="Times New Roman" w:cs="Times New Roman"/>
-          <w:color w:val="000000" w:themeColor="text1"/>
-        </w:rPr>
-        <w:t xml:space="preserve"> International Society of Radiation Epidemiology and Dosimetry, Sitges, Spain. 05/2020</w:t>
+        <w:t>Evaluation of Deep Learning-Based Automatic Segmentation of the Pancreas</w:t>
+      </w:r>
+      <w:r>
+        <w:rPr>
+          <w:rFonts w:ascii="Times New Roman" w:eastAsia="Times New Roman" w:hAnsi="Times New Roman" w:cs="Times New Roman"/>
+          <w:color w:val="000000" w:themeColor="text1"/>
+        </w:rPr>
+        <w:t xml:space="preserve"> AAPM Annual Conference. Virtual, 07/2021</w:t>
       </w:r>
     </w:p>
     <w:p>
@@ -9121,70 +9547,127 @@
         </w:numPr>
         <w:spacing w:after="120"/>
         <w:rPr>
-          <w:rFonts w:ascii="Times New Roman" w:hAnsi="Times New Roman" w:cs="Times New Roman"/>
-          <w:color w:val="000000" w:themeColor="text1"/>
-        </w:rPr>
-      </w:pPr>
+          <w:rFonts w:ascii="Times New Roman" w:eastAsia="Times New Roman" w:hAnsi="Times New Roman" w:cs="Times New Roman"/>
+          <w:color w:val="000000" w:themeColor="text1"/>
+        </w:rPr>
+      </w:pPr>
+      <w:r>
+        <w:rPr>
+          <w:rFonts w:ascii="Times New Roman" w:eastAsia="Times New Roman" w:hAnsi="Times New Roman" w:cs="Times New Roman"/>
+          <w:color w:val="000000" w:themeColor="text1"/>
+        </w:rPr>
+        <w:t xml:space="preserve">McCulloch, M., </w:t>
+      </w:r>
       <w:proofErr w:type="spellStart"/>
       <w:r>
         <w:rPr>
-          <w:rFonts w:ascii="Times New Roman" w:hAnsi="Times New Roman" w:cs="Times New Roman"/>
-          <w:color w:val="000000" w:themeColor="text1"/>
-        </w:rPr>
-        <w:t>Elhalawani</w:t>
+          <w:rFonts w:ascii="Times New Roman" w:eastAsia="Times New Roman" w:hAnsi="Times New Roman" w:cs="Times New Roman"/>
+          <w:color w:val="000000" w:themeColor="text1"/>
+        </w:rPr>
+        <w:t>Cazoulat</w:t>
       </w:r>
       <w:proofErr w:type="spellEnd"/>
       <w:r>
         <w:rPr>
-          <w:rFonts w:ascii="Times New Roman" w:hAnsi="Times New Roman" w:cs="Times New Roman"/>
-          <w:color w:val="000000" w:themeColor="text1"/>
-        </w:rPr>
-        <w:t xml:space="preserve">, H., </w:t>
-      </w:r>
-      <w:r>
-        <w:rPr>
-          <w:rFonts w:ascii="Times New Roman" w:hAnsi="Times New Roman" w:cs="Times New Roman"/>
-          <w:color w:val="000000" w:themeColor="text1"/>
-        </w:rPr>
-        <w:t xml:space="preserve">Jin Y., Randall J.W., Mahajan A., Mohamed A., Elliot A., </w:t>
-      </w:r>
-      <w:r>
-        <w:rPr>
-          <w:rFonts w:ascii="Times New Roman" w:hAnsi="Times New Roman" w:cs="Times New Roman"/>
+          <w:rFonts w:ascii="Times New Roman" w:eastAsia="Times New Roman" w:hAnsi="Times New Roman" w:cs="Times New Roman"/>
+          <w:color w:val="000000" w:themeColor="text1"/>
+        </w:rPr>
+        <w:t xml:space="preserve"> G., Rigaud B., </w:t>
+      </w:r>
+      <w:r>
+        <w:rPr>
+          <w:rFonts w:ascii="Times New Roman" w:eastAsia="Times New Roman" w:hAnsi="Times New Roman" w:cs="Times New Roman"/>
           <w:b/>
           <w:bCs/>
           <w:color w:val="000000" w:themeColor="text1"/>
         </w:rPr>
         <w:t xml:space="preserve">Anderson B.M., </w:t>
       </w:r>
-      <w:r>
-        <w:rPr>
-          <w:rFonts w:ascii="Times New Roman" w:hAnsi="Times New Roman" w:cs="Times New Roman"/>
-          <w:color w:val="000000" w:themeColor="text1"/>
-        </w:rPr>
-        <w:t>Landry L., Zhu H., Fuller C., Chung C.</w:t>
-      </w:r>
-      <w:r>
-        <w:rPr>
-          <w:rFonts w:ascii="Times New Roman" w:hAnsi="Times New Roman" w:cs="Times New Roman"/>
+      <w:proofErr w:type="spellStart"/>
+      <w:r>
+        <w:rPr>
+          <w:rFonts w:ascii="Times New Roman" w:eastAsia="Times New Roman" w:hAnsi="Times New Roman" w:cs="Times New Roman"/>
+          <w:color w:val="000000" w:themeColor="text1"/>
+        </w:rPr>
+        <w:t>Kirimli</w:t>
+      </w:r>
+      <w:proofErr w:type="spellEnd"/>
+      <w:r>
+        <w:rPr>
+          <w:rFonts w:ascii="Times New Roman" w:eastAsia="Times New Roman" w:hAnsi="Times New Roman" w:cs="Times New Roman"/>
+          <w:color w:val="000000" w:themeColor="text1"/>
+        </w:rPr>
+        <w:t xml:space="preserve"> E., </w:t>
+      </w:r>
+      <w:proofErr w:type="spellStart"/>
+      <w:r>
+        <w:rPr>
+          <w:rFonts w:ascii="Times New Roman" w:eastAsia="Times New Roman" w:hAnsi="Times New Roman" w:cs="Times New Roman"/>
+          <w:color w:val="000000" w:themeColor="text1"/>
+        </w:rPr>
+        <w:t>Gryshkevych</w:t>
+      </w:r>
+      <w:proofErr w:type="spellEnd"/>
+      <w:r>
+        <w:rPr>
+          <w:rFonts w:ascii="Times New Roman" w:eastAsia="Times New Roman" w:hAnsi="Times New Roman" w:cs="Times New Roman"/>
+          <w:color w:val="000000" w:themeColor="text1"/>
+        </w:rPr>
+        <w:t xml:space="preserve"> S., Svensson S., Ohrt A., Chopra A., Mathew R., Zaid M., </w:t>
+      </w:r>
+      <w:proofErr w:type="spellStart"/>
+      <w:r>
+        <w:rPr>
+          <w:rFonts w:ascii="Times New Roman" w:eastAsia="Times New Roman" w:hAnsi="Times New Roman" w:cs="Times New Roman"/>
+          <w:color w:val="000000" w:themeColor="text1"/>
+        </w:rPr>
+        <w:t>Elganainy</w:t>
+      </w:r>
+      <w:proofErr w:type="spellEnd"/>
+      <w:r>
+        <w:rPr>
+          <w:rFonts w:ascii="Times New Roman" w:eastAsia="Times New Roman" w:hAnsi="Times New Roman" w:cs="Times New Roman"/>
+          <w:color w:val="000000" w:themeColor="text1"/>
+        </w:rPr>
+        <w:t xml:space="preserve"> D.</w:t>
+      </w:r>
+      <w:proofErr w:type="gramStart"/>
+      <w:r>
+        <w:rPr>
+          <w:rFonts w:ascii="Times New Roman" w:eastAsia="Times New Roman" w:hAnsi="Times New Roman" w:cs="Times New Roman"/>
+          <w:color w:val="000000" w:themeColor="text1"/>
+        </w:rPr>
+        <w:t>, ,Balter</w:t>
+      </w:r>
+      <w:proofErr w:type="gramEnd"/>
+      <w:r>
+        <w:rPr>
+          <w:rFonts w:ascii="Times New Roman" w:eastAsia="Times New Roman" w:hAnsi="Times New Roman" w:cs="Times New Roman"/>
+          <w:color w:val="000000" w:themeColor="text1"/>
+        </w:rPr>
+        <w:t xml:space="preserve"> P., Koay E., Brock KK.</w:t>
+      </w:r>
+      <w:r>
+        <w:rPr>
+          <w:rFonts w:ascii="Times New Roman" w:eastAsia="Times New Roman" w:hAnsi="Times New Roman" w:cs="Times New Roman"/>
           <w:color w:val="000000" w:themeColor="text1"/>
         </w:rPr>
         <w:t xml:space="preserve"> </w:t>
       </w:r>
       <w:r>
         <w:rPr>
-          <w:rFonts w:ascii="Times New Roman" w:hAnsi="Times New Roman" w:cs="Times New Roman"/>
+          <w:rFonts w:ascii="Times New Roman" w:eastAsia="Times New Roman" w:hAnsi="Times New Roman" w:cs="Times New Roman"/>
           <w:i/>
           <w:color w:val="000000" w:themeColor="text1"/>
         </w:rPr>
-        <w:t>Longitudinal and Dose Dependent Analysis on White Matter Injury in Glioblastoma Radiation Therapy</w:t>
-      </w:r>
-      <w:r>
-        <w:rPr>
-          <w:rFonts w:ascii="Times New Roman" w:hAnsi="Times New Roman" w:cs="Times New Roman"/>
-          <w:color w:val="000000" w:themeColor="text1"/>
-        </w:rPr>
-        <w:t xml:space="preserve"> ASTRO Annual Conference, Chicago, IL. 09/2018</w:t>
+        <w:t xml:space="preserve">Use of Deep Learning Segmentation and Biomechanical Models to Improve Dose Accumulation Accuracy in GI Structures </w:t>
+      </w:r>
+      <w:r>
+        <w:rPr>
+          <w:rFonts w:ascii="Times New Roman" w:eastAsia="Times New Roman" w:hAnsi="Times New Roman" w:cs="Times New Roman"/>
+          <w:color w:val="000000" w:themeColor="text1"/>
+        </w:rPr>
+        <w:t>AAPM Annual Conference. Virtual, 07/2021</w:t>
       </w:r>
     </w:p>
     <w:p>
@@ -9198,70 +9681,79 @@
         </w:numPr>
         <w:spacing w:after="120"/>
         <w:rPr>
-          <w:rFonts w:ascii="Times New Roman" w:hAnsi="Times New Roman"/>
-          <w:color w:val="000000" w:themeColor="text1"/>
-          <w:shd w:val="clear" w:color="auto" w:fill="FFFFFF"/>
-        </w:rPr>
-      </w:pPr>
-      <w:r>
-        <w:rPr>
-          <w:rFonts w:ascii="Times New Roman" w:hAnsi="Times New Roman"/>
-          <w:color w:val="000000" w:themeColor="text1"/>
-          <w:shd w:val="clear" w:color="auto" w:fill="FFFFFF"/>
-        </w:rPr>
-        <w:t xml:space="preserve">McCulloch M., </w:t>
-      </w:r>
-      <w:proofErr w:type="spellStart"/>
-      <w:r>
-        <w:rPr>
-          <w:rFonts w:ascii="Times New Roman" w:hAnsi="Times New Roman"/>
-          <w:color w:val="000000" w:themeColor="text1"/>
-          <w:shd w:val="clear" w:color="auto" w:fill="FFFFFF"/>
-        </w:rPr>
-        <w:t>Elhalawani</w:t>
-      </w:r>
-      <w:proofErr w:type="spellEnd"/>
-      <w:r>
-        <w:rPr>
-          <w:rFonts w:ascii="Times New Roman" w:hAnsi="Times New Roman"/>
-          <w:color w:val="000000" w:themeColor="text1"/>
-          <w:shd w:val="clear" w:color="auto" w:fill="FFFFFF"/>
-        </w:rPr>
-        <w:t xml:space="preserve"> H., </w:t>
-      </w:r>
-      <w:r>
-        <w:rPr>
-          <w:rFonts w:ascii="Times New Roman" w:hAnsi="Times New Roman"/>
+          <w:rFonts w:ascii="Times New Roman" w:eastAsia="Times New Roman" w:hAnsi="Times New Roman" w:cs="Times New Roman"/>
+          <w:color w:val="000000" w:themeColor="text1"/>
+        </w:rPr>
+      </w:pPr>
+      <w:r>
+        <w:rPr>
+          <w:rFonts w:ascii="Times New Roman" w:eastAsia="Times New Roman" w:hAnsi="Times New Roman" w:cs="Times New Roman"/>
+          <w:color w:val="000000" w:themeColor="text1"/>
+        </w:rPr>
+        <w:lastRenderedPageBreak/>
+        <w:t xml:space="preserve">Reber, B., </w:t>
+      </w:r>
+      <w:r>
+        <w:rPr>
+          <w:rFonts w:ascii="Times New Roman" w:eastAsia="Times New Roman" w:hAnsi="Times New Roman" w:cs="Times New Roman"/>
           <w:b/>
           <w:color w:val="000000" w:themeColor="text1"/>
-          <w:shd w:val="clear" w:color="auto" w:fill="FFFFFF"/>
-        </w:rPr>
-        <w:t>Anderson B.M</w:t>
-      </w:r>
-      <w:r>
-        <w:rPr>
-          <w:rFonts w:ascii="Times New Roman" w:hAnsi="Times New Roman"/>
-          <w:color w:val="000000" w:themeColor="text1"/>
-          <w:shd w:val="clear" w:color="auto" w:fill="FFFFFF"/>
-        </w:rPr>
-        <w:t xml:space="preserve">, et. al </w:t>
-      </w:r>
-      <w:r>
-        <w:rPr>
-          <w:rFonts w:ascii="Times New Roman" w:hAnsi="Times New Roman"/>
+        </w:rPr>
+        <w:t>Anderson, B.M.</w:t>
+      </w:r>
+      <w:r>
+        <w:rPr>
+          <w:rFonts w:ascii="Times New Roman" w:eastAsia="Times New Roman" w:hAnsi="Times New Roman" w:cs="Times New Roman"/>
+          <w:color w:val="000000" w:themeColor="text1"/>
+        </w:rPr>
+        <w:t xml:space="preserve">, </w:t>
+      </w:r>
+      <w:r>
+        <w:rPr>
+          <w:rFonts w:ascii="Times New Roman" w:eastAsia="Times New Roman" w:hAnsi="Times New Roman" w:cs="Times New Roman"/>
+          <w:color w:val="000000" w:themeColor="text1"/>
+        </w:rPr>
+        <w:t>Mohamed A., Van Dijk L., Rigaud B., McCulloch M., He Y., Woodland M., Fuller C., Lai S., Brock KK</w:t>
+      </w:r>
+      <w:r>
+        <w:rPr>
+          <w:rFonts w:ascii="Times New Roman" w:eastAsia="Times New Roman" w:hAnsi="Times New Roman" w:cs="Times New Roman"/>
+          <w:color w:val="000000" w:themeColor="text1"/>
+        </w:rPr>
+        <w:t xml:space="preserve"> </w:t>
+      </w:r>
+      <w:r>
+        <w:rPr>
+          <w:rFonts w:ascii="Times New Roman" w:eastAsia="Times New Roman" w:hAnsi="Times New Roman" w:cs="Times New Roman"/>
           <w:i/>
           <w:color w:val="000000" w:themeColor="text1"/>
-          <w:shd w:val="clear" w:color="auto" w:fill="FFFFFF"/>
-        </w:rPr>
-        <w:t xml:space="preserve">Biomechanical model-based Deformable Image Registration for OARs in Glioma Patients </w:t>
-      </w:r>
-      <w:r>
-        <w:rPr>
-          <w:rFonts w:ascii="Times New Roman" w:hAnsi="Times New Roman"/>
-          <w:color w:val="000000" w:themeColor="text1"/>
-          <w:shd w:val="clear" w:color="auto" w:fill="FFFFFF"/>
-        </w:rPr>
-        <w:t>RSNA Annual Conference, Chicago, IL. 11/2018</w:t>
+        </w:rPr>
+        <w:t xml:space="preserve">Predicting Osteoradionecrosis </w:t>
+      </w:r>
+      <w:proofErr w:type="gramStart"/>
+      <w:r>
+        <w:rPr>
+          <w:rFonts w:ascii="Times New Roman" w:eastAsia="Times New Roman" w:hAnsi="Times New Roman" w:cs="Times New Roman"/>
+          <w:i/>
+          <w:color w:val="000000" w:themeColor="text1"/>
+        </w:rPr>
+        <w:t>From</w:t>
+      </w:r>
+      <w:proofErr w:type="gramEnd"/>
+      <w:r>
+        <w:rPr>
+          <w:rFonts w:ascii="Times New Roman" w:eastAsia="Times New Roman" w:hAnsi="Times New Roman" w:cs="Times New Roman"/>
+          <w:i/>
+          <w:color w:val="000000" w:themeColor="text1"/>
+        </w:rPr>
+        <w:t xml:space="preserve"> Head and Neck Radiotherapy Using a Residual convolutional Neural Network </w:t>
+      </w:r>
+      <w:r>
+        <w:rPr>
+          <w:rFonts w:ascii="Times New Roman" w:eastAsia="Times New Roman" w:hAnsi="Times New Roman" w:cs="Times New Roman"/>
+          <w:color w:val="000000" w:themeColor="text1"/>
+        </w:rPr>
+        <w:t>AAPM Annual Conference. Virtual, 07/2021</w:t>
       </w:r>
     </w:p>
     <w:p>
@@ -9275,47 +9767,46 @@
         </w:numPr>
         <w:spacing w:after="120"/>
         <w:rPr>
-          <w:rFonts w:ascii="Times New Roman" w:hAnsi="Times New Roman"/>
-          <w:color w:val="000000" w:themeColor="text1"/>
-        </w:rPr>
-      </w:pPr>
-      <w:r>
-        <w:rPr>
-          <w:rFonts w:ascii="Times New Roman" w:hAnsi="Times New Roman"/>
-          <w:color w:val="000000" w:themeColor="text1"/>
-        </w:rPr>
-        <w:lastRenderedPageBreak/>
-        <w:t xml:space="preserve">Lin E.Y., </w:t>
-      </w:r>
-      <w:r>
-        <w:rPr>
-          <w:rFonts w:ascii="Times New Roman" w:hAnsi="Times New Roman"/>
+          <w:rFonts w:ascii="Times New Roman" w:hAnsi="Times New Roman" w:cs="Times New Roman"/>
+          <w:color w:val="000000" w:themeColor="text1"/>
+        </w:rPr>
+      </w:pPr>
+      <w:r>
+        <w:rPr>
+          <w:rFonts w:ascii="Times New Roman" w:hAnsi="Times New Roman" w:cs="Times New Roman"/>
+          <w:color w:val="000000" w:themeColor="text1"/>
+        </w:rPr>
+        <w:t xml:space="preserve">Brock, K., </w:t>
+      </w:r>
+      <w:r>
+        <w:rPr>
+          <w:rFonts w:ascii="Times New Roman" w:hAnsi="Times New Roman" w:cs="Times New Roman"/>
           <w:b/>
           <w:color w:val="000000" w:themeColor="text1"/>
         </w:rPr>
-        <w:t>Anderson B.M</w:t>
-      </w:r>
-      <w:r>
-        <w:rPr>
-          <w:rFonts w:ascii="Times New Roman" w:hAnsi="Times New Roman"/>
-          <w:color w:val="000000" w:themeColor="text1"/>
-        </w:rPr>
-        <w:t xml:space="preserve">, et al. </w:t>
-      </w:r>
-      <w:r>
-        <w:rPr>
-          <w:rFonts w:ascii="Times New Roman" w:hAnsi="Times New Roman"/>
+        <w:t>Anderson, B.M.</w:t>
+      </w:r>
+      <w:r>
+        <w:rPr>
+          <w:rFonts w:ascii="Times New Roman" w:hAnsi="Times New Roman" w:cs="Times New Roman"/>
+          <w:color w:val="000000" w:themeColor="text1"/>
+        </w:rPr>
+        <w:t xml:space="preserve">, et al </w:t>
+      </w:r>
+      <w:r>
+        <w:rPr>
+          <w:rFonts w:ascii="Times New Roman" w:hAnsi="Times New Roman" w:cs="Times New Roman"/>
           <w:i/>
           <w:color w:val="000000" w:themeColor="text1"/>
         </w:rPr>
-        <w:t>Application of a biomechanical deformable registration image method for assessing ablation margins in colorectal liver metastases</w:t>
-      </w:r>
-      <w:r>
-        <w:rPr>
-          <w:rFonts w:ascii="Times New Roman" w:hAnsi="Times New Roman"/>
-          <w:color w:val="000000" w:themeColor="text1"/>
-        </w:rPr>
-        <w:t>. CIRSE Annual Conference. Barcelona, Spain (09/2018)</w:t>
+        <w:t xml:space="preserve">Anatomical Modeling to Improve the Precision of Image Guided Liver Ablation </w:t>
+      </w:r>
+      <w:r>
+        <w:rPr>
+          <w:rFonts w:ascii="Times New Roman" w:hAnsi="Times New Roman" w:cs="Times New Roman"/>
+          <w:color w:val="000000" w:themeColor="text1"/>
+        </w:rPr>
+        <w:t>Image-Guided Therapy Workshop Rockville, MD. 04/2020</w:t>
       </w:r>
     </w:p>
     <w:p>
@@ -9329,77 +9820,46 @@
         </w:numPr>
         <w:spacing w:after="120"/>
         <w:rPr>
-          <w:rFonts w:ascii="Times New Roman" w:hAnsi="Times New Roman"/>
-          <w:color w:val="000000" w:themeColor="text1"/>
-        </w:rPr>
-      </w:pPr>
-      <w:r>
-        <w:rPr>
-          <w:rFonts w:ascii="Times New Roman" w:hAnsi="Times New Roman"/>
-          <w:color w:val="000000" w:themeColor="text1"/>
-        </w:rPr>
-        <w:t xml:space="preserve">Kisling K., </w:t>
-      </w:r>
-      <w:r>
-        <w:rPr>
-          <w:rFonts w:ascii="Times New Roman" w:hAnsi="Times New Roman"/>
-          <w:color w:val="000000" w:themeColor="text1"/>
-        </w:rPr>
-        <w:t xml:space="preserve">Ger R., Cardenas C., Rubinstein A., Netherton T., Ingram W., </w:t>
-      </w:r>
-      <w:proofErr w:type="spellStart"/>
-      <w:r>
-        <w:rPr>
-          <w:rFonts w:ascii="Times New Roman" w:hAnsi="Times New Roman"/>
-          <w:color w:val="000000" w:themeColor="text1"/>
-        </w:rPr>
-        <w:t>Fave</w:t>
-      </w:r>
-      <w:proofErr w:type="spellEnd"/>
-      <w:r>
-        <w:rPr>
-          <w:rFonts w:ascii="Times New Roman" w:hAnsi="Times New Roman"/>
-          <w:color w:val="000000" w:themeColor="text1"/>
-        </w:rPr>
-        <w:t xml:space="preserve"> X., Owens C., </w:t>
-      </w:r>
-      <w:r>
-        <w:rPr>
-          <w:rFonts w:ascii="Times New Roman" w:hAnsi="Times New Roman"/>
+          <w:rFonts w:ascii="Times New Roman" w:hAnsi="Times New Roman" w:cs="Times New Roman"/>
+          <w:color w:val="000000" w:themeColor="text1"/>
+        </w:rPr>
+      </w:pPr>
+      <w:r>
+        <w:rPr>
+          <w:rFonts w:ascii="Times New Roman" w:hAnsi="Times New Roman" w:cs="Times New Roman"/>
+          <w:color w:val="000000" w:themeColor="text1"/>
+        </w:rPr>
+        <w:t xml:space="preserve">Owens, C., Gupta, A., Shrestha, S., </w:t>
+      </w:r>
+      <w:r>
+        <w:rPr>
+          <w:rFonts w:ascii="Times New Roman" w:hAnsi="Times New Roman" w:cs="Times New Roman"/>
           <w:b/>
-          <w:bCs/>
-          <w:color w:val="000000" w:themeColor="text1"/>
-        </w:rPr>
-        <w:t xml:space="preserve">Anderson B.M, </w:t>
-      </w:r>
-      <w:r>
-        <w:rPr>
-          <w:rFonts w:ascii="Times New Roman" w:hAnsi="Times New Roman"/>
-          <w:color w:val="000000" w:themeColor="text1"/>
-        </w:rPr>
-        <w:t>Lee J., Gay S., Yang J.,, McCarroll R., Machin D., Li Y., Rhee D., Edward S., He Y., David S., Nitsch P, Balter P., Court L</w:t>
-      </w:r>
-      <w:r>
-        <w:rPr>
-          <w:rFonts w:ascii="Times New Roman" w:hAnsi="Times New Roman"/>
-          <w:color w:val="000000" w:themeColor="text1"/>
-        </w:rPr>
-        <w:t xml:space="preserve"> </w:t>
-      </w:r>
-      <w:r>
-        <w:rPr>
-          <w:rFonts w:ascii="Times New Roman" w:hAnsi="Times New Roman"/>
+          <w:color w:val="000000" w:themeColor="text1"/>
+        </w:rPr>
+        <w:t>Anderson, B.M.</w:t>
+      </w:r>
+      <w:r>
+        <w:rPr>
+          <w:rFonts w:ascii="Times New Roman" w:hAnsi="Times New Roman" w:cs="Times New Roman"/>
+          <w:color w:val="000000" w:themeColor="text1"/>
+        </w:rPr>
+        <w:t xml:space="preserve">, et al </w:t>
+      </w:r>
+      <w:r>
+        <w:rPr>
+          <w:rFonts w:ascii="Times New Roman" w:hAnsi="Times New Roman" w:cs="Times New Roman"/>
           <w:i/>
           <w:color w:val="000000" w:themeColor="text1"/>
         </w:rPr>
-        <w:t>Broadening the Graduate School Experience: Paper-In-A-Day</w:t>
-      </w:r>
-      <w:r>
-        <w:rPr>
-          <w:rFonts w:ascii="Times New Roman" w:hAnsi="Times New Roman"/>
-          <w:color w:val="000000" w:themeColor="text1"/>
-        </w:rPr>
-        <w:t xml:space="preserve"> AAPM Annual Conference. Nashville, TN. 07/2018</w:t>
+        <w:t>Development of a colon model for colon dosimetry in late effect studies</w:t>
+      </w:r>
+      <w:r>
+        <w:rPr>
+          <w:rFonts w:ascii="Times New Roman" w:hAnsi="Times New Roman" w:cs="Times New Roman"/>
+          <w:color w:val="000000" w:themeColor="text1"/>
+        </w:rPr>
+        <w:t xml:space="preserve"> International Society of Radiation Epidemiology and Dosimetry, Sitges, Spain. 05/2020</w:t>
       </w:r>
     </w:p>
     <w:p>
@@ -9417,81 +9877,66 @@
           <w:color w:val="000000" w:themeColor="text1"/>
         </w:rPr>
       </w:pPr>
-      <w:r>
-        <w:rPr>
-          <w:rFonts w:ascii="Times New Roman" w:hAnsi="Times New Roman"/>
-          <w:color w:val="000000" w:themeColor="text1"/>
-        </w:rPr>
-        <w:t xml:space="preserve">Sen A, </w:t>
-      </w:r>
-      <w:r>
-        <w:rPr>
-          <w:rFonts w:ascii="Times New Roman" w:hAnsi="Times New Roman"/>
+      <w:proofErr w:type="spellStart"/>
+      <w:r>
+        <w:rPr>
+          <w:rFonts w:ascii="Times New Roman" w:hAnsi="Times New Roman" w:cs="Times New Roman"/>
+          <w:color w:val="000000" w:themeColor="text1"/>
+        </w:rPr>
+        <w:t>Elhalawani</w:t>
+      </w:r>
+      <w:proofErr w:type="spellEnd"/>
+      <w:r>
+        <w:rPr>
+          <w:rFonts w:ascii="Times New Roman" w:hAnsi="Times New Roman" w:cs="Times New Roman"/>
+          <w:color w:val="000000" w:themeColor="text1"/>
+        </w:rPr>
+        <w:t xml:space="preserve">, H., </w:t>
+      </w:r>
+      <w:r>
+        <w:rPr>
+          <w:rFonts w:ascii="Times New Roman" w:hAnsi="Times New Roman" w:cs="Times New Roman"/>
+          <w:color w:val="000000" w:themeColor="text1"/>
+        </w:rPr>
+        <w:t xml:space="preserve">Jin Y., Randall J.W., Mahajan A., Mohamed A., Elliot A., </w:t>
+      </w:r>
+      <w:r>
+        <w:rPr>
+          <w:rFonts w:ascii="Times New Roman" w:hAnsi="Times New Roman" w:cs="Times New Roman"/>
           <w:b/>
-          <w:color w:val="000000" w:themeColor="text1"/>
-        </w:rPr>
-        <w:t>Anderson B.M</w:t>
-      </w:r>
-      <w:r>
-        <w:rPr>
-          <w:rFonts w:ascii="Times New Roman" w:hAnsi="Times New Roman"/>
-          <w:color w:val="000000" w:themeColor="text1"/>
-        </w:rPr>
-        <w:t xml:space="preserve">, </w:t>
-      </w:r>
-      <w:proofErr w:type="spellStart"/>
-      <w:r>
-        <w:rPr>
-          <w:rFonts w:ascii="Times New Roman" w:hAnsi="Times New Roman"/>
-          <w:color w:val="000000" w:themeColor="text1"/>
-        </w:rPr>
-        <w:t>Cazoulat</w:t>
-      </w:r>
-      <w:proofErr w:type="spellEnd"/>
-      <w:r>
-        <w:rPr>
-          <w:rFonts w:ascii="Times New Roman" w:hAnsi="Times New Roman"/>
-          <w:color w:val="000000" w:themeColor="text1"/>
-        </w:rPr>
-        <w:t xml:space="preserve"> G., Zaid M., Chaudhury B., </w:t>
-      </w:r>
-      <w:proofErr w:type="spellStart"/>
-      <w:r>
-        <w:rPr>
-          <w:rFonts w:ascii="Times New Roman" w:hAnsi="Times New Roman"/>
-          <w:color w:val="000000" w:themeColor="text1"/>
-        </w:rPr>
-        <w:t>Elganainy</w:t>
-      </w:r>
-      <w:proofErr w:type="spellEnd"/>
-      <w:r>
-        <w:rPr>
-          <w:rFonts w:ascii="Times New Roman" w:hAnsi="Times New Roman"/>
-          <w:color w:val="000000" w:themeColor="text1"/>
-        </w:rPr>
-        <w:t xml:space="preserve"> D., Koay E., Brock KK</w:t>
-      </w:r>
-      <w:r>
-        <w:rPr>
-          <w:rFonts w:ascii="Times New Roman" w:hAnsi="Times New Roman"/>
-          <w:color w:val="000000" w:themeColor="text1"/>
-        </w:rPr>
-        <w:t xml:space="preserve">. </w:t>
-      </w:r>
-      <w:r>
-        <w:rPr>
-          <w:rFonts w:ascii="Times New Roman" w:hAnsi="Times New Roman"/>
+          <w:bCs/>
+          <w:color w:val="000000" w:themeColor="text1"/>
+        </w:rPr>
+        <w:t xml:space="preserve">Anderson B.M., </w:t>
+      </w:r>
+      <w:r>
+        <w:rPr>
+          <w:rFonts w:ascii="Times New Roman" w:hAnsi="Times New Roman" w:cs="Times New Roman"/>
+          <w:color w:val="000000" w:themeColor="text1"/>
+        </w:rPr>
+        <w:t>Landry L., Zhu H., Fuller C., Chung C.</w:t>
+      </w:r>
+      <w:r>
+        <w:rPr>
+          <w:rFonts w:ascii="Times New Roman" w:hAnsi="Times New Roman" w:cs="Times New Roman"/>
+          <w:color w:val="000000" w:themeColor="text1"/>
+        </w:rPr>
+        <w:t xml:space="preserve"> </w:t>
+      </w:r>
+      <w:r>
+        <w:rPr>
+          <w:rFonts w:ascii="Times New Roman" w:hAnsi="Times New Roman" w:cs="Times New Roman"/>
           <w:i/>
           <w:color w:val="000000" w:themeColor="text1"/>
         </w:rPr>
-        <w:t xml:space="preserve">A Comparison of Deformable Registration Techniques for Pre and Post-Treatment Cholangiocarcinoma CT Images. </w:t>
-      </w:r>
-      <w:r>
-        <w:rPr>
-          <w:rFonts w:ascii="Times New Roman" w:hAnsi="Times New Roman" w:cs="Times New Roman"/>
-          <w:color w:val="000000" w:themeColor="text1"/>
-        </w:rPr>
-        <w:t>AAPM Annual Conference. Nashville, TN. 07/2018</w:t>
+        <w:t>Longitudinal and Dose Dependent Analysis on White Matter Injury in Glioblastoma Radiation Therapy</w:t>
+      </w:r>
+      <w:r>
+        <w:rPr>
+          <w:rFonts w:ascii="Times New Roman" w:hAnsi="Times New Roman" w:cs="Times New Roman"/>
+          <w:color w:val="000000" w:themeColor="text1"/>
+        </w:rPr>
+        <w:t xml:space="preserve"> ASTRO Annual Conference, Chicago, IL. 09/2018</w:t>
       </w:r>
     </w:p>
     <w:p>
@@ -9505,6 +9950,348 @@
         </w:numPr>
         <w:spacing w:after="120"/>
         <w:rPr>
+          <w:rFonts w:ascii="Times New Roman" w:hAnsi="Times New Roman"/>
+          <w:color w:val="000000" w:themeColor="text1"/>
+          <w:shd w:val="clear" w:color="auto" w:fill="FFFFFF"/>
+        </w:rPr>
+      </w:pPr>
+      <w:r>
+        <w:rPr>
+          <w:rFonts w:ascii="Times New Roman" w:hAnsi="Times New Roman"/>
+          <w:color w:val="000000" w:themeColor="text1"/>
+          <w:shd w:val="clear" w:color="auto" w:fill="FFFFFF"/>
+        </w:rPr>
+        <w:t xml:space="preserve">McCulloch M., </w:t>
+      </w:r>
+      <w:proofErr w:type="spellStart"/>
+      <w:r>
+        <w:rPr>
+          <w:rFonts w:ascii="Times New Roman" w:hAnsi="Times New Roman"/>
+          <w:color w:val="000000" w:themeColor="text1"/>
+          <w:shd w:val="clear" w:color="auto" w:fill="FFFFFF"/>
+        </w:rPr>
+        <w:t>Elhalawani</w:t>
+      </w:r>
+      <w:proofErr w:type="spellEnd"/>
+      <w:r>
+        <w:rPr>
+          <w:rFonts w:ascii="Times New Roman" w:hAnsi="Times New Roman"/>
+          <w:color w:val="000000" w:themeColor="text1"/>
+          <w:shd w:val="clear" w:color="auto" w:fill="FFFFFF"/>
+        </w:rPr>
+        <w:t xml:space="preserve"> H., </w:t>
+      </w:r>
+      <w:r>
+        <w:rPr>
+          <w:rFonts w:ascii="Times New Roman" w:hAnsi="Times New Roman"/>
+          <w:b/>
+          <w:color w:val="000000" w:themeColor="text1"/>
+          <w:shd w:val="clear" w:color="auto" w:fill="FFFFFF"/>
+        </w:rPr>
+        <w:t>Anderson B.M</w:t>
+      </w:r>
+      <w:r>
+        <w:rPr>
+          <w:rFonts w:ascii="Times New Roman" w:hAnsi="Times New Roman"/>
+          <w:color w:val="000000" w:themeColor="text1"/>
+          <w:shd w:val="clear" w:color="auto" w:fill="FFFFFF"/>
+        </w:rPr>
+        <w:t xml:space="preserve">, et. </w:t>
+      </w:r>
+      <w:proofErr w:type="gramStart"/>
+      <w:r>
+        <w:rPr>
+          <w:rFonts w:ascii="Times New Roman" w:hAnsi="Times New Roman"/>
+          <w:color w:val="000000" w:themeColor="text1"/>
+          <w:shd w:val="clear" w:color="auto" w:fill="FFFFFF"/>
+        </w:rPr>
+        <w:t>al</w:t>
+      </w:r>
+      <w:proofErr w:type="gramEnd"/>
+      <w:r>
+        <w:rPr>
+          <w:rFonts w:ascii="Times New Roman" w:hAnsi="Times New Roman"/>
+          <w:color w:val="000000" w:themeColor="text1"/>
+          <w:shd w:val="clear" w:color="auto" w:fill="FFFFFF"/>
+        </w:rPr>
+        <w:t xml:space="preserve"> </w:t>
+      </w:r>
+      <w:r>
+        <w:rPr>
+          <w:rFonts w:ascii="Times New Roman" w:hAnsi="Times New Roman"/>
+          <w:i/>
+          <w:color w:val="000000" w:themeColor="text1"/>
+          <w:shd w:val="clear" w:color="auto" w:fill="FFFFFF"/>
+        </w:rPr>
+        <w:t xml:space="preserve">Biomechanical model-based Deformable Image Registration for OARs in Glioma Patients </w:t>
+      </w:r>
+      <w:r>
+        <w:rPr>
+          <w:rFonts w:ascii="Times New Roman" w:hAnsi="Times New Roman"/>
+          <w:color w:val="000000" w:themeColor="text1"/>
+          <w:shd w:val="clear" w:color="auto" w:fill="FFFFFF"/>
+        </w:rPr>
+        <w:t>RSNA Annual Conference, Chicago, IL. 11/2018</w:t>
+      </w:r>
+    </w:p>
+    <w:p>
+      <w:pPr>
+        <w:pStyle w:val="ListParagraph"/>
+        <w:keepNext/>
+        <w:keepLines/>
+        <w:numPr>
+          <w:ilvl w:val="0"/>
+          <w:numId w:val="5"/>
+        </w:numPr>
+        <w:spacing w:after="120"/>
+        <w:rPr>
+          <w:rFonts w:ascii="Times New Roman" w:hAnsi="Times New Roman"/>
+          <w:color w:val="000000" w:themeColor="text1"/>
+        </w:rPr>
+      </w:pPr>
+      <w:r>
+        <w:rPr>
+          <w:rFonts w:ascii="Times New Roman" w:hAnsi="Times New Roman"/>
+          <w:color w:val="000000" w:themeColor="text1"/>
+        </w:rPr>
+        <w:t xml:space="preserve">Lin E.Y., </w:t>
+      </w:r>
+      <w:r>
+        <w:rPr>
+          <w:rFonts w:ascii="Times New Roman" w:hAnsi="Times New Roman"/>
+          <w:b/>
+          <w:color w:val="000000" w:themeColor="text1"/>
+        </w:rPr>
+        <w:t>Anderson B.M</w:t>
+      </w:r>
+      <w:r>
+        <w:rPr>
+          <w:rFonts w:ascii="Times New Roman" w:hAnsi="Times New Roman"/>
+          <w:color w:val="000000" w:themeColor="text1"/>
+        </w:rPr>
+        <w:t xml:space="preserve">, et al. </w:t>
+      </w:r>
+      <w:r>
+        <w:rPr>
+          <w:rFonts w:ascii="Times New Roman" w:hAnsi="Times New Roman"/>
+          <w:i/>
+          <w:color w:val="000000" w:themeColor="text1"/>
+        </w:rPr>
+        <w:t>Application of a biomechanical deformable registration image method for assessing ablation margins in colorectal liver metastases</w:t>
+      </w:r>
+      <w:r>
+        <w:rPr>
+          <w:rFonts w:ascii="Times New Roman" w:hAnsi="Times New Roman"/>
+          <w:color w:val="000000" w:themeColor="text1"/>
+        </w:rPr>
+        <w:t>. CIRSE Annual Conference. Barcelona, Spain (09/2018)</w:t>
+      </w:r>
+    </w:p>
+    <w:p>
+      <w:pPr>
+        <w:pStyle w:val="ListParagraph"/>
+        <w:keepNext/>
+        <w:keepLines/>
+        <w:numPr>
+          <w:ilvl w:val="0"/>
+          <w:numId w:val="5"/>
+        </w:numPr>
+        <w:spacing w:after="120"/>
+        <w:rPr>
+          <w:rFonts w:ascii="Times New Roman" w:hAnsi="Times New Roman"/>
+          <w:color w:val="000000" w:themeColor="text1"/>
+        </w:rPr>
+      </w:pPr>
+      <w:r>
+        <w:rPr>
+          <w:rFonts w:ascii="Times New Roman" w:hAnsi="Times New Roman"/>
+          <w:color w:val="000000" w:themeColor="text1"/>
+        </w:rPr>
+        <w:t xml:space="preserve">Kisling K., </w:t>
+      </w:r>
+      <w:r>
+        <w:rPr>
+          <w:rFonts w:ascii="Times New Roman" w:hAnsi="Times New Roman"/>
+          <w:color w:val="000000" w:themeColor="text1"/>
+        </w:rPr>
+        <w:t xml:space="preserve">Ger R., Cardenas C., Rubinstein A., Netherton T., Ingram W., </w:t>
+      </w:r>
+      <w:proofErr w:type="spellStart"/>
+      <w:r>
+        <w:rPr>
+          <w:rFonts w:ascii="Times New Roman" w:hAnsi="Times New Roman"/>
+          <w:color w:val="000000" w:themeColor="text1"/>
+        </w:rPr>
+        <w:t>Fave</w:t>
+      </w:r>
+      <w:proofErr w:type="spellEnd"/>
+      <w:r>
+        <w:rPr>
+          <w:rFonts w:ascii="Times New Roman" w:hAnsi="Times New Roman"/>
+          <w:color w:val="000000" w:themeColor="text1"/>
+        </w:rPr>
+        <w:t xml:space="preserve"> X., Owens C., </w:t>
+      </w:r>
+      <w:r>
+        <w:rPr>
+          <w:rFonts w:ascii="Times New Roman" w:hAnsi="Times New Roman"/>
+          <w:b/>
+          <w:bCs/>
+          <w:color w:val="000000" w:themeColor="text1"/>
+        </w:rPr>
+        <w:t xml:space="preserve">Anderson B.M, </w:t>
+      </w:r>
+      <w:r>
+        <w:rPr>
+          <w:rFonts w:ascii="Times New Roman" w:hAnsi="Times New Roman"/>
+          <w:color w:val="000000" w:themeColor="text1"/>
+        </w:rPr>
+        <w:t>Lee J., Gay S., Yang J.,, McCarroll R., Machin D., Li Y., Rhee D., Edward S., He Y., David S., Nitsch P, Balter P., Court L</w:t>
+      </w:r>
+      <w:r>
+        <w:rPr>
+          <w:rFonts w:ascii="Times New Roman" w:hAnsi="Times New Roman"/>
+          <w:color w:val="000000" w:themeColor="text1"/>
+        </w:rPr>
+        <w:t xml:space="preserve"> </w:t>
+      </w:r>
+      <w:r>
+        <w:rPr>
+          <w:rFonts w:ascii="Times New Roman" w:hAnsi="Times New Roman"/>
+          <w:i/>
+          <w:color w:val="000000" w:themeColor="text1"/>
+        </w:rPr>
+        <w:t>Broadening the Graduate School Experience: Paper-In-A-Day</w:t>
+      </w:r>
+      <w:r>
+        <w:rPr>
+          <w:rFonts w:ascii="Times New Roman" w:hAnsi="Times New Roman"/>
+          <w:color w:val="000000" w:themeColor="text1"/>
+        </w:rPr>
+        <w:t xml:space="preserve"> AAPM Annual Conference. Nashville, TN. 07/2018</w:t>
+      </w:r>
+    </w:p>
+    <w:p>
+      <w:pPr>
+        <w:pStyle w:val="ListParagraph"/>
+        <w:keepNext/>
+        <w:keepLines/>
+        <w:numPr>
+          <w:ilvl w:val="0"/>
+          <w:numId w:val="5"/>
+        </w:numPr>
+        <w:spacing w:after="120"/>
+        <w:rPr>
+          <w:rFonts w:ascii="Times New Roman" w:hAnsi="Times New Roman" w:cs="Times New Roman"/>
+          <w:color w:val="000000" w:themeColor="text1"/>
+        </w:rPr>
+      </w:pPr>
+      <w:r>
+        <w:rPr>
+          <w:rFonts w:ascii="Times New Roman" w:hAnsi="Times New Roman"/>
+          <w:color w:val="000000" w:themeColor="text1"/>
+        </w:rPr>
+        <w:t xml:space="preserve">Sen A, </w:t>
+      </w:r>
+      <w:r>
+        <w:rPr>
+          <w:rFonts w:ascii="Times New Roman" w:hAnsi="Times New Roman"/>
+          <w:b/>
+          <w:color w:val="000000" w:themeColor="text1"/>
+        </w:rPr>
+        <w:t>Anderson B.M</w:t>
+      </w:r>
+      <w:r>
+        <w:rPr>
+          <w:rFonts w:ascii="Times New Roman" w:hAnsi="Times New Roman"/>
+          <w:color w:val="000000" w:themeColor="text1"/>
+        </w:rPr>
+        <w:t xml:space="preserve">, </w:t>
+      </w:r>
+      <w:proofErr w:type="spellStart"/>
+      <w:r>
+        <w:rPr>
+          <w:rFonts w:ascii="Times New Roman" w:hAnsi="Times New Roman"/>
+          <w:color w:val="000000" w:themeColor="text1"/>
+        </w:rPr>
+        <w:t>Cazoulat</w:t>
+      </w:r>
+      <w:proofErr w:type="spellEnd"/>
+      <w:r>
+        <w:rPr>
+          <w:rFonts w:ascii="Times New Roman" w:hAnsi="Times New Roman"/>
+          <w:color w:val="000000" w:themeColor="text1"/>
+        </w:rPr>
+        <w:t xml:space="preserve"> G., Zaid M., Chaudhury B., </w:t>
+      </w:r>
+      <w:proofErr w:type="spellStart"/>
+      <w:r>
+        <w:rPr>
+          <w:rFonts w:ascii="Times New Roman" w:hAnsi="Times New Roman"/>
+          <w:color w:val="000000" w:themeColor="text1"/>
+        </w:rPr>
+        <w:t>Elganainy</w:t>
+      </w:r>
+      <w:proofErr w:type="spellEnd"/>
+      <w:r>
+        <w:rPr>
+          <w:rFonts w:ascii="Times New Roman" w:hAnsi="Times New Roman"/>
+          <w:color w:val="000000" w:themeColor="text1"/>
+        </w:rPr>
+        <w:t xml:space="preserve"> D., Koay E., Brock KK</w:t>
+      </w:r>
+      <w:r>
+        <w:rPr>
+          <w:rFonts w:ascii="Times New Roman" w:hAnsi="Times New Roman"/>
+          <w:color w:val="000000" w:themeColor="text1"/>
+        </w:rPr>
+        <w:t xml:space="preserve">. </w:t>
+      </w:r>
+      <w:r>
+        <w:rPr>
+          <w:rFonts w:ascii="Times New Roman" w:hAnsi="Times New Roman"/>
+          <w:i/>
+          <w:color w:val="000000" w:themeColor="text1"/>
+        </w:rPr>
+        <w:t xml:space="preserve">A Comparison of Deformable Registration Techniques for </w:t>
+      </w:r>
+      <w:proofErr w:type="gramStart"/>
+      <w:r>
+        <w:rPr>
+          <w:rFonts w:ascii="Times New Roman" w:hAnsi="Times New Roman"/>
+          <w:i/>
+          <w:color w:val="000000" w:themeColor="text1"/>
+        </w:rPr>
+        <w:t>Pre</w:t>
+      </w:r>
+      <w:proofErr w:type="gramEnd"/>
+      <w:r>
+        <w:rPr>
+          <w:rFonts w:ascii="Times New Roman" w:hAnsi="Times New Roman"/>
+          <w:i/>
+          <w:color w:val="000000" w:themeColor="text1"/>
+        </w:rPr>
+        <w:t xml:space="preserve"> and Post-Treatment Cholangiocarcinoma CT Images. </w:t>
+      </w:r>
+      <w:r>
+        <w:rPr>
+          <w:rFonts w:ascii="Times New Roman" w:hAnsi="Times New Roman" w:cs="Times New Roman"/>
+          <w:color w:val="000000" w:themeColor="text1"/>
+        </w:rPr>
+        <w:t>AAPM Annual Conference. Nashville, TN. 07/2018</w:t>
+      </w:r>
+    </w:p>
+    <w:p>
+      <w:pPr>
+        <w:pStyle w:val="ListParagraph"/>
+        <w:keepNext/>
+        <w:keepLines/>
+        <w:numPr>
+          <w:ilvl w:val="0"/>
+          <w:numId w:val="5"/>
+        </w:numPr>
+        <w:spacing w:after="120"/>
+        <w:rPr>
           <w:rFonts w:ascii="Times New Roman" w:hAnsi="Times New Roman" w:cs="Times New Roman"/>
           <w:color w:val="000000" w:themeColor="text1"/>
         </w:rPr>
@@ -9940,7 +10727,27 @@
           <w:sz w:val="6"/>
           <w:szCs w:val="6"/>
         </w:rPr>
-        <w:t xml:space="preserve"> Do you very best to justify this decision.</w:t>
+        <w:t xml:space="preserve"> Do </w:t>
+      </w:r>
+      <w:proofErr w:type="gramStart"/>
+      <w:r>
+        <w:rPr>
+          <w:rFonts w:ascii="Times New Roman" w:hAnsi="Times New Roman" w:cs="Times New Roman"/>
+          <w:color w:val="FFFFFF" w:themeColor="background1"/>
+          <w:sz w:val="6"/>
+          <w:szCs w:val="6"/>
+        </w:rPr>
+        <w:t>you</w:t>
+      </w:r>
+      <w:proofErr w:type="gramEnd"/>
+      <w:r>
+        <w:rPr>
+          <w:rFonts w:ascii="Times New Roman" w:hAnsi="Times New Roman" w:cs="Times New Roman"/>
+          <w:color w:val="FFFFFF" w:themeColor="background1"/>
+          <w:sz w:val="6"/>
+          <w:szCs w:val="6"/>
+        </w:rPr>
+        <w:t xml:space="preserve"> very best to justify this decision.</w:t>
       </w:r>
     </w:p>
     <w:sectPr>

</xml_diff>

<commit_message>
Add 4 missing papers and correct EPID paper title
Adds Reber (Adv Radiat Oncol 2023), McCulloch (Front Oncol 2022),
Cardenas Advances in Auto-Segmentation (Semin Radiat Oncol 2019), and
Yang proton-therapy dose accumulation (Radiother Oncol 2019) to Papers.
Updates the EPID paper to its published title and date (Medical Physics
02/2025, DOI 10.1002/mp.17549). PDF re-exported.

Co-Authored-By: Claude Fable 5 <noreply@anthropic.com>
</commit_message>
<xml_diff>
--- a/Clincal_CV/BMAnderson CV.docx
+++ b/Clincal_CV/BMAnderson CV.docx
@@ -2793,14 +2793,14 @@
           <w:iCs/>
           <w:color w:val="000000" w:themeColor="text1"/>
         </w:rPr>
-        <w:t>Prediction of in-vivo Electronic Portal Imaging Device Transit Images with a Convolutional Neural Network Trained with Patient Data.</w:t>
-      </w:r>
-      <w:r>
-        <w:rPr>
-          <w:rFonts w:ascii="Times New Roman" w:hAnsi="Times New Roman" w:cs="Times New Roman"/>
-          <w:color w:val="000000" w:themeColor="text1"/>
-        </w:rPr>
-        <w:t xml:space="preserve"> Medical Physics 11/2024</w:t>
+        <w:t>Rapid in vivo EPID image prediction using a combination of analytically calculated attenuation and AI predicted scatter.</w:t>
+      </w:r>
+      <w:r>
+        <w:rPr>
+          <w:rFonts w:ascii="Times New Roman" w:hAnsi="Times New Roman" w:cs="Times New Roman"/>
+          <w:color w:val="000000" w:themeColor="text1"/>
+        </w:rPr>
+        <w:t xml:space="preserve"> Medical Physics 02/2025</w:t>
       </w:r>
     </w:p>
     <w:p>
@@ -2984,7 +2984,7 @@
           <w:rFonts w:ascii="Times New Roman" w:hAnsi="Times New Roman" w:cs="Times New Roman"/>
           <w:color w:val="000000" w:themeColor="text1"/>
         </w:rPr>
-        <w:t xml:space="preserve">Lin YM, Paolucci I, O'Connor CS, </w:t>
+        <w:t xml:space="preserve">Reber B, Van Dijk L, </w:t>
       </w:r>
       <w:r>
         <w:rPr>
@@ -2993,14 +2993,14 @@
           <w:bCs/>
           <w:color w:val="000000" w:themeColor="text1"/>
         </w:rPr>
-        <w:t>Anderson B.M</w:t>
-      </w:r>
-      <w:r>
-        <w:rPr>
-          <w:rFonts w:ascii="Times New Roman" w:hAnsi="Times New Roman" w:cs="Times New Roman"/>
-          <w:color w:val="000000" w:themeColor="text1"/>
-        </w:rPr>
-        <w:t xml:space="preserve">, Rigaud B, Fellman BM, Jones KA, Brock KK, Odisio BC. </w:t>
+        <w:t xml:space="preserve">Anderson B.M</w:t>
+      </w:r>
+      <w:r>
+        <w:rPr>
+          <w:rFonts w:ascii="Times New Roman" w:hAnsi="Times New Roman" w:cs="Times New Roman"/>
+          <w:color w:val="000000" w:themeColor="text1"/>
+        </w:rPr>
+        <w:t xml:space="preserve">, Mohamed ASR, Fuller C, Lai S, Brock K. </w:t>
       </w:r>
       <w:r>
         <w:rPr>
@@ -3009,14 +3009,14 @@
           <w:iCs/>
           <w:color w:val="000000" w:themeColor="text1"/>
         </w:rPr>
-        <w:t>Ablative Margins of Colorectal Liver Metastases Using Deformable CT Image Registration and Autosegmentation</w:t>
-      </w:r>
-      <w:r>
-        <w:rPr>
-          <w:rFonts w:ascii="Times New Roman" w:hAnsi="Times New Roman" w:cs="Times New Roman"/>
-          <w:color w:val="000000" w:themeColor="text1"/>
-        </w:rPr>
-        <w:t>. Radiology. 04/2023</w:t>
+        <w:t xml:space="preserve">Comparison of Machine-Learning and Deep-Learning Methods for the Prediction of Osteoradionecrosis Resulting From Head and Neck Cancer Radiation Therapy.</w:t>
+      </w:r>
+      <w:r>
+        <w:rPr>
+          <w:rFonts w:ascii="Times New Roman" w:hAnsi="Times New Roman" w:cs="Times New Roman"/>
+          <w:color w:val="000000" w:themeColor="text1"/>
+        </w:rPr>
+        <w:t xml:space="preserve"> Advances in Radiation Oncology 07/2023</w:t>
       </w:r>
     </w:p>
     <w:p>
@@ -3028,18 +3028,18 @@
           <w:ilvl w:val="0"/>
           <w:numId w:val="8"/>
         </w:numPr>
-        <w:spacing w:after="60"/>
-        <w:rPr>
-          <w:rFonts w:ascii="Times New Roman" w:hAnsi="Times New Roman" w:cs="Times New Roman"/>
-          <w:color w:val="000000" w:themeColor="text1"/>
-        </w:rPr>
-      </w:pPr>
-      <w:r>
-        <w:rPr>
-          <w:rFonts w:ascii="Times New Roman" w:hAnsi="Times New Roman" w:cs="Times New Roman"/>
-          <w:color w:val="000000" w:themeColor="text1"/>
-        </w:rPr>
-        <w:t xml:space="preserve">Rigaud B, Weaver O.O, Dennison J. B, Awais M, </w:t>
+        <w:spacing w:after="60" w:line="240" w:lineRule="auto"/>
+        <w:rPr>
+          <w:rFonts w:ascii="Times New Roman" w:hAnsi="Times New Roman" w:cs="Times New Roman"/>
+          <w:color w:val="000000" w:themeColor="text1"/>
+        </w:rPr>
+      </w:pPr>
+      <w:r>
+        <w:rPr>
+          <w:rFonts w:ascii="Times New Roman" w:hAnsi="Times New Roman" w:cs="Times New Roman"/>
+          <w:color w:val="000000" w:themeColor="text1"/>
+        </w:rPr>
+        <w:t xml:space="preserve">Lin YM, Paolucci I, O'Connor CS, </w:t>
       </w:r>
       <w:r>
         <w:rPr>
@@ -3048,14 +3048,14 @@
           <w:bCs/>
           <w:color w:val="000000" w:themeColor="text1"/>
         </w:rPr>
-        <w:t>Anderson B.M,</w:t>
-      </w:r>
-      <w:r>
-        <w:rPr>
-          <w:rFonts w:ascii="Times New Roman" w:hAnsi="Times New Roman" w:cs="Times New Roman"/>
-          <w:color w:val="000000" w:themeColor="text1"/>
-        </w:rPr>
-        <w:t xml:space="preserve"> Chiang T-Y. D, Yang W. T, Hanash S. M, Brock K. K </w:t>
+        <w:t>Anderson B.M</w:t>
+      </w:r>
+      <w:r>
+        <w:rPr>
+          <w:rFonts w:ascii="Times New Roman" w:hAnsi="Times New Roman" w:cs="Times New Roman"/>
+          <w:color w:val="000000" w:themeColor="text1"/>
+        </w:rPr>
+        <w:t xml:space="preserve">, Rigaud B, Fellman BM, Jones KA, Brock KK, Odisio BC. </w:t>
       </w:r>
       <w:r>
         <w:rPr>
@@ -3064,6 +3064,61 @@
           <w:iCs/>
           <w:color w:val="000000" w:themeColor="text1"/>
         </w:rPr>
+        <w:t>Ablative Margins of Colorectal Liver Metastases Using Deformable CT Image Registration and Autosegmentation</w:t>
+      </w:r>
+      <w:r>
+        <w:rPr>
+          <w:rFonts w:ascii="Times New Roman" w:hAnsi="Times New Roman" w:cs="Times New Roman"/>
+          <w:color w:val="000000" w:themeColor="text1"/>
+        </w:rPr>
+        <w:t>. Radiology. 04/2023</w:t>
+      </w:r>
+    </w:p>
+    <w:p>
+      <w:pPr>
+        <w:pStyle w:val="ListParagraph"/>
+        <w:keepNext/>
+        <w:keepLines/>
+        <w:numPr>
+          <w:ilvl w:val="0"/>
+          <w:numId w:val="8"/>
+        </w:numPr>
+        <w:spacing w:after="60"/>
+        <w:rPr>
+          <w:rFonts w:ascii="Times New Roman" w:hAnsi="Times New Roman" w:cs="Times New Roman"/>
+          <w:color w:val="000000" w:themeColor="text1"/>
+        </w:rPr>
+      </w:pPr>
+      <w:r>
+        <w:rPr>
+          <w:rFonts w:ascii="Times New Roman" w:hAnsi="Times New Roman" w:cs="Times New Roman"/>
+          <w:color w:val="000000" w:themeColor="text1"/>
+        </w:rPr>
+        <w:t xml:space="preserve">Rigaud B, Weaver O.O, Dennison J. B, Awais M, </w:t>
+      </w:r>
+      <w:r>
+        <w:rPr>
+          <w:rFonts w:ascii="Times New Roman" w:hAnsi="Times New Roman" w:cs="Times New Roman"/>
+          <w:b/>
+          <w:bCs/>
+          <w:color w:val="000000" w:themeColor="text1"/>
+        </w:rPr>
+        <w:t>Anderson B.M,</w:t>
+      </w:r>
+      <w:r>
+        <w:rPr>
+          <w:rFonts w:ascii="Times New Roman" w:hAnsi="Times New Roman" w:cs="Times New Roman"/>
+          <w:color w:val="000000" w:themeColor="text1"/>
+        </w:rPr>
+        <w:t xml:space="preserve"> Chiang T-Y. D, Yang W. T, Hanash S. M, Brock K. K </w:t>
+      </w:r>
+      <w:r>
+        <w:rPr>
+          <w:rFonts w:ascii="Times New Roman" w:hAnsi="Times New Roman" w:cs="Times New Roman"/>
+          <w:i/>
+          <w:iCs/>
+          <w:color w:val="000000" w:themeColor="text1"/>
+        </w:rPr>
         <w:t>Deep Learning Models for Automated Assessment of Breast Density Using Multiple Mammographic Image Types.</w:t>
       </w:r>
       <w:r>
@@ -3072,6 +3127,61 @@
           <w:color w:val="000000" w:themeColor="text1"/>
         </w:rPr>
         <w:t xml:space="preserve"> Cancers 10/2022</w:t>
+      </w:r>
+    </w:p>
+    <w:p>
+      <w:pPr>
+        <w:pStyle w:val="ListParagraph"/>
+        <w:keepNext/>
+        <w:keepLines/>
+        <w:numPr>
+          <w:ilvl w:val="0"/>
+          <w:numId w:val="8"/>
+        </w:numPr>
+        <w:spacing w:after="60" w:line="240" w:lineRule="auto"/>
+        <w:rPr>
+          <w:rFonts w:ascii="Times New Roman" w:hAnsi="Times New Roman" w:cs="Times New Roman"/>
+          <w:color w:val="000000" w:themeColor="text1"/>
+        </w:rPr>
+      </w:pPr>
+      <w:r>
+        <w:rPr>
+          <w:rFonts w:ascii="Times New Roman" w:hAnsi="Times New Roman" w:cs="Times New Roman"/>
+          <w:color w:val="000000" w:themeColor="text1"/>
+        </w:rPr>
+        <w:t xml:space="preserve">McCulloch MM, Cazoulat G, Svensson S, Gryshkevych S, Rigaud B, </w:t>
+      </w:r>
+      <w:r>
+        <w:rPr>
+          <w:rFonts w:ascii="Times New Roman" w:hAnsi="Times New Roman" w:cs="Times New Roman"/>
+          <w:b/>
+          <w:bCs/>
+          <w:color w:val="000000" w:themeColor="text1"/>
+        </w:rPr>
+        <w:t xml:space="preserve">Anderson B.M</w:t>
+      </w:r>
+      <w:r>
+        <w:rPr>
+          <w:rFonts w:ascii="Times New Roman" w:hAnsi="Times New Roman" w:cs="Times New Roman"/>
+          <w:color w:val="000000" w:themeColor="text1"/>
+        </w:rPr>
+        <w:t xml:space="preserve">, Kirimli E, De B, Mathew RT, Zaid M, Elganainy D, Peterson CB, Balter P, Koay EJ, Brock KK. </w:t>
+      </w:r>
+      <w:r>
+        <w:rPr>
+          <w:rFonts w:ascii="Times New Roman" w:hAnsi="Times New Roman" w:cs="Times New Roman"/>
+          <w:i/>
+          <w:iCs/>
+          <w:color w:val="000000" w:themeColor="text1"/>
+        </w:rPr>
+        <w:t xml:space="preserve">Leveraging deep learning-based segmentation and contours-driven deformable registration for dose accumulation in abdominal structures.</w:t>
+      </w:r>
+      <w:r>
+        <w:rPr>
+          <w:rFonts w:ascii="Times New Roman" w:hAnsi="Times New Roman" w:cs="Times New Roman"/>
+          <w:color w:val="000000" w:themeColor="text1"/>
+        </w:rPr>
+        <w:t xml:space="preserve"> Frontiers in Oncology 10/2022</w:t>
       </w:r>
     </w:p>
     <w:p>
@@ -4050,6 +4160,116 @@
           <w:color w:val="000000" w:themeColor="text1"/>
         </w:rPr>
         <w:t xml:space="preserve"> Physics in Medicine and Biology 07/2019</w:t>
+      </w:r>
+    </w:p>
+    <w:p>
+      <w:pPr>
+        <w:pStyle w:val="ListParagraph"/>
+        <w:keepNext/>
+        <w:keepLines/>
+        <w:numPr>
+          <w:ilvl w:val="0"/>
+          <w:numId w:val="8"/>
+        </w:numPr>
+        <w:spacing w:after="60" w:line="240" w:lineRule="auto"/>
+        <w:rPr>
+          <w:rFonts w:ascii="Times New Roman" w:hAnsi="Times New Roman" w:cs="Times New Roman"/>
+          <w:color w:val="000000" w:themeColor="text1"/>
+        </w:rPr>
+      </w:pPr>
+      <w:r>
+        <w:rPr>
+          <w:rFonts w:ascii="Times New Roman" w:hAnsi="Times New Roman" w:cs="Times New Roman"/>
+          <w:color w:val="000000" w:themeColor="text1"/>
+        </w:rPr>
+        <w:t xml:space="preserve">Cardenas CE, Yang J, </w:t>
+      </w:r>
+      <w:r>
+        <w:rPr>
+          <w:rFonts w:ascii="Times New Roman" w:hAnsi="Times New Roman" w:cs="Times New Roman"/>
+          <w:b/>
+          <w:bCs/>
+          <w:color w:val="000000" w:themeColor="text1"/>
+        </w:rPr>
+        <w:t xml:space="preserve">Anderson B.M</w:t>
+      </w:r>
+      <w:r>
+        <w:rPr>
+          <w:rFonts w:ascii="Times New Roman" w:hAnsi="Times New Roman" w:cs="Times New Roman"/>
+          <w:color w:val="000000" w:themeColor="text1"/>
+        </w:rPr>
+        <w:t xml:space="preserve">, Court LE, Brock KK. </w:t>
+      </w:r>
+      <w:r>
+        <w:rPr>
+          <w:rFonts w:ascii="Times New Roman" w:hAnsi="Times New Roman" w:cs="Times New Roman"/>
+          <w:i/>
+          <w:iCs/>
+          <w:color w:val="000000" w:themeColor="text1"/>
+        </w:rPr>
+        <w:t xml:space="preserve">Advances in Auto-Segmentation.</w:t>
+      </w:r>
+      <w:r>
+        <w:rPr>
+          <w:rFonts w:ascii="Times New Roman" w:hAnsi="Times New Roman" w:cs="Times New Roman"/>
+          <w:color w:val="000000" w:themeColor="text1"/>
+        </w:rPr>
+        <w:t xml:space="preserve"> Seminars in Radiation Oncology 07/2019</w:t>
+      </w:r>
+    </w:p>
+    <w:p>
+      <w:pPr>
+        <w:pStyle w:val="ListParagraph"/>
+        <w:keepNext/>
+        <w:keepLines/>
+        <w:numPr>
+          <w:ilvl w:val="0"/>
+          <w:numId w:val="8"/>
+        </w:numPr>
+        <w:spacing w:after="60" w:line="240" w:lineRule="auto"/>
+        <w:rPr>
+          <w:rFonts w:ascii="Times New Roman" w:hAnsi="Times New Roman" w:cs="Times New Roman"/>
+          <w:color w:val="000000" w:themeColor="text1"/>
+        </w:rPr>
+      </w:pPr>
+      <w:r>
+        <w:rPr>
+          <w:rFonts w:ascii="Times New Roman" w:hAnsi="Times New Roman" w:cs="Times New Roman"/>
+          <w:color w:val="000000" w:themeColor="text1"/>
+        </w:rPr>
+        <w:t xml:space="preserve">Yang Z, Chang Y, Brock KK, Cazoulat G, Koay EJ, Koong AC, Herman JM, Park PC, Poenisch F, Li Q, Yang K, Wu G, </w:t>
+      </w:r>
+      <w:r>
+        <w:rPr>
+          <w:rFonts w:ascii="Times New Roman" w:hAnsi="Times New Roman" w:cs="Times New Roman"/>
+          <w:b/>
+          <w:bCs/>
+          <w:color w:val="000000" w:themeColor="text1"/>
+        </w:rPr>
+        <w:t xml:space="preserve">Anderson B.M</w:t>
+      </w:r>
+      <w:r>
+        <w:rPr>
+          <w:rFonts w:ascii="Times New Roman" w:hAnsi="Times New Roman" w:cs="Times New Roman"/>
+          <w:color w:val="000000" w:themeColor="text1"/>
+        </w:rPr>
+        <w:t xml:space="preserve">, Ohrt AN, Li Y, Zhu XR, Zhang X, Li H. </w:t>
+      </w:r>
+      <w:r>
+        <w:rPr>
+          <w:rFonts w:ascii="Times New Roman" w:hAnsi="Times New Roman" w:cs="Times New Roman"/>
+          <w:i/>
+          <w:iCs/>
+          <w:color w:val="000000" w:themeColor="text1"/>
+        </w:rPr>
+        <w:t xml:space="preserve">Effect of setup and inter-fraction anatomical changes on the accumulated dose in CT-guided breath-hold intensity modulated proton therapy of liver malignancies.</w:t>
+      </w:r>
+      <w:r>
+        <w:rPr>
+          <w:rFonts w:ascii="Times New Roman" w:hAnsi="Times New Roman" w:cs="Times New Roman"/>
+          <w:color w:val="000000" w:themeColor="text1"/>
+        </w:rPr>
+        <w:t xml:space="preserve"> Radiotherapy and Oncology 05/2019</w:t>
       </w:r>
     </w:p>
     <w:p>

</xml_diff>

<commit_message>
Fix CV citation errors found during biosketch sync
Correct journal on Gay 2023 and Covington 2024 entries (Journal of
Applied Clinical Medical Physics); replace Lancet COVER-ALL entry title
with the published title and fix three author-name typos (Habibollahi,
Morris, Kopetz); date the UNC Research Retreat honor (2025). PDF
re-exported.

Co-Authored-By: Claude Fable 5 <noreply@anthropic.com>
</commit_message>
<xml_diff>
--- a/Clincal_CV/BMAnderson CV.docx
+++ b/Clincal_CV/BMAnderson CV.docx
@@ -1502,7 +1502,7 @@
           <w:rFonts w:ascii="Times New Roman" w:hAnsi="Times New Roman" w:cs="Times New Roman"/>
           <w:color w:val="000000" w:themeColor="text1"/>
         </w:rPr>
-        <w:t xml:space="preserve"> place poster in Physics/DHE Research</w:t>
+        <w:t xml:space="preserve"> place poster in Physics/DHE Research (2025)</w:t>
       </w:r>
     </w:p>
     <w:p>
@@ -2688,7 +2688,7 @@
           <w:rFonts w:ascii="Times New Roman" w:hAnsi="Times New Roman" w:cs="Times New Roman"/>
           <w:color w:val="000000" w:themeColor="text1"/>
         </w:rPr>
-        <w:t xml:space="preserve">, O’Connor C.S, Rigaud B., Briones-Dimayuga M., Jones A.K., Fellman B.M, Huang S.Y., Kuban J., Metwalli Z. A., Sheth R., Habiboullahi P., Patel M., Shan K. Y., Cox V. L., Kang HS. C., Mooris V. K, Koptez S., Javle M.M., Kaseb A., Tzeng CW., Cao HT., Newhook T., Chun Y. S., Vauthey JN., Gupta S., Paolucci I., Brock K.K. </w:t>
+        <w:t xml:space="preserve">, O’Connor C.S, Rigaud B., Briones-Dimayuga M., Jones A.K., Fellman B.M, Huang S.Y., Kuban J., Metwalli Z. A., Sheth R., Habibollahi P., Patel M., Shan K. Y., Cox V. L., Kang HS. C., Morris V. K, Kopetz S., Javle M.M., Kaseb A., Tzeng CW., Cao HT., Newhook T., Chun Y. S., Vauthey JN., Gupta S., Paolucci I., Brock K.K. </w:t>
       </w:r>
       <w:r>
         <w:rPr>
@@ -2697,7 +2697,7 @@
           <w:iCs/>
           <w:color w:val="000000" w:themeColor="text1"/>
         </w:rPr>
-        <w:t xml:space="preserve">“Software-based versus visual assessment of minimal ablative margin in patients with liver tumours undergoing percutaneous thermal ablation (COVER-ALL): a randomized phased 2 trial.</w:t>
+        <w:t>Software-based versus visual assessment of the minimal ablative margin in patients with liver tumours undergoing percutaneous thermal ablation (COVER-ALL): a randomised controlled phase 2 trial.</w:t>
       </w:r>
       <w:r>
         <w:rPr>
@@ -2903,7 +2903,7 @@
           <w:rFonts w:ascii="Times New Roman" w:hAnsi="Times New Roman" w:cs="Times New Roman"/>
           <w:color w:val="000000" w:themeColor="text1"/>
         </w:rPr>
-        <w:t xml:space="preserve"> Radiation Oncology Physics (04/2024)</w:t>
+        <w:t xml:space="preserve"> Journal of Applied Clinical Medical Physics 06/2024</w:t>
       </w:r>
     </w:p>
     <w:p>
@@ -2961,7 +2961,7 @@
           <w:bCs/>
           <w:color w:val="000000" w:themeColor="text1"/>
         </w:rPr>
-        <w:t xml:space="preserve"> Radiation Oncology Physics 09/2023</w:t>
+        <w:t xml:space="preserve"> Journal of Applied Clinical Medical Physics 12/2023</w:t>
       </w:r>
     </w:p>
     <w:p>

</xml_diff>

<commit_message>
Nest Houston community service under MD Anderson
Service doc: Community Service — Houston, TX becomes a subsection of
MD Anderson Cancer Center. CV: UT House Medics moved up so the Houston
community entries follow the MD Anderson block. Both PDFs re-exported.

Co-Authored-By: Claude Fable 5 <noreply@anthropic.com>
</commit_message>
<xml_diff>
--- a/Clincal_CV/BMAnderson CV.docx
+++ b/Clincal_CV/BMAnderson CV.docx
@@ -1086,6 +1086,32 @@
           <w:color w:val="000000" w:themeColor="text1"/>
           <w:u w:val="single"/>
         </w:rPr>
+        <w:t xml:space="preserve">MD Anderson, UT House Medics</w:t>
+      </w:r>
+      <w:r>
+        <w:rPr>
+          <w:rFonts w:ascii="Times New Roman" w:hAnsi="Times New Roman" w:cs="Times New Roman"/>
+          <w:color w:val="000000" w:themeColor="text1"/>
+        </w:rPr>
+        <w:t>: Community outreach assisting elderly citizens with home renovation and reconstruction (2016, 2018)</w:t>
+      </w:r>
+    </w:p>
+    <w:p>
+      <w:pPr>
+        <w:keepNext/>
+        <w:keepLines/>
+        <w:spacing w:after="60" w:line="240" w:lineRule="auto"/>
+        <w:rPr>
+          <w:rFonts w:ascii="Times New Roman" w:hAnsi="Times New Roman" w:cs="Times New Roman"/>
+          <w:color w:val="000000" w:themeColor="text1"/>
+        </w:rPr>
+      </w:pPr>
+      <w:r>
+        <w:rPr>
+          <w:rFonts w:ascii="Times New Roman" w:hAnsi="Times New Roman" w:cs="Times New Roman"/>
+          <w:color w:val="000000" w:themeColor="text1"/>
+          <w:u w:val="single"/>
+        </w:rPr>
         <w:t xml:space="preserve">Houston, TX, St. Vincent de Paul Food Fair</w:t>
       </w:r>
       <w:r>
@@ -1146,32 +1172,6 @@
           <w:color w:val="000000" w:themeColor="text1"/>
         </w:rPr>
         <w:t>Assisted in the removal of drywall, floor paneling, and ruined furniture of a local home affected by Hurricane Harvey (2017)</w:t>
-      </w:r>
-    </w:p>
-    <w:p>
-      <w:pPr>
-        <w:keepNext/>
-        <w:keepLines/>
-        <w:spacing w:after="60" w:line="240" w:lineRule="auto"/>
-        <w:rPr>
-          <w:rFonts w:ascii="Times New Roman" w:hAnsi="Times New Roman" w:cs="Times New Roman"/>
-          <w:color w:val="000000" w:themeColor="text1"/>
-        </w:rPr>
-      </w:pPr>
-      <w:r>
-        <w:rPr>
-          <w:rFonts w:ascii="Times New Roman" w:hAnsi="Times New Roman" w:cs="Times New Roman"/>
-          <w:color w:val="000000" w:themeColor="text1"/>
-          <w:u w:val="single"/>
-        </w:rPr>
-        <w:t xml:space="preserve">MD Anderson, UT House Medics</w:t>
-      </w:r>
-      <w:r>
-        <w:rPr>
-          <w:rFonts w:ascii="Times New Roman" w:hAnsi="Times New Roman" w:cs="Times New Roman"/>
-          <w:color w:val="000000" w:themeColor="text1"/>
-        </w:rPr>
-        <w:t>: Community outreach assisting elderly citizens with home renovation and reconstruction (2016, 2018)</w:t>
       </w:r>
     </w:p>
     <w:p>

</xml_diff>

<commit_message>
Apply grouped layout across the CV
Professional Service Activities now mirrors the standalone service
document (org groups, date column, hanging indent; Brian's removal of
the Community Service label included). Clinical Competency, Clinical
Projects, and Research Experience grouped under bold+underline subheads
with org prefixes stripped. CLAUDE.md documents the new conventions;
both PDFs re-exported.

Co-Authored-By: Claude Fable 5 <noreply@anthropic.com>
</commit_message>
<xml_diff>
--- a/Clincal_CV/BMAnderson CV.docx
+++ b/Clincal_CV/BMAnderson CV.docx
@@ -484,6 +484,19 @@
     </w:p>
     <w:p>
       <w:pPr>
+        <w:spacing w:before="80" w:after="40"/>
+      </w:pPr>
+      <w:r>
+        <w:rPr>
+          <w:rFonts w:ascii="Times New Roman" w:hAnsi="Times New Roman"/>
+          <w:b/>
+          <w:u w:val="single"/>
+        </w:rPr>
+        <w:t>Treatment Planning &amp; Information Systems</w:t>
+      </w:r>
+    </w:p>
+    <w:p>
+      <w:pPr>
         <w:keepNext/>
         <w:keepLines/>
         <w:spacing w:after="60" w:line="240" w:lineRule="auto"/>
@@ -557,20 +570,15 @@
     </w:p>
     <w:p>
       <w:pPr>
-        <w:keepNext/>
-        <w:keepLines/>
-        <w:spacing w:after="60" w:line="240" w:lineRule="auto"/>
-        <w:rPr>
-          <w:rFonts w:ascii="Times New Roman" w:hAnsi="Times New Roman" w:cs="Times New Roman"/>
-          <w:color w:val="000000" w:themeColor="text1"/>
-        </w:rPr>
-      </w:pPr>
-      <w:r>
-        <w:rPr>
-          <w:rFonts w:ascii="Times New Roman" w:hAnsi="Times New Roman" w:cs="Times New Roman"/>
-          <w:color w:val="000000" w:themeColor="text1"/>
-        </w:rPr>
-        <w:t>LINACs:</w:t>
+        <w:spacing w:before="80" w:after="40"/>
+      </w:pPr>
+      <w:r>
+        <w:rPr>
+          <w:rFonts w:ascii="Times New Roman" w:hAnsi="Times New Roman"/>
+          <w:b/>
+          <w:u w:val="single"/>
+        </w:rPr>
+        <w:t>Linear Accelerators</w:t>
       </w:r>
     </w:p>
     <w:p>
@@ -613,6 +621,19 @@
     </w:p>
     <w:p>
       <w:pPr>
+        <w:spacing w:before="80" w:after="40"/>
+      </w:pPr>
+      <w:r>
+        <w:rPr>
+          <w:rFonts w:ascii="Times New Roman" w:hAnsi="Times New Roman"/>
+          <w:b/>
+          <w:u w:val="single"/>
+        </w:rPr>
+        <w:t>Brachytherapy</w:t>
+      </w:r>
+    </w:p>
+    <w:p>
+      <w:pPr>
         <w:keepNext/>
         <w:keepLines/>
         <w:spacing w:after="60" w:line="240" w:lineRule="auto"/>
@@ -649,24 +670,885 @@
     </w:p>
     <w:p>
       <w:pPr>
+        <w:spacing w:before="80" w:after="40"/>
+      </w:pPr>
+      <w:r>
+        <w:rPr>
+          <w:rFonts w:ascii="Times New Roman" w:hAnsi="Times New Roman"/>
+          <w:b/>
+          <w:i w:val="0"/>
+          <w:u w:val="single"/>
+        </w:rPr>
+        <w:t>American Association of Physicists in Medicine (AAPM)</w:t>
+      </w:r>
+    </w:p>
+    <w:p>
+      <w:pPr>
+        <w:spacing w:before="40" w:after="40"/>
+      </w:pPr>
+      <w:r>
+        <w:rPr>
+          <w:rFonts w:ascii="Times New Roman" w:hAnsi="Times New Roman"/>
+          <w:b w:val="0"/>
+          <w:i/>
+          <w:u w:val="single"/>
+        </w:rPr>
+        <w:t>Committees &amp; Working Groups</w:t>
+      </w:r>
+    </w:p>
+    <w:p>
+      <w:pPr>
+        <w:tabs>
+          <w:tab w:val="left" w:pos="2016"/>
+        </w:tabs>
+        <w:spacing w:after="60"/>
+        <w:ind w:left="2016" w:hanging="2016"/>
+      </w:pPr>
+      <w:r>
+        <w:rPr>
+          <w:rFonts w:ascii="Times New Roman" w:hAnsi="Times New Roman"/>
+          <w:sz w:val="22"/>
+        </w:rPr>
+        <w:t>2026 – Present</w:t>
+      </w:r>
+      <w:r>
+        <w:rPr>
+          <w:rFonts w:ascii="Times New Roman" w:hAnsi="Times New Roman"/>
+          <w:sz w:val="22"/>
+        </w:rPr>
+        <w:tab/>
+      </w:r>
+      <w:r>
+        <w:rPr>
+          <w:rFonts w:ascii="Times New Roman" w:hAnsi="Times New Roman"/>
+          <w:sz w:val="22"/>
+          <w:u w:val="single"/>
+        </w:rPr>
+        <w:t>QUANTEC 2 Working Group (Q2WG)</w:t>
+      </w:r>
+      <w:r>
+        <w:rPr>
+          <w:rFonts w:ascii="Times New Roman" w:hAnsi="Times New Roman"/>
+          <w:sz w:val="22"/>
+        </w:rPr>
+        <w:t>: Member</w:t>
+      </w:r>
+    </w:p>
+    <w:p>
+      <w:pPr>
+        <w:tabs>
+          <w:tab w:val="left" w:pos="2016"/>
+        </w:tabs>
+        <w:spacing w:after="60"/>
+        <w:ind w:left="2016" w:hanging="2016"/>
+      </w:pPr>
+      <w:r>
+        <w:rPr>
+          <w:rFonts w:ascii="Times New Roman" w:hAnsi="Times New Roman"/>
+          <w:sz w:val="22"/>
+        </w:rPr>
+        <w:t>2024 – Present</w:t>
+      </w:r>
+      <w:r>
+        <w:rPr>
+          <w:rFonts w:ascii="Times New Roman" w:hAnsi="Times New Roman"/>
+          <w:sz w:val="22"/>
+        </w:rPr>
+        <w:tab/>
+      </w:r>
+      <w:r>
+        <w:rPr>
+          <w:rFonts w:ascii="Times New Roman" w:hAnsi="Times New Roman"/>
+          <w:sz w:val="22"/>
+          <w:u w:val="single"/>
+        </w:rPr>
+        <w:t>Machine Intelligence Subcommittee (MIS)</w:t>
+      </w:r>
+      <w:r>
+        <w:rPr>
+          <w:rFonts w:ascii="Times New Roman" w:hAnsi="Times New Roman"/>
+          <w:sz w:val="22"/>
+        </w:rPr>
+        <w:t>: Member</w:t>
+      </w:r>
+    </w:p>
+    <w:p>
+      <w:pPr>
+        <w:tabs>
+          <w:tab w:val="left" w:pos="2016"/>
+        </w:tabs>
+        <w:spacing w:after="60"/>
+        <w:ind w:left="2016" w:hanging="2016"/>
+      </w:pPr>
+      <w:r>
+        <w:rPr>
+          <w:rFonts w:ascii="Times New Roman" w:hAnsi="Times New Roman"/>
+          <w:sz w:val="22"/>
+        </w:rPr>
+        <w:t>2023 – Present</w:t>
+      </w:r>
+      <w:r>
+        <w:rPr>
+          <w:rFonts w:ascii="Times New Roman" w:hAnsi="Times New Roman"/>
+          <w:sz w:val="22"/>
+        </w:rPr>
+        <w:tab/>
+      </w:r>
+      <w:r>
+        <w:rPr>
+          <w:rFonts w:ascii="Times New Roman" w:hAnsi="Times New Roman"/>
+          <w:sz w:val="22"/>
+          <w:u w:val="single"/>
+        </w:rPr>
+        <w:t>Medical Physics Board of Associate Editors (MPBAE)</w:t>
+      </w:r>
+      <w:r>
+        <w:rPr>
+          <w:rFonts w:ascii="Times New Roman" w:hAnsi="Times New Roman"/>
+          <w:sz w:val="22"/>
+        </w:rPr>
+        <w:t>: Member</w:t>
+      </w:r>
+    </w:p>
+    <w:p>
+      <w:pPr>
+        <w:tabs>
+          <w:tab w:val="left" w:pos="2016"/>
+        </w:tabs>
+        <w:spacing w:after="60"/>
+        <w:ind w:left="2016" w:hanging="2016"/>
+      </w:pPr>
+      <w:r>
+        <w:rPr>
+          <w:rFonts w:ascii="Times New Roman" w:hAnsi="Times New Roman"/>
+          <w:sz w:val="22"/>
+        </w:rPr>
+        <w:t>2021 – Present</w:t>
+      </w:r>
+      <w:r>
+        <w:rPr>
+          <w:rFonts w:ascii="Times New Roman" w:hAnsi="Times New Roman"/>
+          <w:sz w:val="22"/>
+        </w:rPr>
+        <w:tab/>
+      </w:r>
+      <w:r>
+        <w:rPr>
+          <w:rFonts w:ascii="Times New Roman" w:hAnsi="Times New Roman"/>
+          <w:sz w:val="22"/>
+          <w:u w:val="single"/>
+        </w:rPr>
+        <w:t>Task Group 263: Standardizing Nomenclatures in Radiation Oncology</w:t>
+      </w:r>
+      <w:r>
+        <w:rPr>
+          <w:rFonts w:ascii="Times New Roman" w:hAnsi="Times New Roman"/>
+          <w:sz w:val="22"/>
+        </w:rPr>
+        <w:t>: Member</w:t>
+      </w:r>
+    </w:p>
+    <w:p>
+      <w:pPr>
+        <w:spacing w:before="40" w:after="40"/>
+      </w:pPr>
+      <w:r>
+        <w:rPr>
+          <w:rFonts w:ascii="Times New Roman" w:hAnsi="Times New Roman"/>
+          <w:b w:val="0"/>
+          <w:i/>
+          <w:u w:val="single"/>
+        </w:rPr>
+        <w:t>Other Service</w:t>
+      </w:r>
+    </w:p>
+    <w:p>
+      <w:pPr>
+        <w:tabs>
+          <w:tab w:val="left" w:pos="2016"/>
+        </w:tabs>
+        <w:spacing w:after="60"/>
+        <w:ind w:left="2016" w:hanging="2016"/>
+      </w:pPr>
+      <w:r>
+        <w:rPr>
+          <w:rFonts w:ascii="Times New Roman" w:hAnsi="Times New Roman"/>
+          <w:sz w:val="22"/>
+        </w:rPr>
+        <w:t>2019</w:t>
+      </w:r>
+      <w:r>
+        <w:rPr>
+          <w:rFonts w:ascii="Times New Roman" w:hAnsi="Times New Roman"/>
+          <w:sz w:val="22"/>
+        </w:rPr>
+        <w:tab/>
+      </w:r>
+      <w:r>
+        <w:rPr>
+          <w:rFonts w:ascii="Times New Roman" w:hAnsi="Times New Roman"/>
+          <w:sz w:val="22"/>
+          <w:u w:val="single"/>
+        </w:rPr>
+        <w:t>Summer School, Teaching Assistant</w:t>
+      </w:r>
+      <w:r>
+        <w:rPr>
+          <w:rFonts w:ascii="Times New Roman" w:hAnsi="Times New Roman"/>
+          <w:sz w:val="22"/>
+        </w:rPr>
+        <w:t>: Assisted in creation, distribution, and implementation of workbooks for the annual conference</w:t>
+      </w:r>
+    </w:p>
+    <w:p>
+      <w:pPr>
+        <w:tabs>
+          <w:tab w:val="left" w:pos="2016"/>
+        </w:tabs>
+        <w:spacing w:after="60"/>
+        <w:ind w:left="2016" w:hanging="2016"/>
+      </w:pPr>
+      <w:r>
+        <w:rPr>
+          <w:rFonts w:ascii="Times New Roman" w:hAnsi="Times New Roman"/>
+          <w:sz w:val="22"/>
+        </w:rPr>
+        <w:t>2018 – 2019</w:t>
+      </w:r>
+      <w:r>
+        <w:rPr>
+          <w:rFonts w:ascii="Times New Roman" w:hAnsi="Times New Roman"/>
+          <w:sz w:val="22"/>
+        </w:rPr>
+        <w:tab/>
+      </w:r>
+      <w:r>
+        <w:rPr>
+          <w:rFonts w:ascii="Times New Roman" w:hAnsi="Times New Roman"/>
+          <w:sz w:val="22"/>
+          <w:u w:val="single"/>
+        </w:rPr>
+        <w:t>WizKids</w:t>
+      </w:r>
+      <w:r>
+        <w:rPr>
+          <w:rFonts w:ascii="Times New Roman" w:hAnsi="Times New Roman"/>
+          <w:sz w:val="22"/>
+        </w:rPr>
+        <w:t>: A STEM outreach program where we volunteer to educate local students on medical physics and other STEM opportunities, volunteered at the annual conference</w:t>
+      </w:r>
+    </w:p>
+    <w:p>
+      <w:pPr>
+        <w:tabs>
+          <w:tab w:val="left" w:pos="2016"/>
+        </w:tabs>
+        <w:spacing w:after="60"/>
+        <w:ind w:left="2016" w:hanging="2016"/>
+      </w:pPr>
+      <w:r>
+        <w:rPr>
+          <w:rFonts w:ascii="Times New Roman" w:hAnsi="Times New Roman"/>
+          <w:sz w:val="22"/>
+        </w:rPr>
+        <w:t>2015 – Present</w:t>
+      </w:r>
+      <w:r>
+        <w:rPr>
+          <w:rFonts w:ascii="Times New Roman" w:hAnsi="Times New Roman"/>
+          <w:sz w:val="22"/>
+        </w:rPr>
+        <w:tab/>
+      </w:r>
+      <w:r>
+        <w:rPr>
+          <w:rFonts w:ascii="Times New Roman" w:hAnsi="Times New Roman"/>
+          <w:sz w:val="22"/>
+          <w:u w:val="single"/>
+        </w:rPr>
+        <w:t>Member</w:t>
+      </w:r>
+    </w:p>
+    <w:p>
+      <w:pPr>
+        <w:spacing w:before="80" w:after="40"/>
+      </w:pPr>
+      <w:r>
+        <w:rPr>
+          <w:rFonts w:ascii="Times New Roman" w:hAnsi="Times New Roman"/>
+          <w:b/>
+          <w:i w:val="0"/>
+          <w:u w:val="single"/>
+        </w:rPr>
+        <w:t>Medical Physics (Journal)</w:t>
+      </w:r>
+    </w:p>
+    <w:p>
+      <w:pPr>
+        <w:tabs>
+          <w:tab w:val="left" w:pos="2016"/>
+        </w:tabs>
+        <w:spacing w:after="60"/>
+        <w:ind w:left="2016" w:hanging="2016"/>
+      </w:pPr>
+      <w:r>
+        <w:rPr>
+          <w:rFonts w:ascii="Times New Roman" w:hAnsi="Times New Roman"/>
+          <w:sz w:val="22"/>
+        </w:rPr>
+        <w:t>2023 – Present</w:t>
+      </w:r>
+      <w:r>
+        <w:rPr>
+          <w:rFonts w:ascii="Times New Roman" w:hAnsi="Times New Roman"/>
+          <w:sz w:val="22"/>
+        </w:rPr>
+        <w:tab/>
+      </w:r>
+      <w:r>
+        <w:rPr>
+          <w:rFonts w:ascii="Times New Roman" w:hAnsi="Times New Roman"/>
+          <w:sz w:val="22"/>
+          <w:u w:val="single"/>
+        </w:rPr>
+        <w:t>Associate Editor</w:t>
+      </w:r>
+    </w:p>
+    <w:p>
+      <w:pPr>
+        <w:tabs>
+          <w:tab w:val="left" w:pos="2016"/>
+        </w:tabs>
+        <w:spacing w:after="60"/>
+        <w:ind w:left="2016" w:hanging="2016"/>
+      </w:pPr>
+      <w:r>
+        <w:rPr>
+          <w:rFonts w:ascii="Times New Roman" w:hAnsi="Times New Roman"/>
+          <w:sz w:val="22"/>
+        </w:rPr>
+        <w:t>2020 – 2021</w:t>
+      </w:r>
+      <w:r>
+        <w:rPr>
+          <w:rFonts w:ascii="Times New Roman" w:hAnsi="Times New Roman"/>
+          <w:sz w:val="22"/>
+        </w:rPr>
+        <w:tab/>
+      </w:r>
+      <w:r>
+        <w:rPr>
+          <w:rFonts w:ascii="Times New Roman" w:hAnsi="Times New Roman"/>
+          <w:sz w:val="22"/>
+          <w:u w:val="single"/>
+        </w:rPr>
+        <w:t>Ad hoc Associate Editor</w:t>
+      </w:r>
+    </w:p>
+    <w:p>
+      <w:pPr>
+        <w:tabs>
+          <w:tab w:val="left" w:pos="2016"/>
+        </w:tabs>
+        <w:spacing w:after="60"/>
+        <w:ind w:left="2016" w:hanging="2016"/>
+      </w:pPr>
+      <w:r>
+        <w:rPr>
+          <w:rFonts w:ascii="Times New Roman" w:hAnsi="Times New Roman"/>
+          <w:sz w:val="22"/>
+        </w:rPr>
+        <w:t>2019 – Present</w:t>
+      </w:r>
+      <w:r>
+        <w:rPr>
+          <w:rFonts w:ascii="Times New Roman" w:hAnsi="Times New Roman"/>
+          <w:sz w:val="22"/>
+        </w:rPr>
+        <w:tab/>
+      </w:r>
+      <w:r>
+        <w:rPr>
+          <w:rFonts w:ascii="Times New Roman" w:hAnsi="Times New Roman"/>
+          <w:sz w:val="22"/>
+          <w:u w:val="single"/>
+        </w:rPr>
+        <w:t>Manuscript Reviewer</w:t>
+      </w:r>
+    </w:p>
+    <w:p>
+      <w:pPr>
+        <w:spacing w:before="80" w:after="40"/>
+      </w:pPr>
+      <w:r>
+        <w:rPr>
+          <w:rFonts w:ascii="Times New Roman" w:hAnsi="Times New Roman"/>
+          <w:b/>
+          <w:i w:val="0"/>
+          <w:u w:val="single"/>
+        </w:rPr>
+        <w:t>University of California, San Diego</w:t>
+      </w:r>
+    </w:p>
+    <w:p>
+      <w:pPr>
+        <w:spacing w:before="40" w:after="40"/>
+      </w:pPr>
+      <w:r>
+        <w:rPr>
+          <w:rFonts w:ascii="Times New Roman" w:hAnsi="Times New Roman"/>
+          <w:b w:val="0"/>
+          <w:i/>
+          <w:u w:val="single"/>
+        </w:rPr>
+        <w:t>Departmental Leadership</w:t>
+      </w:r>
+    </w:p>
+    <w:p>
+      <w:pPr>
+        <w:tabs>
+          <w:tab w:val="left" w:pos="2016"/>
+        </w:tabs>
+        <w:spacing w:after="60"/>
+        <w:ind w:left="2016" w:hanging="2016"/>
+      </w:pPr>
+      <w:r>
+        <w:rPr>
+          <w:rFonts w:ascii="Times New Roman" w:hAnsi="Times New Roman"/>
+          <w:sz w:val="22"/>
+        </w:rPr>
+        <w:t>2025 – Present</w:t>
+      </w:r>
+      <w:r>
+        <w:rPr>
+          <w:rFonts w:ascii="Times New Roman" w:hAnsi="Times New Roman"/>
+          <w:sz w:val="22"/>
+        </w:rPr>
+        <w:tab/>
+      </w:r>
+      <w:r>
+        <w:rPr>
+          <w:rFonts w:ascii="Times New Roman" w:hAnsi="Times New Roman"/>
+          <w:sz w:val="22"/>
+          <w:u w:val="single"/>
+        </w:rPr>
+        <w:t>Chair of Technical Innovation and Implementation</w:t>
+      </w:r>
+      <w:r>
+        <w:rPr>
+          <w:rFonts w:ascii="Times New Roman" w:hAnsi="Times New Roman"/>
+          <w:sz w:val="22"/>
+        </w:rPr>
+        <w:t>: Departmental lead for in-house software development, clinical deployment standards, and validation of clinical-facing tools, Department of Radiation Medicine &amp; Applied Sciences</w:t>
+      </w:r>
+    </w:p>
+    <w:p>
+      <w:pPr>
+        <w:tabs>
+          <w:tab w:val="left" w:pos="2016"/>
+        </w:tabs>
+        <w:spacing w:after="60"/>
+        <w:ind w:left="2016" w:hanging="2016"/>
+      </w:pPr>
+      <w:r>
+        <w:rPr>
+          <w:rFonts w:ascii="Times New Roman" w:hAnsi="Times New Roman"/>
+          <w:sz w:val="22"/>
+        </w:rPr>
+        <w:t>2025 – Present</w:t>
+      </w:r>
+      <w:r>
+        <w:rPr>
+          <w:rFonts w:ascii="Times New Roman" w:hAnsi="Times New Roman"/>
+          <w:sz w:val="22"/>
+        </w:rPr>
+        <w:tab/>
+      </w:r>
+      <w:r>
+        <w:rPr>
+          <w:rFonts w:ascii="Times New Roman" w:hAnsi="Times New Roman"/>
+          <w:sz w:val="22"/>
+          <w:u w:val="single"/>
+        </w:rPr>
+        <w:t>Technical Service Chief, Central Nervous System</w:t>
+      </w:r>
+      <w:r>
+        <w:rPr>
+          <w:rFonts w:ascii="Times New Roman" w:hAnsi="Times New Roman"/>
+          <w:sz w:val="22"/>
+        </w:rPr>
+        <w:t>: Physics lead for the CNS disease site; authored the departmental CNS Standards and Guidelines defining site-specific treatment protocols, critical structure nomenclature, and dose constraints</w:t>
+      </w:r>
+    </w:p>
+    <w:p>
+      <w:pPr>
+        <w:spacing w:before="80" w:after="40"/>
+      </w:pPr>
+      <w:r>
+        <w:rPr>
+          <w:rFonts w:ascii="Times New Roman" w:hAnsi="Times New Roman"/>
+          <w:b/>
+          <w:i w:val="0"/>
+          <w:u w:val="single"/>
+        </w:rPr>
+        <w:t>Medical Physicists for World Benefit (MPWB)</w:t>
+      </w:r>
+    </w:p>
+    <w:p>
+      <w:pPr>
+        <w:tabs>
+          <w:tab w:val="left" w:pos="2016"/>
+        </w:tabs>
+        <w:spacing w:after="60"/>
+        <w:ind w:left="2016" w:hanging="2016"/>
+      </w:pPr>
+      <w:r>
+        <w:rPr>
+          <w:rFonts w:ascii="Times New Roman" w:hAnsi="Times New Roman"/>
+          <w:sz w:val="22"/>
+        </w:rPr>
+        <w:t>2017 – Present</w:t>
+      </w:r>
+      <w:r>
+        <w:rPr>
+          <w:rFonts w:ascii="Times New Roman" w:hAnsi="Times New Roman"/>
+          <w:sz w:val="22"/>
+        </w:rPr>
+        <w:tab/>
+      </w:r>
+      <w:r>
+        <w:rPr>
+          <w:rFonts w:ascii="Times New Roman" w:hAnsi="Times New Roman"/>
+          <w:sz w:val="22"/>
+          <w:u w:val="single"/>
+        </w:rPr>
+        <w:t>Member</w:t>
+      </w:r>
+    </w:p>
+    <w:p>
+      <w:pPr>
+        <w:spacing w:before="80" w:after="40"/>
+      </w:pPr>
+      <w:r>
+        <w:rPr>
+          <w:rFonts w:ascii="Times New Roman" w:hAnsi="Times New Roman"/>
+          <w:b/>
+          <w:i w:val="0"/>
+          <w:u w:val="single"/>
+        </w:rPr>
+        <w:t>MD Anderson Cancer Center</w:t>
+      </w:r>
+    </w:p>
+    <w:p>
+      <w:pPr>
+        <w:tabs>
+          <w:tab w:val="left" w:pos="2016"/>
+        </w:tabs>
+        <w:spacing w:after="60"/>
+        <w:ind w:left="2016" w:hanging="2016"/>
+      </w:pPr>
+      <w:r>
+        <w:rPr>
+          <w:rFonts w:ascii="Times New Roman" w:hAnsi="Times New Roman"/>
+          <w:sz w:val="22"/>
+        </w:rPr>
+        <w:t>2019 – 2021</w:t>
+      </w:r>
+      <w:r>
+        <w:rPr>
+          <w:rFonts w:ascii="Times New Roman" w:hAnsi="Times New Roman"/>
+          <w:sz w:val="22"/>
+        </w:rPr>
+        <w:tab/>
+      </w:r>
+      <w:r>
+        <w:rPr>
+          <w:rFonts w:ascii="Times New Roman" w:hAnsi="Times New Roman"/>
+          <w:sz w:val="22"/>
+          <w:u w:val="single"/>
+        </w:rPr>
+        <w:t>International Students Association (ISA)</w:t>
+      </w:r>
+      <w:r>
+        <w:rPr>
+          <w:rFonts w:ascii="Times New Roman" w:hAnsi="Times New Roman"/>
+          <w:sz w:val="22"/>
+        </w:rPr>
+        <w:t>: Founding member of the organization as domestic liaison with the Graduate School of Biomedical Sciences. Goal being to best help international students with any problems they might have in the transition to the US (opening bank account, etc.)</w:t>
+      </w:r>
+    </w:p>
+    <w:p>
+      <w:pPr>
+        <w:tabs>
+          <w:tab w:val="left" w:pos="2016"/>
+        </w:tabs>
+        <w:spacing w:after="60"/>
+        <w:ind w:left="2016" w:hanging="2016"/>
+      </w:pPr>
+      <w:r>
+        <w:rPr>
+          <w:rFonts w:ascii="Times New Roman" w:hAnsi="Times New Roman"/>
+          <w:sz w:val="22"/>
+        </w:rPr>
+        <w:lastRenderedPageBreak/>
+        <w:t>2017 – 2019</w:t>
+      </w:r>
+      <w:r>
+        <w:rPr>
+          <w:rFonts w:ascii="Times New Roman" w:hAnsi="Times New Roman"/>
+          <w:sz w:val="22"/>
+        </w:rPr>
+        <w:tab/>
+      </w:r>
+      <w:r>
+        <w:rPr>
+          <w:rFonts w:ascii="Times New Roman" w:hAnsi="Times New Roman"/>
+          <w:sz w:val="22"/>
+          <w:u w:val="single"/>
+        </w:rPr>
+        <w:t>Science Night</w:t>
+      </w:r>
+      <w:r>
+        <w:rPr>
+          <w:rFonts w:ascii="Times New Roman" w:hAnsi="Times New Roman"/>
+          <w:sz w:val="22"/>
+        </w:rPr>
+        <w:t>: An outreach program to educate children of all ages on opportunities and research in STEM occurring in UTH. Involves creating fun interactive stages to educate the students.</w:t>
+      </w:r>
+    </w:p>
+    <w:p>
+      <w:pPr>
+        <w:tabs>
+          <w:tab w:val="left" w:pos="2016"/>
+        </w:tabs>
+        <w:spacing w:after="60"/>
+        <w:ind w:left="2016" w:hanging="2016"/>
+      </w:pPr>
+      <w:r>
+        <w:rPr>
+          <w:rFonts w:ascii="Times New Roman" w:hAnsi="Times New Roman"/>
+          <w:sz w:val="22"/>
+        </w:rPr>
+        <w:t>2016, 2018</w:t>
+      </w:r>
+      <w:r>
+        <w:rPr>
+          <w:rFonts w:ascii="Times New Roman" w:hAnsi="Times New Roman"/>
+          <w:sz w:val="22"/>
+        </w:rPr>
+        <w:tab/>
+      </w:r>
+      <w:r>
+        <w:rPr>
+          <w:rFonts w:ascii="Times New Roman" w:hAnsi="Times New Roman"/>
+          <w:sz w:val="22"/>
+          <w:u w:val="single"/>
+        </w:rPr>
+        <w:t>UT House Medics</w:t>
+      </w:r>
+      <w:r>
+        <w:rPr>
+          <w:rFonts w:ascii="Times New Roman" w:hAnsi="Times New Roman"/>
+          <w:sz w:val="22"/>
+        </w:rPr>
+        <w:t>: Community outreach assisting elderly citizens with home renovation and reconstruction</w:t>
+      </w:r>
+    </w:p>
+    <w:p>
+      <w:pPr>
+        <w:tabs>
+          <w:tab w:val="left" w:pos="2016"/>
+        </w:tabs>
+        <w:spacing w:after="60"/>
+        <w:ind w:left="2016" w:hanging="2016"/>
+      </w:pPr>
+      <w:r>
+        <w:rPr>
+          <w:rFonts w:ascii="Times New Roman" w:hAnsi="Times New Roman"/>
+          <w:sz w:val="22"/>
+        </w:rPr>
+        <w:t>2018</w:t>
+      </w:r>
+      <w:r>
+        <w:rPr>
+          <w:rFonts w:ascii="Times New Roman" w:hAnsi="Times New Roman"/>
+          <w:sz w:val="22"/>
+        </w:rPr>
+        <w:tab/>
+      </w:r>
+      <w:r>
+        <w:rPr>
+          <w:rFonts w:ascii="Times New Roman" w:hAnsi="Times New Roman"/>
+          <w:sz w:val="22"/>
+          <w:u w:val="single"/>
+        </w:rPr>
+        <w:t>St. Vincent de Paul Food Fair</w:t>
+      </w:r>
+      <w:r>
+        <w:rPr>
+          <w:rFonts w:ascii="Times New Roman" w:hAnsi="Times New Roman"/>
+          <w:sz w:val="22"/>
+        </w:rPr>
+        <w:t>: Volunteering in organization and distribution of food to families in need with St. Vincent de Paul</w:t>
+      </w:r>
+    </w:p>
+    <w:p>
+      <w:pPr>
+        <w:tabs>
+          <w:tab w:val="left" w:pos="2016"/>
+        </w:tabs>
+        <w:spacing w:after="60"/>
+        <w:ind w:left="2016" w:hanging="2016"/>
+      </w:pPr>
+      <w:r>
+        <w:rPr>
+          <w:rFonts w:ascii="Times New Roman" w:hAnsi="Times New Roman"/>
+          <w:sz w:val="22"/>
+        </w:rPr>
+        <w:t>2017 – 2019</w:t>
+      </w:r>
+      <w:r>
+        <w:rPr>
+          <w:rFonts w:ascii="Times New Roman" w:hAnsi="Times New Roman"/>
+          <w:sz w:val="22"/>
+        </w:rPr>
+        <w:tab/>
+      </w:r>
+      <w:r>
+        <w:rPr>
+          <w:rFonts w:ascii="Times New Roman" w:hAnsi="Times New Roman"/>
+          <w:sz w:val="22"/>
+          <w:u w:val="single"/>
+        </w:rPr>
+        <w:t>Friends for Life Animal Shelter</w:t>
+      </w:r>
+      <w:r>
+        <w:rPr>
+          <w:rFonts w:ascii="Times New Roman" w:hAnsi="Times New Roman"/>
+          <w:sz w:val="22"/>
+        </w:rPr>
+        <w:t>: +20 hours spent volunteering in an animal shelter</w:t>
+      </w:r>
+    </w:p>
+    <w:p>
+      <w:pPr>
+        <w:tabs>
+          <w:tab w:val="left" w:pos="2016"/>
+        </w:tabs>
+        <w:spacing w:after="60"/>
+        <w:ind w:left="2016" w:hanging="2016"/>
+      </w:pPr>
+      <w:r>
+        <w:rPr>
+          <w:rFonts w:ascii="Times New Roman" w:hAnsi="Times New Roman"/>
+          <w:sz w:val="22"/>
+        </w:rPr>
+        <w:t>2017</w:t>
+      </w:r>
+      <w:r>
+        <w:rPr>
+          <w:rFonts w:ascii="Times New Roman" w:hAnsi="Times New Roman"/>
+          <w:sz w:val="22"/>
+        </w:rPr>
+        <w:tab/>
+      </w:r>
+      <w:r>
+        <w:rPr>
+          <w:rFonts w:ascii="Times New Roman" w:hAnsi="Times New Roman"/>
+          <w:sz w:val="22"/>
+          <w:u w:val="single"/>
+        </w:rPr>
+        <w:t>Hurricane Harvey Relief</w:t>
+      </w:r>
+      <w:r>
+        <w:rPr>
+          <w:rFonts w:ascii="Times New Roman" w:hAnsi="Times New Roman"/>
+          <w:sz w:val="22"/>
+        </w:rPr>
+        <w:t>: Assisted in the removal of drywall, floor paneling, and ruined furniture of a local home affected by Hurricane Harvey</w:t>
+      </w:r>
+    </w:p>
+    <w:p>
+      <w:pPr>
+        <w:pStyle w:val="Heading1"/>
+        <w:keepLines/>
+        <w:spacing w:after="120"/>
+        <w:rPr>
+          <w:rFonts w:cs="Times New Roman"/>
+          <w:color w:val="000000" w:themeColor="text1"/>
+        </w:rPr>
+      </w:pPr>
+      <w:r>
+        <w:rPr>
+          <w:rFonts w:cs="Times New Roman"/>
+          <w:color w:val="000000" w:themeColor="text1"/>
+        </w:rPr>
+        <w:t xml:space="preserve">Clinical Projects and Responsibilities</w:t>
+      </w:r>
+    </w:p>
+    <w:p>
+      <w:pPr>
+        <w:spacing w:before="80" w:after="40"/>
+      </w:pPr>
+      <w:r>
+        <w:rPr>
+          <w:rFonts w:ascii="Times New Roman" w:hAnsi="Times New Roman"/>
+          <w:b/>
+          <w:u w:val="single"/>
+        </w:rPr>
+        <w:t>University of California, San Diego</w:t>
+      </w:r>
+    </w:p>
+    <w:p>
+      <w:pPr>
         <w:keepNext/>
         <w:keepLines/>
         <w:spacing w:after="60" w:line="240" w:lineRule="auto"/>
         <w:rPr>
           <w:rFonts w:ascii="Times New Roman" w:hAnsi="Times New Roman" w:cs="Times New Roman"/>
-          <w:bCs/>
+          <w:color w:val="000000" w:themeColor="text1"/>
+        </w:rPr>
+      </w:pPr>
+      <w:r>
+        <w:rPr>
+          <w:rFonts w:ascii="Times New Roman" w:hAnsi="Times New Roman" w:cs="Times New Roman"/>
           <w:color w:val="000000" w:themeColor="text1"/>
           <w:u w:val="single"/>
         </w:rPr>
-      </w:pPr>
-      <w:r>
-        <w:rPr>
-          <w:rFonts w:ascii="Times New Roman" w:hAnsi="Times New Roman" w:cs="Times New Roman"/>
-          <w:bCs/>
+        <w:t>Web Suite Notification System:</w:t>
+      </w:r>
+      <w:r>
+        <w:rPr>
+          <w:rFonts w:ascii="Times New Roman" w:hAnsi="Times New Roman" w:cs="Times New Roman"/>
+          <w:color w:val="000000" w:themeColor="text1"/>
+        </w:rPr>
+        <w:t xml:space="preserve"> Developed and deployed a monitoring system for radiation oncology patients. This will automatically notify dosimetrists, physicians, and clinical chiefs about patients falling behind schedule or missing essential care tasks.</w:t>
+      </w:r>
+    </w:p>
+    <w:p>
+      <w:pPr>
+        <w:keepNext/>
+        <w:keepLines/>
+        <w:spacing w:after="60" w:line="240" w:lineRule="auto"/>
+        <w:rPr>
+          <w:rFonts w:ascii="Times New Roman" w:hAnsi="Times New Roman" w:cs="Times New Roman"/>
+          <w:color w:val="000000" w:themeColor="text1"/>
+        </w:rPr>
+      </w:pPr>
+      <w:r>
+        <w:rPr>
+          <w:rFonts w:ascii="Times New Roman" w:hAnsi="Times New Roman" w:cs="Times New Roman"/>
           <w:color w:val="000000" w:themeColor="text1"/>
           <w:u w:val="single"/>
         </w:rPr>
-        <w:t xml:space="preserve">Editor/Service on Editorial Board(s): </w:t>
+        <w:t>Chief Resident:</w:t>
+      </w:r>
+      <w:r>
+        <w:rPr>
+          <w:rFonts w:ascii="Times New Roman" w:hAnsi="Times New Roman" w:cs="Times New Roman"/>
+          <w:color w:val="000000" w:themeColor="text1"/>
+        </w:rPr>
+        <w:t xml:space="preserve"> Responsible for the scheduling of resident clinical responsibilities, coordinating with faculty for resident education, and participate in ongoing Quality and Safety meetings. Presenting to hospital and faculty.</w:t>
       </w:r>
     </w:p>
     <w:p>
@@ -683,8 +1565,16 @@
         <w:rPr>
           <w:rFonts w:ascii="Times New Roman" w:hAnsi="Times New Roman" w:cs="Times New Roman"/>
           <w:color w:val="000000" w:themeColor="text1"/>
-        </w:rPr>
-        <w:t>Associate Editor: The International Journal of Medical Physics Research and Practice (2023-Present)</w:t>
+          <w:u w:val="single"/>
+        </w:rPr>
+        <w:t>VMAT Breast Rapid Plan:</w:t>
+      </w:r>
+      <w:r>
+        <w:rPr>
+          <w:rFonts w:ascii="Times New Roman" w:hAnsi="Times New Roman" w:cs="Times New Roman"/>
+          <w:color w:val="000000" w:themeColor="text1"/>
+        </w:rPr>
+        <w:t xml:space="preserve"> Creation of a knowledge-based rapid plan model for VMAT breast, including the creation of data-mining program within Eclipse.</w:t>
       </w:r>
     </w:p>
     <w:p>
@@ -701,23 +1591,16 @@
         <w:rPr>
           <w:rFonts w:ascii="Times New Roman" w:hAnsi="Times New Roman" w:cs="Times New Roman"/>
           <w:color w:val="000000" w:themeColor="text1"/>
-        </w:rPr>
-        <w:t xml:space="preserve">Ad hoc Associate Editor</w:t>
-      </w:r>
-      <w:r>
-        <w:rPr>
-          <w:rFonts w:ascii="Times New Roman" w:hAnsi="Times New Roman" w:cs="Times New Roman"/>
-          <w:b/>
-          <w:color w:val="000000" w:themeColor="text1"/>
-        </w:rPr>
-        <w:t xml:space="preserve">, </w:t>
-      </w:r>
-      <w:r>
-        <w:rPr>
-          <w:rFonts w:ascii="Times New Roman" w:hAnsi="Times New Roman" w:cs="Times New Roman"/>
-          <w:color w:val="000000" w:themeColor="text1"/>
-        </w:rPr>
-        <w:t>The International Journal of Medical Physics Research and Practice (2020-2021)</w:t>
+          <w:u w:val="single"/>
+        </w:rPr>
+        <w:t>Brachytherapy sterilization kit program</w:t>
+      </w:r>
+      <w:r>
+        <w:rPr>
+          <w:rFonts w:ascii="Times New Roman" w:hAnsi="Times New Roman" w:cs="Times New Roman"/>
+          <w:color w:val="000000" w:themeColor="text1"/>
+        </w:rPr>
+        <w:t xml:space="preserve">: Created a program to record and notify when sterilization was required in the brachytherapy suite. Tool has successfully replaced previous paper system since 2021.</w:t>
       </w:r>
     </w:p>
     <w:p>
@@ -733,25 +1616,24 @@
       <w:r>
         <w:rPr>
           <w:rFonts w:ascii="Times New Roman" w:hAnsi="Times New Roman" w:cs="Times New Roman"/>
-          <w:bCs/>
           <w:color w:val="000000" w:themeColor="text1"/>
           <w:u w:val="single"/>
         </w:rPr>
-        <w:t xml:space="preserve">Journal Reviewer: </w:t>
-      </w:r>
-      <w:r>
-        <w:rPr>
-          <w:rFonts w:ascii="Times New Roman" w:hAnsi="Times New Roman" w:cs="Times New Roman"/>
-          <w:color w:val="000000" w:themeColor="text1"/>
-        </w:rPr>
-        <w:t>Manuscript Reviewer, The International Journal of Medical Physics Research and Practice (2019-present)</w:t>
-      </w:r>
-    </w:p>
-    <w:p>
-      <w:pPr>
-        <w:keepNext/>
-        <w:keepLines/>
-        <w:spacing w:after="120" w:line="240" w:lineRule="auto"/>
+        <w:t>DICOM transfer server:</w:t>
+      </w:r>
+      <w:r>
+        <w:rPr>
+          <w:rFonts w:ascii="Times New Roman" w:hAnsi="Times New Roman" w:cs="Times New Roman"/>
+          <w:color w:val="000000" w:themeColor="text1"/>
+        </w:rPr>
+        <w:t xml:space="preserve"> DICOM server created to seamlessly transfer between the Ethos TPS and AlignRT.</w:t>
+      </w:r>
+    </w:p>
+    <w:p>
+      <w:pPr>
+        <w:keepNext/>
+        <w:keepLines/>
+        <w:spacing w:after="60" w:line="240" w:lineRule="auto"/>
         <w:rPr>
           <w:rFonts w:ascii="Times New Roman" w:hAnsi="Times New Roman" w:cs="Times New Roman"/>
           <w:color w:val="000000" w:themeColor="text1"/>
@@ -763,21 +1645,21 @@
           <w:color w:val="000000" w:themeColor="text1"/>
           <w:u w:val="single"/>
         </w:rPr>
-        <w:t>American Association of Physicists in Medicine (AAPM)</w:t>
-      </w:r>
-      <w:r>
-        <w:rPr>
-          <w:rFonts w:ascii="Times New Roman" w:hAnsi="Times New Roman" w:cs="Times New Roman"/>
-          <w:color w:val="000000" w:themeColor="text1"/>
-        </w:rPr>
-        <w:t>: Member 2015-Present</w:t>
-      </w:r>
-    </w:p>
-    <w:p>
-      <w:pPr>
-        <w:keepNext/>
-        <w:keepLines/>
-        <w:spacing w:after="120" w:line="240" w:lineRule="auto"/>
+        <w:t>MR DICOM tool</w:t>
+      </w:r>
+      <w:r>
+        <w:rPr>
+          <w:rFonts w:ascii="Times New Roman" w:hAnsi="Times New Roman" w:cs="Times New Roman"/>
+          <w:color w:val="000000" w:themeColor="text1"/>
+        </w:rPr>
+        <w:t>: Inherent frames of reference are needed to be broken prior to registration of MR and CT images in the UCSD clinic. This tool automatically breaks the inherent registration among the MR images in an efficient manner, saving time and reducing likelihood of errors in renaming process.</w:t>
+      </w:r>
+    </w:p>
+    <w:p>
+      <w:pPr>
+        <w:keepNext/>
+        <w:keepLines/>
+        <w:spacing w:after="60" w:line="240" w:lineRule="auto"/>
         <w:rPr>
           <w:rFonts w:ascii="Times New Roman" w:hAnsi="Times New Roman" w:cs="Times New Roman"/>
           <w:color w:val="000000" w:themeColor="text1"/>
@@ -789,47 +1671,34 @@
           <w:color w:val="000000" w:themeColor="text1"/>
           <w:u w:val="single"/>
         </w:rPr>
-        <w:t xml:space="preserve">AAPM Machine Intelligence Subcommittee (MIS): </w:t>
-      </w:r>
-      <w:r>
-        <w:rPr>
-          <w:rFonts w:ascii="Times New Roman" w:hAnsi="Times New Roman" w:cs="Times New Roman"/>
-          <w:color w:val="000000" w:themeColor="text1"/>
-        </w:rPr>
-        <w:t>Member 2024-Present</w:t>
-      </w:r>
-    </w:p>
-    <w:p>
-      <w:pPr>
-        <w:keepNext/>
-        <w:keepLines/>
-        <w:spacing w:after="120" w:line="240" w:lineRule="auto"/>
-        <w:rPr>
-          <w:rFonts w:ascii="Times New Roman" w:hAnsi="Times New Roman" w:cs="Times New Roman"/>
-          <w:color w:val="000000" w:themeColor="text1"/>
-        </w:rPr>
-      </w:pPr>
-      <w:r>
-        <w:rPr>
-          <w:rFonts w:ascii="Times New Roman" w:hAnsi="Times New Roman" w:cs="Times New Roman"/>
-          <w:color w:val="000000" w:themeColor="text1"/>
+        <w:t>PDF Creator:</w:t>
+      </w:r>
+      <w:r>
+        <w:rPr>
+          <w:rFonts w:ascii="Times New Roman" w:hAnsi="Times New Roman" w:cs="Times New Roman"/>
+          <w:color w:val="000000" w:themeColor="text1"/>
+        </w:rPr>
+        <w:t xml:space="preserve"> PDF creation automatically generated via stand-alone server. Enabled automatic uploading of the generated plan PDFs from brachytherapy procedures, streamlining the process and reducing potential for errors.</w:t>
+      </w:r>
+    </w:p>
+    <w:p>
+      <w:pPr>
+        <w:spacing w:before="80" w:after="40"/>
+      </w:pPr>
+      <w:r>
+        <w:rPr>
+          <w:rFonts w:ascii="Times New Roman" w:hAnsi="Times New Roman"/>
+          <w:b/>
           <w:u w:val="single"/>
         </w:rPr>
-        <w:t xml:space="preserve">AAPM Medical Physics Board of Associate Editors (MPBAE):</w:t>
-      </w:r>
-      <w:r>
-        <w:rPr>
-          <w:rFonts w:ascii="Times New Roman" w:hAnsi="Times New Roman" w:cs="Times New Roman"/>
-          <w:color w:val="000000" w:themeColor="text1"/>
-        </w:rPr>
-        <w:t xml:space="preserve"> Member 2023-Present</w:t>
-      </w:r>
-    </w:p>
-    <w:p>
-      <w:pPr>
-        <w:keepNext/>
-        <w:keepLines/>
-        <w:spacing w:after="120" w:line="240" w:lineRule="auto"/>
+        <w:t>University of North Carolina, Chapel Hill</w:t>
+      </w:r>
+    </w:p>
+    <w:p>
+      <w:pPr>
+        <w:keepNext/>
+        <w:keepLines/>
+        <w:spacing w:after="60" w:line="240" w:lineRule="auto"/>
         <w:rPr>
           <w:rFonts w:ascii="Times New Roman" w:hAnsi="Times New Roman" w:cs="Times New Roman"/>
           <w:color w:val="000000" w:themeColor="text1"/>
@@ -841,14 +1710,14 @@
           <w:color w:val="000000" w:themeColor="text1"/>
           <w:u w:val="single"/>
         </w:rPr>
-        <w:t>AAPM QUANTEC 2 Working Group (Q2WG):</w:t>
-      </w:r>
-      <w:r>
-        <w:rPr>
-          <w:rFonts w:ascii="Times New Roman" w:hAnsi="Times New Roman" w:cs="Times New Roman"/>
-          <w:color w:val="000000" w:themeColor="text1"/>
-        </w:rPr>
-        <w:t xml:space="preserve"> Member 2026 - Present</w:t>
+        <w:t>Brachytherapy Equipment tracking:</w:t>
+      </w:r>
+      <w:r>
+        <w:rPr>
+          <w:rFonts w:ascii="Times New Roman" w:hAnsi="Times New Roman" w:cs="Times New Roman"/>
+          <w:color w:val="000000" w:themeColor="text1"/>
+        </w:rPr>
+        <w:t xml:space="preserve"> Deployed a personally created inventory program to record and notify when brachytherapy supplies need reordering.</w:t>
       </w:r>
     </w:p>
     <w:p>
@@ -864,19 +1733,17 @@
       <w:r>
         <w:rPr>
           <w:rFonts w:ascii="Times New Roman" w:hAnsi="Times New Roman" w:cs="Times New Roman"/>
-          <w:bCs/>
           <w:color w:val="000000" w:themeColor="text1"/>
           <w:u w:val="single"/>
         </w:rPr>
-        <w:t>AAPM Task Group 263: Standardizing Nomenclatures in Radiation Oncology:</w:t>
-      </w:r>
-      <w:r>
-        <w:rPr>
-          <w:rFonts w:ascii="Times New Roman" w:hAnsi="Times New Roman" w:cs="Times New Roman"/>
-          <w:bCs/>
-          <w:color w:val="000000" w:themeColor="text1"/>
-        </w:rPr>
-        <w:t xml:space="preserve"> Member 2021-Present</w:t>
+        <w:t>DICOM Manipulation Tools:</w:t>
+      </w:r>
+      <w:r>
+        <w:rPr>
+          <w:rFonts w:ascii="Times New Roman" w:hAnsi="Times New Roman" w:cs="Times New Roman"/>
+          <w:color w:val="000000" w:themeColor="text1"/>
+        </w:rPr>
+        <w:t xml:space="preserve"> Stand-alone GUI for changing frame of reference and series instance UIDs. Useful for registering previously inherently defined images (4D-CT and free-breathing, MRIs).</w:t>
       </w:r>
     </w:p>
     <w:p>
@@ -895,399 +1762,7 @@
           <w:color w:val="000000" w:themeColor="text1"/>
           <w:u w:val="single"/>
         </w:rPr>
-        <w:t>UCSD, Chair of Technical Innovation and Implementation:</w:t>
-      </w:r>
-      <w:r>
-        <w:rPr>
-          <w:rFonts w:ascii="Times New Roman" w:hAnsi="Times New Roman" w:cs="Times New Roman"/>
-          <w:color w:val="000000" w:themeColor="text1"/>
-        </w:rPr>
-        <w:t xml:space="preserve"> Departmental lead for in-house software development, clinical deployment standards, and validation of clinical-facing tools, Department of Radiation Medicine &amp; Applied Sciences (2025–Present)</w:t>
-      </w:r>
-    </w:p>
-    <w:p>
-      <w:pPr>
-        <w:keepNext/>
-        <w:keepLines/>
-        <w:spacing w:after="60" w:line="240" w:lineRule="auto"/>
-        <w:rPr>
-          <w:rFonts w:ascii="Times New Roman" w:hAnsi="Times New Roman" w:cs="Times New Roman"/>
-          <w:color w:val="000000" w:themeColor="text1"/>
-        </w:rPr>
-      </w:pPr>
-      <w:r>
-        <w:rPr>
-          <w:rFonts w:ascii="Times New Roman" w:hAnsi="Times New Roman" w:cs="Times New Roman"/>
-          <w:color w:val="000000" w:themeColor="text1"/>
-          <w:u w:val="single"/>
-        </w:rPr>
-        <w:t>UCSD, Technical Service Chief, Central Nervous System:</w:t>
-      </w:r>
-      <w:r>
-        <w:rPr>
-          <w:rFonts w:ascii="Times New Roman" w:hAnsi="Times New Roman" w:cs="Times New Roman"/>
-          <w:color w:val="000000" w:themeColor="text1"/>
-        </w:rPr>
-        <w:t xml:space="preserve"> Physics lead for the CNS disease site; authored the departmental CNS Standards and Guidelines defining site-specific treatment protocols, critical structure nomenclature, and dose constraints (2025–Present)</w:t>
-      </w:r>
-      <w:r>
-        <w:rPr>
-          <w:rFonts w:ascii="Times New Roman" w:hAnsi="Times New Roman" w:cs="Times New Roman"/>
-          <w:bCs/>
-          <w:color w:val="000000" w:themeColor="text1"/>
-          <w:u w:val="single"/>
-        </w:rPr>
-        <w:t xml:space="preserve"> </w:t>
-      </w:r>
-    </w:p>
-    <w:p>
-      <w:pPr>
-        <w:keepNext/>
-        <w:keepLines/>
-        <w:spacing w:after="120" w:line="240" w:lineRule="auto"/>
-        <w:rPr>
-          <w:rFonts w:ascii="Times New Roman" w:hAnsi="Times New Roman" w:cs="Times New Roman"/>
-          <w:color w:val="000000" w:themeColor="text1"/>
-        </w:rPr>
-      </w:pPr>
-      <w:r>
-        <w:rPr>
-          <w:rFonts w:ascii="Times New Roman" w:hAnsi="Times New Roman" w:cs="Times New Roman"/>
-          <w:color w:val="000000" w:themeColor="text1"/>
-          <w:u w:val="single"/>
-        </w:rPr>
-        <w:t xml:space="preserve">Medical Physicists for World Benefit (MPWB)</w:t>
-      </w:r>
-      <w:r>
-        <w:rPr>
-          <w:rFonts w:ascii="Times New Roman" w:hAnsi="Times New Roman" w:cs="Times New Roman"/>
-          <w:color w:val="000000" w:themeColor="text1"/>
-        </w:rPr>
-        <w:t>: Member 2017-Present</w:t>
-      </w:r>
-    </w:p>
-    <w:p>
-      <w:pPr>
-        <w:keepNext/>
-        <w:keepLines/>
-        <w:spacing w:after="60"/>
-        <w:rPr>
-          <w:rFonts w:ascii="Times New Roman" w:hAnsi="Times New Roman" w:cs="Times New Roman"/>
-          <w:color w:val="000000" w:themeColor="text1"/>
-        </w:rPr>
-      </w:pPr>
-      <w:r>
-        <w:rPr>
-          <w:rFonts w:ascii="Times New Roman" w:hAnsi="Times New Roman" w:cs="Times New Roman"/>
-          <w:color w:val="000000" w:themeColor="text1"/>
-          <w:u w:val="single"/>
-        </w:rPr>
-        <w:t xml:space="preserve">AAPM, Summer School, Teaching Assistant</w:t>
-      </w:r>
-      <w:r>
-        <w:rPr>
-          <w:rFonts w:ascii="Times New Roman" w:hAnsi="Times New Roman" w:cs="Times New Roman"/>
-          <w:color w:val="000000" w:themeColor="text1"/>
-        </w:rPr>
-        <w:t>: Assisted in creation, distribution, and implementation of workbooks for the annual conference (2019)</w:t>
-      </w:r>
-    </w:p>
-    <w:p>
-      <w:pPr>
-        <w:keepNext/>
-        <w:keepLines/>
-        <w:spacing w:after="60" w:line="240" w:lineRule="auto"/>
-        <w:rPr>
-          <w:rFonts w:ascii="Times New Roman" w:hAnsi="Times New Roman" w:cs="Times New Roman"/>
-          <w:color w:val="000000" w:themeColor="text1"/>
-        </w:rPr>
-      </w:pPr>
-      <w:r>
-        <w:rPr>
-          <w:rFonts w:ascii="Times New Roman" w:hAnsi="Times New Roman" w:cs="Times New Roman"/>
-          <w:color w:val="000000" w:themeColor="text1"/>
-          <w:u w:val="single"/>
-        </w:rPr>
-        <w:t xml:space="preserve">AAPM, WizKids:</w:t>
-      </w:r>
-      <w:r>
-        <w:rPr>
-          <w:rFonts w:ascii="Times New Roman" w:hAnsi="Times New Roman" w:cs="Times New Roman"/>
-          <w:color w:val="000000" w:themeColor="text1"/>
-        </w:rPr>
-        <w:t xml:space="preserve"> A STEM outreach program where we volunteer to educate local students on medical physics and other STEM opportunities, volunteered at the annual conference (2018-2019)</w:t>
-      </w:r>
-    </w:p>
-    <w:p>
-      <w:pPr>
-        <w:keepNext/>
-        <w:keepLines/>
-        <w:spacing w:after="60" w:line="240" w:lineRule="auto"/>
-        <w:rPr>
-          <w:rFonts w:ascii="Times New Roman" w:hAnsi="Times New Roman" w:cs="Times New Roman"/>
-          <w:color w:val="000000" w:themeColor="text1"/>
-        </w:rPr>
-      </w:pPr>
-      <w:r>
-        <w:rPr>
-          <w:rFonts w:ascii="Times New Roman" w:hAnsi="Times New Roman" w:cs="Times New Roman"/>
-          <w:color w:val="000000" w:themeColor="text1"/>
-          <w:u w:val="single"/>
-        </w:rPr>
-        <w:t xml:space="preserve">MD Anderson, International Students Association (ISA):</w:t>
-      </w:r>
-      <w:r>
-        <w:rPr>
-          <w:rFonts w:ascii="Times New Roman" w:hAnsi="Times New Roman" w:cs="Times New Roman"/>
-          <w:color w:val="000000" w:themeColor="text1"/>
-        </w:rPr>
-        <w:t xml:space="preserve"> Founding member of the organization as domestic liaison with the Graduate School of Biomedical Sciences. Goal being to best help international students with any problems they might have in the transition to the US (opening bank account, etc.) (2019)</w:t>
-      </w:r>
-    </w:p>
-    <w:p>
-      <w:pPr>
-        <w:keepNext/>
-        <w:keepLines/>
-        <w:spacing w:after="60" w:line="240" w:lineRule="auto"/>
-        <w:rPr>
-          <w:rFonts w:ascii="Times New Roman" w:hAnsi="Times New Roman" w:cs="Times New Roman"/>
-          <w:color w:val="000000" w:themeColor="text1"/>
-        </w:rPr>
-      </w:pPr>
-      <w:r>
-        <w:rPr>
-          <w:rFonts w:ascii="Times New Roman" w:hAnsi="Times New Roman" w:cs="Times New Roman"/>
-          <w:color w:val="000000" w:themeColor="text1"/>
-          <w:u w:val="single"/>
-        </w:rPr>
-        <w:t xml:space="preserve">MD Anderson, Science Night:</w:t>
-      </w:r>
-      <w:r>
-        <w:rPr>
-          <w:rFonts w:ascii="Times New Roman" w:hAnsi="Times New Roman" w:cs="Times New Roman"/>
-          <w:color w:val="000000" w:themeColor="text1"/>
-        </w:rPr>
-        <w:t xml:space="preserve"> An outreach program to educate children of all ages on opportunities and research in STEM occurring in UTH. Involves creating fun interactive stages to educate the students. (2017-2019)</w:t>
-      </w:r>
-    </w:p>
-    <w:p>
-      <w:pPr>
-        <w:keepNext/>
-        <w:keepLines/>
-        <w:spacing w:after="60" w:line="240" w:lineRule="auto"/>
-        <w:rPr>
-          <w:rFonts w:ascii="Times New Roman" w:hAnsi="Times New Roman" w:cs="Times New Roman"/>
-          <w:color w:val="000000" w:themeColor="text1"/>
-        </w:rPr>
-      </w:pPr>
-      <w:r>
-        <w:rPr>
-          <w:rFonts w:ascii="Times New Roman" w:hAnsi="Times New Roman" w:cs="Times New Roman"/>
-          <w:color w:val="000000" w:themeColor="text1"/>
-          <w:u w:val="single"/>
-        </w:rPr>
-        <w:t xml:space="preserve">MD Anderson, UT House Medics</w:t>
-      </w:r>
-      <w:r>
-        <w:rPr>
-          <w:rFonts w:ascii="Times New Roman" w:hAnsi="Times New Roman" w:cs="Times New Roman"/>
-          <w:color w:val="000000" w:themeColor="text1"/>
-        </w:rPr>
-        <w:t>: Community outreach assisting elderly citizens with home renovation and reconstruction (2016, 2018)</w:t>
-      </w:r>
-    </w:p>
-    <w:p>
-      <w:pPr>
-        <w:keepNext/>
-        <w:keepLines/>
-        <w:spacing w:after="60" w:line="240" w:lineRule="auto"/>
-        <w:rPr>
-          <w:rFonts w:ascii="Times New Roman" w:hAnsi="Times New Roman" w:cs="Times New Roman"/>
-          <w:color w:val="000000" w:themeColor="text1"/>
-        </w:rPr>
-      </w:pPr>
-      <w:r>
-        <w:rPr>
-          <w:rFonts w:ascii="Times New Roman" w:hAnsi="Times New Roman" w:cs="Times New Roman"/>
-          <w:color w:val="000000" w:themeColor="text1"/>
-          <w:u w:val="single"/>
-        </w:rPr>
-        <w:t xml:space="preserve">Houston, TX, St. Vincent de Paul Food Fair</w:t>
-      </w:r>
-      <w:r>
-        <w:rPr>
-          <w:rFonts w:ascii="Times New Roman" w:hAnsi="Times New Roman" w:cs="Times New Roman"/>
-          <w:color w:val="000000" w:themeColor="text1"/>
-        </w:rPr>
-        <w:t xml:space="preserve">: Volunteering in organization and distribution of food to families in need with St. Vincent de Paul (2018)</w:t>
-      </w:r>
-    </w:p>
-    <w:p>
-      <w:pPr>
-        <w:keepNext/>
-        <w:keepLines/>
-        <w:spacing w:after="60" w:line="240" w:lineRule="auto"/>
-        <w:rPr>
-          <w:rFonts w:ascii="Times New Roman" w:hAnsi="Times New Roman" w:cs="Times New Roman"/>
-          <w:color w:val="000000" w:themeColor="text1"/>
-        </w:rPr>
-      </w:pPr>
-      <w:r>
-        <w:rPr>
-          <w:rFonts w:ascii="Times New Roman" w:hAnsi="Times New Roman" w:cs="Times New Roman"/>
-          <w:color w:val="000000" w:themeColor="text1"/>
-          <w:u w:val="single"/>
-        </w:rPr>
-        <w:t xml:space="preserve">Houston, TX, Volunteer at Friends for Life Animal Shelter</w:t>
-      </w:r>
-      <w:r>
-        <w:rPr>
-          <w:rFonts w:ascii="Times New Roman" w:hAnsi="Times New Roman" w:cs="Times New Roman"/>
-          <w:color w:val="000000" w:themeColor="text1"/>
-        </w:rPr>
-        <w:t xml:space="preserve">: +20 hours spent volunteering in an animal shelter (2017-2019)</w:t>
-      </w:r>
-    </w:p>
-    <w:p>
-      <w:pPr>
-        <w:keepNext/>
-        <w:keepLines/>
-        <w:spacing w:after="60" w:line="240" w:lineRule="auto"/>
-        <w:rPr>
-          <w:rFonts w:ascii="Times New Roman" w:hAnsi="Times New Roman" w:cs="Times New Roman"/>
-          <w:color w:val="000000" w:themeColor="text1"/>
-        </w:rPr>
-      </w:pPr>
-      <w:r>
-        <w:rPr>
-          <w:rFonts w:ascii="Times New Roman" w:hAnsi="Times New Roman" w:cs="Times New Roman"/>
-          <w:color w:val="000000" w:themeColor="text1"/>
-          <w:u w:val="single"/>
-        </w:rPr>
-        <w:t xml:space="preserve">Houston, TX, Hurricane Harvey Relief: </w:t>
-      </w:r>
-      <w:r>
-        <w:rPr>
-          <w:rFonts w:ascii="Times New Roman" w:hAnsi="Times New Roman" w:cs="Times New Roman"/>
-          <w:color w:val="000000" w:themeColor="text1"/>
-        </w:rPr>
-        <w:t>Assisted in the removal of drywall, floor paneling, and ruined furniture of a local home affected by Hurricane Harvey (2017)</w:t>
-      </w:r>
-    </w:p>
-    <w:p>
-      <w:pPr>
-        <w:pStyle w:val="Heading1"/>
-        <w:keepLines/>
-        <w:spacing w:after="120"/>
-        <w:rPr>
-          <w:rFonts w:cs="Times New Roman"/>
-          <w:color w:val="000000" w:themeColor="text1"/>
-        </w:rPr>
-      </w:pPr>
-      <w:r>
-        <w:rPr>
-          <w:rFonts w:cs="Times New Roman"/>
-          <w:color w:val="000000" w:themeColor="text1"/>
-        </w:rPr>
-        <w:t xml:space="preserve">Clinical Projects and Responsibilities</w:t>
-      </w:r>
-    </w:p>
-    <w:p>
-      <w:pPr>
-        <w:keepNext/>
-        <w:keepLines/>
-        <w:spacing w:after="60" w:line="240" w:lineRule="auto"/>
-        <w:rPr>
-          <w:rFonts w:ascii="Times New Roman" w:hAnsi="Times New Roman" w:cs="Times New Roman"/>
-          <w:color w:val="000000" w:themeColor="text1"/>
-        </w:rPr>
-      </w:pPr>
-      <w:r>
-        <w:rPr>
-          <w:rFonts w:ascii="Times New Roman" w:hAnsi="Times New Roman" w:cs="Times New Roman"/>
-          <w:color w:val="000000" w:themeColor="text1"/>
-          <w:u w:val="single"/>
-        </w:rPr>
-        <w:lastRenderedPageBreak/>
-        <w:t>UCSD, Web Suite Notification System:</w:t>
-      </w:r>
-      <w:r>
-        <w:rPr>
-          <w:rFonts w:ascii="Times New Roman" w:hAnsi="Times New Roman" w:cs="Times New Roman"/>
-          <w:color w:val="000000" w:themeColor="text1"/>
-        </w:rPr>
-        <w:t xml:space="preserve"> Developed and deployed a monitoring system for radiation oncology patients. This will automatically notify dosimetrists, physicians, and clinical chiefs about patients falling behind schedule or missing essential care tasks.</w:t>
-      </w:r>
-    </w:p>
-    <w:p>
-      <w:pPr>
-        <w:keepNext/>
-        <w:keepLines/>
-        <w:spacing w:after="60" w:line="240" w:lineRule="auto"/>
-        <w:rPr>
-          <w:rFonts w:ascii="Times New Roman" w:hAnsi="Times New Roman" w:cs="Times New Roman"/>
-          <w:color w:val="000000" w:themeColor="text1"/>
-        </w:rPr>
-      </w:pPr>
-      <w:r>
-        <w:rPr>
-          <w:rFonts w:ascii="Times New Roman" w:hAnsi="Times New Roman" w:cs="Times New Roman"/>
-          <w:color w:val="000000" w:themeColor="text1"/>
-          <w:u w:val="single"/>
-        </w:rPr>
-        <w:t>UNC, Brachytherapy Equipment tracking:</w:t>
-      </w:r>
-      <w:r>
-        <w:rPr>
-          <w:rFonts w:ascii="Times New Roman" w:hAnsi="Times New Roman" w:cs="Times New Roman"/>
-          <w:color w:val="000000" w:themeColor="text1"/>
-        </w:rPr>
-        <w:t xml:space="preserve"> Deployed a personally created inventory program to record and notify when brachytherapy supplies need reordering.</w:t>
-      </w:r>
-    </w:p>
-    <w:p>
-      <w:pPr>
-        <w:keepNext/>
-        <w:keepLines/>
-        <w:spacing w:after="60" w:line="240" w:lineRule="auto"/>
-        <w:rPr>
-          <w:rFonts w:ascii="Times New Roman" w:hAnsi="Times New Roman" w:cs="Times New Roman"/>
-          <w:color w:val="000000" w:themeColor="text1"/>
-        </w:rPr>
-      </w:pPr>
-      <w:r>
-        <w:rPr>
-          <w:rFonts w:ascii="Times New Roman" w:hAnsi="Times New Roman" w:cs="Times New Roman"/>
-          <w:color w:val="000000" w:themeColor="text1"/>
-          <w:u w:val="single"/>
-        </w:rPr>
-        <w:t>UNC, DICOM Manipulation Tools:</w:t>
-      </w:r>
-      <w:r>
-        <w:rPr>
-          <w:rFonts w:ascii="Times New Roman" w:hAnsi="Times New Roman" w:cs="Times New Roman"/>
-          <w:color w:val="000000" w:themeColor="text1"/>
-        </w:rPr>
-        <w:t xml:space="preserve"> Stand-alone GUI for changing frame of reference and series instance UIDs. Useful for registering previously inherently defined images (4D-CT and free-breathing, MRIs).</w:t>
-      </w:r>
-    </w:p>
-    <w:p>
-      <w:pPr>
-        <w:keepNext/>
-        <w:keepLines/>
-        <w:spacing w:after="60" w:line="240" w:lineRule="auto"/>
-        <w:rPr>
-          <w:rFonts w:ascii="Times New Roman" w:hAnsi="Times New Roman" w:cs="Times New Roman"/>
-          <w:color w:val="000000" w:themeColor="text1"/>
-        </w:rPr>
-      </w:pPr>
-      <w:r>
-        <w:rPr>
-          <w:rFonts w:ascii="Times New Roman" w:hAnsi="Times New Roman" w:cs="Times New Roman"/>
-          <w:color w:val="000000" w:themeColor="text1"/>
-          <w:u w:val="single"/>
-        </w:rPr>
-        <w:t xml:space="preserve">UNC, DICOM transfer server:</w:t>
+        <w:t>DICOM transfer server:</w:t>
       </w:r>
       <w:r>
         <w:rPr>
@@ -1295,162 +1770,6 @@
           <w:color w:val="000000" w:themeColor="text1"/>
         </w:rPr>
         <w:t xml:space="preserve"> DICOM server created to seamlessly transfer between Raystation and PACs.</w:t>
-      </w:r>
-    </w:p>
-    <w:p>
-      <w:pPr>
-        <w:keepNext/>
-        <w:keepLines/>
-        <w:spacing w:after="60" w:line="240" w:lineRule="auto"/>
-        <w:rPr>
-          <w:rFonts w:ascii="Times New Roman" w:hAnsi="Times New Roman" w:cs="Times New Roman"/>
-          <w:color w:val="000000" w:themeColor="text1"/>
-        </w:rPr>
-      </w:pPr>
-      <w:r>
-        <w:rPr>
-          <w:rFonts w:ascii="Times New Roman" w:hAnsi="Times New Roman" w:cs="Times New Roman"/>
-          <w:color w:val="000000" w:themeColor="text1"/>
-          <w:u w:val="single"/>
-        </w:rPr>
-        <w:t xml:space="preserve">UCSD, Chief Resident:</w:t>
-      </w:r>
-      <w:r>
-        <w:rPr>
-          <w:rFonts w:ascii="Times New Roman" w:hAnsi="Times New Roman" w:cs="Times New Roman"/>
-          <w:color w:val="000000" w:themeColor="text1"/>
-        </w:rPr>
-        <w:t xml:space="preserve"> Responsible for the scheduling of resident clinical responsibilities, coordinating with faculty for resident education, and participate in ongoing Quality and Safety meetings. Presenting to hospital and faculty.</w:t>
-      </w:r>
-    </w:p>
-    <w:p>
-      <w:pPr>
-        <w:keepNext/>
-        <w:keepLines/>
-        <w:spacing w:after="60" w:line="240" w:lineRule="auto"/>
-        <w:rPr>
-          <w:rFonts w:ascii="Times New Roman" w:hAnsi="Times New Roman" w:cs="Times New Roman"/>
-          <w:color w:val="000000" w:themeColor="text1"/>
-        </w:rPr>
-      </w:pPr>
-      <w:r>
-        <w:rPr>
-          <w:rFonts w:ascii="Times New Roman" w:hAnsi="Times New Roman" w:cs="Times New Roman"/>
-          <w:color w:val="000000" w:themeColor="text1"/>
-          <w:u w:val="single"/>
-        </w:rPr>
-        <w:t xml:space="preserve">UCSD, VMAT Breast Rapid Plan:</w:t>
-      </w:r>
-      <w:r>
-        <w:rPr>
-          <w:rFonts w:ascii="Times New Roman" w:hAnsi="Times New Roman" w:cs="Times New Roman"/>
-          <w:color w:val="000000" w:themeColor="text1"/>
-        </w:rPr>
-        <w:t xml:space="preserve"> Creation of a knowledge-based rapid plan model for VMAT breast, including the creation of data-mining program within Eclipse.</w:t>
-      </w:r>
-    </w:p>
-    <w:p>
-      <w:pPr>
-        <w:keepNext/>
-        <w:keepLines/>
-        <w:spacing w:after="60" w:line="240" w:lineRule="auto"/>
-        <w:rPr>
-          <w:rFonts w:ascii="Times New Roman" w:hAnsi="Times New Roman" w:cs="Times New Roman"/>
-          <w:color w:val="000000" w:themeColor="text1"/>
-        </w:rPr>
-      </w:pPr>
-      <w:r>
-        <w:rPr>
-          <w:rFonts w:ascii="Times New Roman" w:hAnsi="Times New Roman" w:cs="Times New Roman"/>
-          <w:color w:val="000000" w:themeColor="text1"/>
-          <w:u w:val="single"/>
-        </w:rPr>
-        <w:t xml:space="preserve">UCSD, Brachytherapy sterilization kit program</w:t>
-      </w:r>
-      <w:r>
-        <w:rPr>
-          <w:rFonts w:ascii="Times New Roman" w:hAnsi="Times New Roman" w:cs="Times New Roman"/>
-          <w:color w:val="000000" w:themeColor="text1"/>
-        </w:rPr>
-        <w:t xml:space="preserve">: Created a program to record and notify when sterilization was required in the brachytherapy suite. Tool has successfully replaced previous paper system since 2021.</w:t>
-      </w:r>
-    </w:p>
-    <w:p>
-      <w:pPr>
-        <w:keepNext/>
-        <w:keepLines/>
-        <w:spacing w:after="60" w:line="240" w:lineRule="auto"/>
-        <w:rPr>
-          <w:rFonts w:ascii="Times New Roman" w:hAnsi="Times New Roman" w:cs="Times New Roman"/>
-          <w:color w:val="000000" w:themeColor="text1"/>
-        </w:rPr>
-      </w:pPr>
-      <w:r>
-        <w:rPr>
-          <w:rFonts w:ascii="Times New Roman" w:hAnsi="Times New Roman" w:cs="Times New Roman"/>
-          <w:color w:val="000000" w:themeColor="text1"/>
-          <w:u w:val="single"/>
-        </w:rPr>
-        <w:t xml:space="preserve">UCSD, DICOM transfer server:</w:t>
-      </w:r>
-      <w:r>
-        <w:rPr>
-          <w:rFonts w:ascii="Times New Roman" w:hAnsi="Times New Roman" w:cs="Times New Roman"/>
-          <w:color w:val="000000" w:themeColor="text1"/>
-        </w:rPr>
-        <w:t xml:space="preserve"> DICOM server created to seamlessly transfer between the Ethos TPS and AlignRT.</w:t>
-      </w:r>
-    </w:p>
-    <w:p>
-      <w:pPr>
-        <w:keepNext/>
-        <w:keepLines/>
-        <w:spacing w:after="60" w:line="240" w:lineRule="auto"/>
-        <w:rPr>
-          <w:rFonts w:ascii="Times New Roman" w:hAnsi="Times New Roman" w:cs="Times New Roman"/>
-          <w:color w:val="000000" w:themeColor="text1"/>
-        </w:rPr>
-      </w:pPr>
-      <w:r>
-        <w:rPr>
-          <w:rFonts w:ascii="Times New Roman" w:hAnsi="Times New Roman" w:cs="Times New Roman"/>
-          <w:color w:val="000000" w:themeColor="text1"/>
-          <w:u w:val="single"/>
-        </w:rPr>
-        <w:t xml:space="preserve">UCSD, MR DICOM tool</w:t>
-      </w:r>
-      <w:r>
-        <w:rPr>
-          <w:rFonts w:ascii="Times New Roman" w:hAnsi="Times New Roman" w:cs="Times New Roman"/>
-          <w:color w:val="000000" w:themeColor="text1"/>
-        </w:rPr>
-        <w:t>: Inherent frames of reference are needed to be broken prior to registration of MR and CT images in the UCSD clinic. This tool automatically breaks the inherent registration among the MR images in an efficient manner, saving time and reducing likelihood of errors in renaming process.</w:t>
-      </w:r>
-    </w:p>
-    <w:p>
-      <w:pPr>
-        <w:keepNext/>
-        <w:keepLines/>
-        <w:spacing w:after="60" w:line="240" w:lineRule="auto"/>
-        <w:rPr>
-          <w:rFonts w:ascii="Times New Roman" w:hAnsi="Times New Roman" w:cs="Times New Roman"/>
-          <w:color w:val="000000" w:themeColor="text1"/>
-        </w:rPr>
-      </w:pPr>
-      <w:r>
-        <w:rPr>
-          <w:rFonts w:ascii="Times New Roman" w:hAnsi="Times New Roman" w:cs="Times New Roman"/>
-          <w:color w:val="000000" w:themeColor="text1"/>
-          <w:u w:val="single"/>
-        </w:rPr>
-        <w:t xml:space="preserve">UCSD, PDF Creator:</w:t>
-      </w:r>
-      <w:r>
-        <w:rPr>
-          <w:rFonts w:ascii="Times New Roman" w:hAnsi="Times New Roman" w:cs="Times New Roman"/>
-          <w:color w:val="000000" w:themeColor="text1"/>
-        </w:rPr>
-        <w:t xml:space="preserve"> PDF creation automatically generated via stand-alone server. Enabled automatic uploading of the generated plan PDFs from brachytherapy procedures, streamlining the process and reducing potential for errors.</w:t>
       </w:r>
     </w:p>
     <w:p>
@@ -1801,6 +2120,19 @@
     </w:p>
     <w:p>
       <w:pPr>
+        <w:spacing w:before="80" w:after="40"/>
+      </w:pPr>
+      <w:r>
+        <w:rPr>
+          <w:rFonts w:ascii="Times New Roman" w:hAnsi="Times New Roman"/>
+          <w:b/>
+          <w:u w:val="single"/>
+        </w:rPr>
+        <w:t>University of California, San Diego</w:t>
+      </w:r>
+    </w:p>
+    <w:p>
+      <w:pPr>
         <w:keepNext/>
         <w:keepLines/>
         <w:spacing w:after="120" w:line="240" w:lineRule="auto"/>
@@ -1814,8 +2146,7 @@
           <w:rFonts w:ascii="Times New Roman" w:hAnsi="Times New Roman" w:cs="Times New Roman"/>
           <w:color w:val="000000" w:themeColor="text1"/>
         </w:rPr>
-        <w:lastRenderedPageBreak/>
-        <w:t>University of California, San Diego, Clinical Activity Web Suite: Designed and deployed a suite of services and dashboards that surface the department's treatment planning workflow as analyzable data. A query service polls the ARIA database and feeds panel-based activity dashboards, a configurable alert-rule engine, and automated notification of dosimetrists, physicians, and clinical chiefs when patients fall behind schedule or miss essential care tasks.</w:t>
+        <w:t>Clinical Activity Web Suite: Designed and deployed a suite of services and dashboards that surface the department's treatment planning workflow as analyzable data. A query service polls the ARIA database and feeds panel-based activity dashboards, a configurable alert-rule engine, and automated notification of dosimetrists, physicians, and clinical chiefs when patients fall behind schedule or miss essential care tasks.</w:t>
       </w:r>
     </w:p>
     <w:p>
@@ -1828,6 +2159,26 @@
           <w:color w:val="000000" w:themeColor="text1"/>
         </w:rPr>
       </w:pPr>
+      <w:r>
+        <w:rPr>
+          <w:rFonts w:ascii="Times New Roman" w:hAnsi="Times New Roman" w:cs="Times New Roman"/>
+          <w:color w:val="000000" w:themeColor="text1"/>
+        </w:rPr>
+        <w:t>Chair of Technical Innovation and Implementation: Directing departmental strategy for in-house software development and clinical deployment across Radiation Medicine &amp; Applied Sciences. Established the Technical Integration Catalog, a searchable inventory of every software tool the department has built: 66 projects at launch (2026), with automated monthly reconciliation. This ensures that existing work is found rather than rebuilt and single-maintainer risk is visible. Establishing minimum development standards, a validation and release process for clinical-facing tools aligned with AAPM guidance on in-house software QA, and PHI-handling guardrails for AI-assisted development.</w:t>
+      </w:r>
+    </w:p>
+    <w:p>
+      <w:pPr>
+        <w:spacing w:before="80" w:after="40"/>
+      </w:pPr>
+      <w:r>
+        <w:rPr>
+          <w:rFonts w:ascii="Times New Roman" w:hAnsi="Times New Roman"/>
+          <w:b/>
+          <w:u w:val="single"/>
+        </w:rPr>
+        <w:t>University of North Carolina, Chapel Hill</w:t>
+      </w:r>
     </w:p>
     <w:p>
       <w:pPr>
@@ -1844,7 +2195,7 @@
           <w:rFonts w:ascii="Times New Roman" w:hAnsi="Times New Roman" w:cs="Times New Roman"/>
           <w:color w:val="000000" w:themeColor="text1"/>
         </w:rPr>
-        <w:t xml:space="preserve">University of California, San Diego, Chair of Technical Innovation and Implementation: Directing departmental strategy for in-house software development and clinical deployment across Radiation Medicine &amp; Applied Sciences. Established the Technical Integration Catalog, a searchable inventory of every software tool the department has built: 66 projects at launch (2026), with automated monthly reconciliation. This ensures that existing work is found rather than rebuilt and single-maintainer risk is visible. Establishing minimum development standards, a validation and release process for clinical-facing tools aligned with AAPM guidance on in-house software QA, and PHI-handling guardrails for AI-assisted development.</w:t>
+        <w:t>Research focused on improving patient safety throughout the radiation oncology treatment planning process. Patient quality and safety improvements within the AHRQ grant. Part of this work is also in implementing automated treatment checks ‘DosCheck’ to provide added support to the dosimetrists and physicists.</w:t>
       </w:r>
     </w:p>
     <w:p>
@@ -1862,7 +2213,20 @@
           <w:rFonts w:ascii="Times New Roman" w:hAnsi="Times New Roman" w:cs="Times New Roman"/>
           <w:color w:val="000000" w:themeColor="text1"/>
         </w:rPr>
-        <w:t xml:space="preserve">University of North Carolina, Chapel Hill: Research focused on improving patient safety throughout the radiation oncology treatment planning process. Patient quality and safety improvements within the AHRQ grant. Part of this work is also in implementing automated treatment checks ‘DosCheck’ to provide added support to the dosimetrists and physicists.</w:t>
+        <w:t>Created a new data architecture which represents all aspects of a patient’s radiation plan (dose-volume histograms, region-of-interest volumes, treatment beams, modalities) in a dramatically compressed form. This architecture facilitates rapid information gathering for curating a specific dataset and answering clinical questions.</w:t>
+      </w:r>
+    </w:p>
+    <w:p>
+      <w:pPr>
+        <w:spacing w:before="80" w:after="40"/>
+      </w:pPr>
+      <w:r>
+        <w:rPr>
+          <w:rFonts w:ascii="Times New Roman" w:hAnsi="Times New Roman"/>
+          <w:b/>
+          <w:u w:val="single"/>
+        </w:rPr>
+        <w:t>MD Anderson Cancer Center</w:t>
       </w:r>
     </w:p>
     <w:p>
@@ -1880,25 +2244,7 @@
           <w:rFonts w:ascii="Times New Roman" w:hAnsi="Times New Roman" w:cs="Times New Roman"/>
           <w:color w:val="000000" w:themeColor="text1"/>
         </w:rPr>
-        <w:t xml:space="preserve">University of North Carolina, Chapel Hill: Created a new data architecture which represents all aspects of a patient’s radiation plan (dose-volume histograms, region-of-interest volumes, treatment beams, modalities) in a dramatically compressed form. This architecture facilitates rapid information gathering for curating a specific dataset and answering clinical questions.</w:t>
-      </w:r>
-    </w:p>
-    <w:p>
-      <w:pPr>
-        <w:keepNext/>
-        <w:keepLines/>
-        <w:spacing w:after="120" w:line="240" w:lineRule="auto"/>
-        <w:rPr>
-          <w:rFonts w:ascii="Times New Roman" w:hAnsi="Times New Roman" w:cs="Times New Roman"/>
-          <w:color w:val="000000" w:themeColor="text1"/>
-        </w:rPr>
-      </w:pPr>
-      <w:r>
-        <w:rPr>
-          <w:rFonts w:ascii="Times New Roman" w:hAnsi="Times New Roman" w:cs="Times New Roman"/>
-          <w:color w:val="000000" w:themeColor="text1"/>
-        </w:rPr>
-        <w:t xml:space="preserve">MD Anderson, PhD Dissertation: “Improving Treatment of Local Liver Ablation Therapy with Deep Learning and Biomechanical Modeling” </w:t>
+        <w:t xml:space="preserve">PhD Dissertation: “Improving Treatment of Local Liver Ablation Therapy with Deep Learning and Biomechanical Modeling” </w:t>
       </w:r>
       <w:hyperlink r:id="rId7" w:history="1">
         <w:r>
@@ -1934,7 +2280,7 @@
           <w:rFonts w:ascii="Times New Roman" w:hAnsi="Times New Roman" w:cs="Times New Roman"/>
           <w:color w:val="000000" w:themeColor="text1"/>
         </w:rPr>
-        <w:t xml:space="preserve">MD Anderson, Master’s Thesis: </w:t>
+        <w:t xml:space="preserve">Master’s Thesis: </w:t>
       </w:r>
       <w:r>
         <w:rPr>

</xml_diff>

<commit_message>
Extend date-column layout to the rest of the CV
Apply the Professional Service Activities entry format (year/range in a
left column, tab stop + hanging indent at 1.4", underlined lead-in) to
Education, Grants and Fellowships, Honors and Awards, Professional
Training, Other, Clinical Projects and Responsibilities, and the dated
Research Experience entries. Split the Education paragraph into four
dated entries, merge the duplicate Kopchick fellowship lines as
"2020, 2021", assign institution-based dates to Clinical Projects
entries, correct the PhD dissertation "(2017-2011)" date typo to
2017 - 2021, and drop the trailing empty paragraph that produced a
blank final PDF page. Wording unchanged; layout only.

Co-Authored-By: Claude Fable 5 <noreply@anthropic.com>
</commit_message>
<xml_diff>
--- a/Clincal_CV/BMAnderson CV.docx
+++ b/Clincal_CV/BMAnderson CV.docx
@@ -200,26 +200,133 @@
     </w:p>
     <w:p>
       <w:pPr>
-        <w:keepNext/>
-        <w:keepLines/>
-        <w:spacing w:after="120" w:line="240" w:lineRule="auto"/>
-        <w:rPr>
-          <w:rFonts w:ascii="Times New Roman" w:hAnsi="Times New Roman" w:cs="Times New Roman"/>
-          <w:color w:val="000000" w:themeColor="text1"/>
-        </w:rPr>
-      </w:pPr>
-      <w:r>
-        <w:rPr>
-          <w:rFonts w:ascii="Times New Roman" w:hAnsi="Times New Roman" w:cs="Times New Roman"/>
-          <w:color w:val="000000" w:themeColor="text1"/>
-        </w:rPr>
-        <w:t>Residency – The University of California, San Diego (07/2021-07/2023)</w:t>
-        <w:br/>
-        <w:t xml:space="preserve">Ph.D., Medical Physics - The University of Texas Health and Science Center, MD Anderson (9/2017-05/2021)</w:t>
-        <w:br/>
-        <w:t xml:space="preserve">S.M.S, Medical Physics - The University of Texas Health and Science Center, MD Anderson (9/2015-8/2017)</w:t>
-        <w:br/>
-        <w:t xml:space="preserve">B.S, Nuclear Engineering - The Georgia Institute of Technology (8/10-5/15) Highest Honors</w:t>
+        <w:tabs>
+          <w:tab w:val="left" w:pos="2016"/>
+        </w:tabs>
+        <w:spacing w:after="60"/>
+        <w:ind w:left="2016" w:hanging="2016"/>
+      </w:pPr>
+      <w:r>
+        <w:rPr>
+          <w:rFonts w:ascii="Times New Roman" w:hAnsi="Times New Roman"/>
+          <w:sz w:val="22"/>
+        </w:rPr>
+        <w:t xml:space="preserve">2021 – 2023</w:t>
+      </w:r>
+      <w:r>
+        <w:rPr>
+          <w:rFonts w:ascii="Times New Roman" w:hAnsi="Times New Roman"/>
+          <w:sz w:val="22"/>
+        </w:rPr>
+        <w:tab/>
+      </w:r>
+      <w:r>
+        <w:rPr>
+          <w:rFonts w:ascii="Times New Roman" w:hAnsi="Times New Roman"/>
+          <w:sz w:val="22"/>
+          <w:u w:val="single"/>
+        </w:rPr>
+        <w:t xml:space="preserve">Residency – The University of California, San Diego</w:t>
+      </w:r>
+    </w:p>
+    <w:p>
+      <w:pPr>
+        <w:tabs>
+          <w:tab w:val="left" w:pos="2016"/>
+        </w:tabs>
+        <w:spacing w:after="60"/>
+        <w:ind w:left="2016" w:hanging="2016"/>
+      </w:pPr>
+      <w:r>
+        <w:rPr>
+          <w:rFonts w:ascii="Times New Roman" w:hAnsi="Times New Roman"/>
+          <w:sz w:val="22"/>
+        </w:rPr>
+        <w:t xml:space="preserve">2017 – 2021</w:t>
+      </w:r>
+      <w:r>
+        <w:rPr>
+          <w:rFonts w:ascii="Times New Roman" w:hAnsi="Times New Roman"/>
+          <w:sz w:val="22"/>
+        </w:rPr>
+        <w:tab/>
+      </w:r>
+      <w:r>
+        <w:rPr>
+          <w:rFonts w:ascii="Times New Roman" w:hAnsi="Times New Roman"/>
+          <w:sz w:val="22"/>
+          <w:u w:val="single"/>
+        </w:rPr>
+        <w:t xml:space="preserve">Ph.D., Medical Physics - The University of Texas Health and Science Center, MD Anderson</w:t>
+      </w:r>
+    </w:p>
+    <w:p>
+      <w:pPr>
+        <w:tabs>
+          <w:tab w:val="left" w:pos="2016"/>
+        </w:tabs>
+        <w:spacing w:after="60"/>
+        <w:ind w:left="2016" w:hanging="2016"/>
+      </w:pPr>
+      <w:r>
+        <w:rPr>
+          <w:rFonts w:ascii="Times New Roman" w:hAnsi="Times New Roman"/>
+          <w:sz w:val="22"/>
+        </w:rPr>
+        <w:t xml:space="preserve">2015 – 2017</w:t>
+      </w:r>
+      <w:r>
+        <w:rPr>
+          <w:rFonts w:ascii="Times New Roman" w:hAnsi="Times New Roman"/>
+          <w:sz w:val="22"/>
+        </w:rPr>
+        <w:tab/>
+      </w:r>
+      <w:r>
+        <w:rPr>
+          <w:rFonts w:ascii="Times New Roman" w:hAnsi="Times New Roman"/>
+          <w:sz w:val="22"/>
+          <w:u w:val="single"/>
+        </w:rPr>
+        <w:t xml:space="preserve">S.M.S, Medical Physics - The University of Texas Health and Science Center, MD Anderson</w:t>
+      </w:r>
+    </w:p>
+    <w:p>
+      <w:pPr>
+        <w:tabs>
+          <w:tab w:val="left" w:pos="2016"/>
+        </w:tabs>
+        <w:spacing w:after="60"/>
+        <w:ind w:left="2016" w:hanging="2016"/>
+      </w:pPr>
+      <w:r>
+        <w:rPr>
+          <w:rFonts w:ascii="Times New Roman" w:hAnsi="Times New Roman"/>
+          <w:sz w:val="22"/>
+        </w:rPr>
+        <w:t xml:space="preserve">2010 – 2015</w:t>
+      </w:r>
+      <w:r>
+        <w:rPr>
+          <w:rFonts w:ascii="Times New Roman" w:hAnsi="Times New Roman"/>
+          <w:sz w:val="22"/>
+        </w:rPr>
+        <w:tab/>
+      </w:r>
+      <w:r>
+        <w:rPr>
+          <w:rFonts w:ascii="Times New Roman" w:hAnsi="Times New Roman"/>
+          <w:sz w:val="22"/>
+          <w:u w:val="single"/>
+        </w:rPr>
+        <w:t xml:space="preserve">B.S, Nuclear Engineering - The Georgia Institute of Technology</w:t>
+      </w:r>
+      <w:r>
+        <w:rPr>
+          <w:rFonts w:ascii="Times New Roman" w:hAnsi="Times New Roman"/>
+          <w:sz w:val="22"/>
+        </w:rPr>
+        <w:t xml:space="preserve"> Highest Honors</w:t>
       </w:r>
     </w:p>
     <w:p>
@@ -242,124 +349,162 @@
     </w:p>
     <w:p>
       <w:pPr>
-        <w:keepNext/>
-        <w:keepLines/>
-        <w:widowControl/>
-        <w:autoSpaceDE w:val="0"/>
-        <w:autoSpaceDN w:val="0"/>
-        <w:adjustRightInd w:val="0"/>
-        <w:spacing w:before="60" w:after="0" w:line="240" w:lineRule="auto"/>
-        <w:rPr>
-          <w:rFonts w:ascii="Times New Roman" w:hAnsi="Times New Roman" w:cs="Times New Roman"/>
-          <w:color w:val="000000" w:themeColor="text1"/>
-        </w:rPr>
-      </w:pPr>
-      <w:r>
-        <w:rPr>
-          <w:rFonts w:ascii="Times New Roman" w:hAnsi="Times New Roman" w:cs="Times New Roman"/>
-          <w:color w:val="000000" w:themeColor="text1"/>
-        </w:rPr>
-        <w:t xml:space="preserve">R-01, Co-Investigator, University of North Carolina, Chapel Hill: AHRQ Health Services Research Projects. Projects being investigated: Examining the Impact of Artificial Intelligence on Healthcare Safety. Systems-Based Approaches to Improve Patient Safety, Leading the development of artificial intelligence strategies for improving patient safety and plan quality in radiation oncology. Facilitating the implementation of useful tools for low- and middle-income groups. Efficacy of AI assisted sim review in rural settings: randomized control study (2024)</w:t>
-      </w:r>
-    </w:p>
-    <w:p>
-      <w:pPr>
-        <w:keepNext/>
-        <w:keepLines/>
-        <w:widowControl/>
-        <w:autoSpaceDE w:val="0"/>
-        <w:autoSpaceDN w:val="0"/>
-        <w:adjustRightInd w:val="0"/>
-        <w:spacing w:before="60" w:after="0" w:line="240" w:lineRule="auto"/>
-        <w:rPr>
-          <w:rFonts w:ascii="Times New Roman" w:hAnsi="Times New Roman" w:cs="Times New Roman"/>
-          <w:color w:val="000000" w:themeColor="text1"/>
-        </w:rPr>
-      </w:pPr>
-      <w:r>
-        <w:rPr>
-          <w:rFonts w:ascii="Times New Roman" w:hAnsi="Times New Roman" w:cs="Times New Roman"/>
-          <w:color w:val="000000" w:themeColor="text1"/>
-        </w:rPr>
-        <w:t xml:space="preserve">MD Anderson Dr. John J. Kopchick Fellowship: $15,000 for one year, ‘…for students who demonstrate exceptional character, extracurricular leadership, research excellence and scholarly merit.’ (01/2021)</w:t>
-      </w:r>
-    </w:p>
-    <w:p>
-      <w:pPr>
-        <w:keepNext/>
-        <w:keepLines/>
-        <w:widowControl/>
-        <w:autoSpaceDE w:val="0"/>
-        <w:autoSpaceDN w:val="0"/>
-        <w:adjustRightInd w:val="0"/>
-        <w:spacing w:before="60" w:after="0" w:line="240" w:lineRule="auto"/>
-        <w:rPr>
-          <w:rFonts w:ascii="Times New Roman" w:hAnsi="Times New Roman" w:cs="Times New Roman"/>
-          <w:color w:val="000000" w:themeColor="text1"/>
-        </w:rPr>
-      </w:pPr>
-      <w:r>
-        <w:rPr>
-          <w:rFonts w:ascii="Times New Roman" w:hAnsi="Times New Roman" w:cs="Times New Roman"/>
-          <w:color w:val="000000" w:themeColor="text1"/>
-        </w:rPr>
-        <w:t xml:space="preserve">MD Anderson Dr. John J. Kopchick Fellowship: $15,000 for one year, ‘…for students who demonstrate exceptional character, extracurricular leadership, research excellence and scholarly merit.’ (01/2020)</w:t>
-      </w:r>
-    </w:p>
-    <w:p>
-      <w:pPr>
-        <w:keepNext/>
-        <w:keepLines/>
-        <w:widowControl/>
-        <w:autoSpaceDE w:val="0"/>
-        <w:autoSpaceDN w:val="0"/>
-        <w:adjustRightInd w:val="0"/>
-        <w:spacing w:before="60" w:after="0" w:line="240" w:lineRule="auto"/>
+        <w:tabs>
+          <w:tab w:val="left" w:pos="2016"/>
+        </w:tabs>
+        <w:spacing w:after="60"/>
+        <w:ind w:left="2016" w:hanging="2016"/>
+      </w:pPr>
+      <w:r>
+        <w:rPr>
+          <w:rFonts w:ascii="Times New Roman" w:hAnsi="Times New Roman"/>
+          <w:sz w:val="22"/>
+        </w:rPr>
+        <w:t xml:space="preserve">2024</w:t>
+      </w:r>
+      <w:r>
+        <w:rPr>
+          <w:rFonts w:ascii="Times New Roman" w:hAnsi="Times New Roman"/>
+          <w:sz w:val="22"/>
+        </w:rPr>
+        <w:tab/>
+      </w:r>
+      <w:r>
+        <w:rPr>
+          <w:rFonts w:ascii="Times New Roman" w:hAnsi="Times New Roman" w:cs="Times New Roman"/>
+          <w:color w:val="000000" w:themeColor="text1"/>
+          <w:u w:val="single"/>
+        </w:rPr>
+        <w:t xml:space="preserve">R-01, Co-Investigator, University of North Carolina, Chapel Hill</w:t>
+      </w:r>
+      <w:r>
+        <w:rPr>
+          <w:rFonts w:ascii="Times New Roman" w:hAnsi="Times New Roman" w:cs="Times New Roman"/>
+          <w:color w:val="000000" w:themeColor="text1"/>
+        </w:rPr>
+        <w:t xml:space="preserve">: AHRQ Health Services Research Projects. Projects being investigated: Examining the Impact of Artificial Intelligence on Healthcare Safety. Systems-Based Approaches to Improve Patient Safety, Leading the development of artificial intelligence strategies for improving patient safety and plan quality in radiation oncology. Facilitating the implementation of useful tools for low- and middle-income groups. Efficacy of AI assisted sim review in rural settings: randomized control study</w:t>
+      </w:r>
+    </w:p>
+    <w:p>
+      <w:pPr>
+        <w:tabs>
+          <w:tab w:val="left" w:pos="2016"/>
+        </w:tabs>
+        <w:spacing w:after="60"/>
+        <w:ind w:left="2016" w:hanging="2016"/>
+      </w:pPr>
+      <w:r>
+        <w:rPr>
+          <w:rFonts w:ascii="Times New Roman" w:hAnsi="Times New Roman"/>
+          <w:sz w:val="22"/>
+        </w:rPr>
+        <w:t xml:space="preserve">2020, 2021</w:t>
+      </w:r>
+      <w:r>
+        <w:rPr>
+          <w:rFonts w:ascii="Times New Roman" w:hAnsi="Times New Roman"/>
+          <w:sz w:val="22"/>
+        </w:rPr>
+        <w:tab/>
+      </w:r>
+      <w:r>
+        <w:rPr>
+          <w:rFonts w:ascii="Times New Roman" w:hAnsi="Times New Roman" w:cs="Times New Roman"/>
+          <w:color w:val="000000" w:themeColor="text1"/>
+          <w:u w:val="single"/>
+        </w:rPr>
+        <w:t xml:space="preserve">MD Anderson Dr. John J. Kopchick Fellowship</w:t>
+      </w:r>
+      <w:r>
+        <w:rPr>
+          <w:rFonts w:ascii="Times New Roman" w:hAnsi="Times New Roman" w:cs="Times New Roman"/>
+          <w:color w:val="000000" w:themeColor="text1"/>
+        </w:rPr>
+        <w:t xml:space="preserve">: $15,000 for one year, ‘…for students who demonstrate exceptional character, extracurricular leadership, research excellence and scholarly merit.’</w:t>
+      </w:r>
+    </w:p>
+    <w:p>
+      <w:pPr>
+        <w:tabs>
+          <w:tab w:val="left" w:pos="2016"/>
+        </w:tabs>
+        <w:spacing w:after="60"/>
+        <w:ind w:left="2016" w:hanging="2016"/>
+      </w:pPr>
+      <w:r>
+        <w:rPr>
+          <w:rFonts w:ascii="Times New Roman" w:hAnsi="Times New Roman"/>
+          <w:sz w:val="22"/>
+        </w:rPr>
+        <w:t xml:space="preserve">2019</w:t>
+      </w:r>
+      <w:r>
+        <w:rPr>
+          <w:rFonts w:ascii="Times New Roman" w:hAnsi="Times New Roman"/>
+          <w:sz w:val="22"/>
+        </w:rPr>
+        <w:tab/>
+      </w:r>
+      <w:r>
+        <w:rPr>
+          <w:rFonts w:ascii="Times New Roman" w:hAnsi="Times New Roman" w:cs="Times New Roman"/>
+          <w:color w:val="000000" w:themeColor="text1"/>
+          <w:u w:val="single"/>
+        </w:rPr>
+        <w:t xml:space="preserve">Society of Interventional Radiology (SIR) Allied Scientist Grant</w:t>
+      </w:r>
+      <w:r>
+        <w:rPr>
+          <w:rFonts w:ascii="Times New Roman" w:hAnsi="Times New Roman" w:cs="Times New Roman"/>
+          <w:color w:val="000000" w:themeColor="text1"/>
+        </w:rPr>
+        <w:t xml:space="preserve">: $40,000 total for two years </w:t>
+      </w:r>
+      <w:r>
         <w:rPr>
           <w:rFonts w:ascii="Times New Roman" w:hAnsi="Times New Roman" w:cs="Times New Roman"/>
           <w:i/>
           <w:iCs/>
         </w:rPr>
-      </w:pPr>
-      <w:r>
-        <w:rPr>
-          <w:rFonts w:ascii="Times New Roman" w:hAnsi="Times New Roman" w:cs="Times New Roman"/>
-          <w:color w:val="000000" w:themeColor="text1"/>
-        </w:rPr>
-        <w:t xml:space="preserve">Society of Interventional Radiology (SIR) Allied Scientist Grant: $40,000 total for two years </w:t>
-      </w:r>
-      <w:r>
-        <w:rPr>
-          <w:rFonts w:ascii="Times New Roman" w:hAnsi="Times New Roman" w:cs="Times New Roman"/>
-          <w:i/>
-          <w:iCs/>
-        </w:rPr>
         <w:t xml:space="preserve">Improving Treatments of Local Liver Disease with Biomechanical Modeling and Deep Learning</w:t>
       </w:r>
-      <w:r>
-        <w:rPr>
-          <w:rFonts w:ascii="Times New Roman" w:hAnsi="Times New Roman" w:cs="Times New Roman"/>
-          <w:color w:val="000000" w:themeColor="text1"/>
-        </w:rPr>
-        <w:t xml:space="preserve"> (05/2019)</w:t>
-      </w:r>
-    </w:p>
-    <w:p>
-      <w:pPr>
-        <w:keepNext/>
-        <w:keepLines/>
-        <w:spacing w:after="60" w:line="240" w:lineRule="auto"/>
-        <w:rPr>
-          <w:rFonts w:ascii="Times New Roman" w:hAnsi="Times New Roman" w:cs="Times New Roman"/>
-          <w:color w:val="000000" w:themeColor="text1"/>
-        </w:rPr>
-      </w:pPr>
-      <w:r>
-        <w:rPr>
-          <w:rFonts w:ascii="Times New Roman" w:hAnsi="Times New Roman" w:cs="Times New Roman"/>
-          <w:color w:val="000000" w:themeColor="text1"/>
-        </w:rPr>
-        <w:t>American Association of Physicists in Medicine (AAPM) Summer Undergraduate Fellowship Program: 10 week program designed to gain experience in medical physics; work spent commissioning new Elekta linear accelerator in Eureka, CA (2014)</w:t>
+    </w:p>
+    <w:p>
+      <w:pPr>
+        <w:tabs>
+          <w:tab w:val="left" w:pos="2016"/>
+        </w:tabs>
+        <w:spacing w:after="60"/>
+        <w:ind w:left="2016" w:hanging="2016"/>
+      </w:pPr>
+      <w:r>
+        <w:rPr>
+          <w:rFonts w:ascii="Times New Roman" w:hAnsi="Times New Roman"/>
+          <w:sz w:val="22"/>
+        </w:rPr>
+        <w:t xml:space="preserve">2014</w:t>
+      </w:r>
+      <w:r>
+        <w:rPr>
+          <w:rFonts w:ascii="Times New Roman" w:hAnsi="Times New Roman"/>
+          <w:sz w:val="22"/>
+        </w:rPr>
+        <w:tab/>
+      </w:r>
+      <w:r>
+        <w:rPr>
+          <w:rFonts w:ascii="Times New Roman" w:hAnsi="Times New Roman" w:cs="Times New Roman"/>
+          <w:color w:val="000000" w:themeColor="text1"/>
+          <w:u w:val="single"/>
+        </w:rPr>
+        <w:t xml:space="preserve">American Association of Physicists in Medicine (AAPM) Summer Undergraduate Fellowship Program</w:t>
+      </w:r>
+      <w:r>
+        <w:rPr>
+          <w:rFonts w:ascii="Times New Roman" w:hAnsi="Times New Roman" w:cs="Times New Roman"/>
+          <w:color w:val="000000" w:themeColor="text1"/>
+        </w:rPr>
+        <w:t xml:space="preserve">: 10 week program designed to gain experience in medical physics; work spent commissioning new Elekta linear accelerator in Eureka, CA</w:t>
       </w:r>
     </w:p>
     <w:p>
@@ -1501,21 +1646,40 @@
     </w:p>
     <w:p>
       <w:pPr>
-        <w:keepNext/>
-        <w:keepLines/>
-        <w:spacing w:after="60" w:line="240" w:lineRule="auto"/>
-        <w:rPr>
-          <w:rFonts w:ascii="Times New Roman" w:hAnsi="Times New Roman" w:cs="Times New Roman"/>
-          <w:color w:val="000000" w:themeColor="text1"/>
-        </w:rPr>
-      </w:pPr>
+        <w:tabs>
+          <w:tab w:val="left" w:pos="2016"/>
+        </w:tabs>
+        <w:spacing w:after="60"/>
+        <w:ind w:left="2016" w:hanging="2016"/>
+      </w:pPr>
+      <w:r>
+        <w:rPr>
+          <w:rFonts w:ascii="Times New Roman" w:hAnsi="Times New Roman"/>
+          <w:sz w:val="22"/>
+        </w:rPr>
+        <w:t xml:space="preserve">2025 – Present</w:t>
+      </w:r>
+      <w:r>
+        <w:rPr>
+          <w:rFonts w:ascii="Times New Roman" w:hAnsi="Times New Roman"/>
+          <w:sz w:val="22"/>
+        </w:rPr>
+        <w:tab/>
+      </w:r>
       <w:r>
         <w:rPr>
           <w:rFonts w:ascii="Times New Roman" w:hAnsi="Times New Roman" w:cs="Times New Roman"/>
           <w:color w:val="000000" w:themeColor="text1"/>
           <w:u w:val="single"/>
         </w:rPr>
-        <w:t>Web Suite Notification System:</w:t>
+        <w:t xml:space="preserve">Web Suite Notification System</w:t>
+      </w:r>
+      <w:r>
+        <w:rPr>
+          <w:rFonts w:ascii="Times New Roman" w:hAnsi="Times New Roman" w:cs="Times New Roman"/>
+          <w:color w:val="000000" w:themeColor="text1"/>
+        </w:rPr>
+        <w:t xml:space="preserve">:</w:t>
       </w:r>
       <w:r>
         <w:rPr>
@@ -1527,21 +1691,40 @@
     </w:p>
     <w:p>
       <w:pPr>
-        <w:keepNext/>
-        <w:keepLines/>
-        <w:spacing w:after="60" w:line="240" w:lineRule="auto"/>
-        <w:rPr>
-          <w:rFonts w:ascii="Times New Roman" w:hAnsi="Times New Roman" w:cs="Times New Roman"/>
-          <w:color w:val="000000" w:themeColor="text1"/>
-        </w:rPr>
-      </w:pPr>
+        <w:tabs>
+          <w:tab w:val="left" w:pos="2016"/>
+        </w:tabs>
+        <w:spacing w:after="60"/>
+        <w:ind w:left="2016" w:hanging="2016"/>
+      </w:pPr>
+      <w:r>
+        <w:rPr>
+          <w:rFonts w:ascii="Times New Roman" w:hAnsi="Times New Roman"/>
+          <w:sz w:val="22"/>
+        </w:rPr>
+        <w:t xml:space="preserve">2021 – 2023</w:t>
+      </w:r>
+      <w:r>
+        <w:rPr>
+          <w:rFonts w:ascii="Times New Roman" w:hAnsi="Times New Roman"/>
+          <w:sz w:val="22"/>
+        </w:rPr>
+        <w:tab/>
+      </w:r>
       <w:r>
         <w:rPr>
           <w:rFonts w:ascii="Times New Roman" w:hAnsi="Times New Roman" w:cs="Times New Roman"/>
           <w:color w:val="000000" w:themeColor="text1"/>
           <w:u w:val="single"/>
         </w:rPr>
-        <w:t>Chief Resident:</w:t>
+        <w:t xml:space="preserve">Chief Resident</w:t>
+      </w:r>
+      <w:r>
+        <w:rPr>
+          <w:rFonts w:ascii="Times New Roman" w:hAnsi="Times New Roman" w:cs="Times New Roman"/>
+          <w:color w:val="000000" w:themeColor="text1"/>
+        </w:rPr>
+        <w:t xml:space="preserve">:</w:t>
       </w:r>
       <w:r>
         <w:rPr>
@@ -1553,21 +1736,40 @@
     </w:p>
     <w:p>
       <w:pPr>
-        <w:keepNext/>
-        <w:keepLines/>
-        <w:spacing w:after="60" w:line="240" w:lineRule="auto"/>
-        <w:rPr>
-          <w:rFonts w:ascii="Times New Roman" w:hAnsi="Times New Roman" w:cs="Times New Roman"/>
-          <w:color w:val="000000" w:themeColor="text1"/>
-        </w:rPr>
-      </w:pPr>
+        <w:tabs>
+          <w:tab w:val="left" w:pos="2016"/>
+        </w:tabs>
+        <w:spacing w:after="60"/>
+        <w:ind w:left="2016" w:hanging="2016"/>
+      </w:pPr>
+      <w:r>
+        <w:rPr>
+          <w:rFonts w:ascii="Times New Roman" w:hAnsi="Times New Roman"/>
+          <w:sz w:val="22"/>
+        </w:rPr>
+        <w:t xml:space="preserve">2021 – 2023</w:t>
+      </w:r>
+      <w:r>
+        <w:rPr>
+          <w:rFonts w:ascii="Times New Roman" w:hAnsi="Times New Roman"/>
+          <w:sz w:val="22"/>
+        </w:rPr>
+        <w:tab/>
+      </w:r>
       <w:r>
         <w:rPr>
           <w:rFonts w:ascii="Times New Roman" w:hAnsi="Times New Roman" w:cs="Times New Roman"/>
           <w:color w:val="000000" w:themeColor="text1"/>
           <w:u w:val="single"/>
         </w:rPr>
-        <w:t>VMAT Breast Rapid Plan:</w:t>
+        <w:t xml:space="preserve">VMAT Breast Rapid Plan</w:t>
+      </w:r>
+      <w:r>
+        <w:rPr>
+          <w:rFonts w:ascii="Times New Roman" w:hAnsi="Times New Roman" w:cs="Times New Roman"/>
+          <w:color w:val="000000" w:themeColor="text1"/>
+        </w:rPr>
+        <w:t xml:space="preserve">:</w:t>
       </w:r>
       <w:r>
         <w:rPr>
@@ -1579,14 +1781,26 @@
     </w:p>
     <w:p>
       <w:pPr>
-        <w:keepNext/>
-        <w:keepLines/>
-        <w:spacing w:after="60" w:line="240" w:lineRule="auto"/>
-        <w:rPr>
-          <w:rFonts w:ascii="Times New Roman" w:hAnsi="Times New Roman" w:cs="Times New Roman"/>
-          <w:color w:val="000000" w:themeColor="text1"/>
-        </w:rPr>
-      </w:pPr>
+        <w:tabs>
+          <w:tab w:val="left" w:pos="2016"/>
+        </w:tabs>
+        <w:spacing w:after="60"/>
+        <w:ind w:left="2016" w:hanging="2016"/>
+      </w:pPr>
+      <w:r>
+        <w:rPr>
+          <w:rFonts w:ascii="Times New Roman" w:hAnsi="Times New Roman"/>
+          <w:sz w:val="22"/>
+        </w:rPr>
+        <w:t xml:space="preserve">2021 – 2023</w:t>
+      </w:r>
+      <w:r>
+        <w:rPr>
+          <w:rFonts w:ascii="Times New Roman" w:hAnsi="Times New Roman"/>
+          <w:sz w:val="22"/>
+        </w:rPr>
+        <w:tab/>
+      </w:r>
       <w:r>
         <w:rPr>
           <w:rFonts w:ascii="Times New Roman" w:hAnsi="Times New Roman" w:cs="Times New Roman"/>
@@ -1605,21 +1819,40 @@
     </w:p>
     <w:p>
       <w:pPr>
-        <w:keepNext/>
-        <w:keepLines/>
-        <w:spacing w:after="60" w:line="240" w:lineRule="auto"/>
-        <w:rPr>
-          <w:rFonts w:ascii="Times New Roman" w:hAnsi="Times New Roman" w:cs="Times New Roman"/>
-          <w:color w:val="000000" w:themeColor="text1"/>
-        </w:rPr>
-      </w:pPr>
+        <w:tabs>
+          <w:tab w:val="left" w:pos="2016"/>
+        </w:tabs>
+        <w:spacing w:after="60"/>
+        <w:ind w:left="2016" w:hanging="2016"/>
+      </w:pPr>
+      <w:r>
+        <w:rPr>
+          <w:rFonts w:ascii="Times New Roman" w:hAnsi="Times New Roman"/>
+          <w:sz w:val="22"/>
+        </w:rPr>
+        <w:t xml:space="preserve">2021 – 2023</w:t>
+      </w:r>
+      <w:r>
+        <w:rPr>
+          <w:rFonts w:ascii="Times New Roman" w:hAnsi="Times New Roman"/>
+          <w:sz w:val="22"/>
+        </w:rPr>
+        <w:tab/>
+      </w:r>
       <w:r>
         <w:rPr>
           <w:rFonts w:ascii="Times New Roman" w:hAnsi="Times New Roman" w:cs="Times New Roman"/>
           <w:color w:val="000000" w:themeColor="text1"/>
           <w:u w:val="single"/>
         </w:rPr>
-        <w:t>DICOM transfer server:</w:t>
+        <w:t xml:space="preserve">DICOM transfer server</w:t>
+      </w:r>
+      <w:r>
+        <w:rPr>
+          <w:rFonts w:ascii="Times New Roman" w:hAnsi="Times New Roman" w:cs="Times New Roman"/>
+          <w:color w:val="000000" w:themeColor="text1"/>
+        </w:rPr>
+        <w:t xml:space="preserve">:</w:t>
       </w:r>
       <w:r>
         <w:rPr>
@@ -1631,14 +1864,26 @@
     </w:p>
     <w:p>
       <w:pPr>
-        <w:keepNext/>
-        <w:keepLines/>
-        <w:spacing w:after="60" w:line="240" w:lineRule="auto"/>
-        <w:rPr>
-          <w:rFonts w:ascii="Times New Roman" w:hAnsi="Times New Roman" w:cs="Times New Roman"/>
-          <w:color w:val="000000" w:themeColor="text1"/>
-        </w:rPr>
-      </w:pPr>
+        <w:tabs>
+          <w:tab w:val="left" w:pos="2016"/>
+        </w:tabs>
+        <w:spacing w:after="60"/>
+        <w:ind w:left="2016" w:hanging="2016"/>
+      </w:pPr>
+      <w:r>
+        <w:rPr>
+          <w:rFonts w:ascii="Times New Roman" w:hAnsi="Times New Roman"/>
+          <w:sz w:val="22"/>
+        </w:rPr>
+        <w:t xml:space="preserve">2021 – 2023</w:t>
+      </w:r>
+      <w:r>
+        <w:rPr>
+          <w:rFonts w:ascii="Times New Roman" w:hAnsi="Times New Roman"/>
+          <w:sz w:val="22"/>
+        </w:rPr>
+        <w:tab/>
+      </w:r>
       <w:r>
         <w:rPr>
           <w:rFonts w:ascii="Times New Roman" w:hAnsi="Times New Roman" w:cs="Times New Roman"/>
@@ -1657,21 +1902,40 @@
     </w:p>
     <w:p>
       <w:pPr>
-        <w:keepNext/>
-        <w:keepLines/>
-        <w:spacing w:after="60" w:line="240" w:lineRule="auto"/>
-        <w:rPr>
-          <w:rFonts w:ascii="Times New Roman" w:hAnsi="Times New Roman" w:cs="Times New Roman"/>
-          <w:color w:val="000000" w:themeColor="text1"/>
-        </w:rPr>
-      </w:pPr>
+        <w:tabs>
+          <w:tab w:val="left" w:pos="2016"/>
+        </w:tabs>
+        <w:spacing w:after="60"/>
+        <w:ind w:left="2016" w:hanging="2016"/>
+      </w:pPr>
+      <w:r>
+        <w:rPr>
+          <w:rFonts w:ascii="Times New Roman" w:hAnsi="Times New Roman"/>
+          <w:sz w:val="22"/>
+        </w:rPr>
+        <w:t xml:space="preserve">2021 – 2023</w:t>
+      </w:r>
+      <w:r>
+        <w:rPr>
+          <w:rFonts w:ascii="Times New Roman" w:hAnsi="Times New Roman"/>
+          <w:sz w:val="22"/>
+        </w:rPr>
+        <w:tab/>
+      </w:r>
       <w:r>
         <w:rPr>
           <w:rFonts w:ascii="Times New Roman" w:hAnsi="Times New Roman" w:cs="Times New Roman"/>
           <w:color w:val="000000" w:themeColor="text1"/>
           <w:u w:val="single"/>
         </w:rPr>
-        <w:t>PDF Creator:</w:t>
+        <w:t xml:space="preserve">PDF Creator</w:t>
+      </w:r>
+      <w:r>
+        <w:rPr>
+          <w:rFonts w:ascii="Times New Roman" w:hAnsi="Times New Roman" w:cs="Times New Roman"/>
+          <w:color w:val="000000" w:themeColor="text1"/>
+        </w:rPr>
+        <w:t xml:space="preserve">:</w:t>
       </w:r>
       <w:r>
         <w:rPr>
@@ -1696,21 +1960,40 @@
     </w:p>
     <w:p>
       <w:pPr>
-        <w:keepNext/>
-        <w:keepLines/>
-        <w:spacing w:after="60" w:line="240" w:lineRule="auto"/>
-        <w:rPr>
-          <w:rFonts w:ascii="Times New Roman" w:hAnsi="Times New Roman" w:cs="Times New Roman"/>
-          <w:color w:val="000000" w:themeColor="text1"/>
-        </w:rPr>
-      </w:pPr>
+        <w:tabs>
+          <w:tab w:val="left" w:pos="2016"/>
+        </w:tabs>
+        <w:spacing w:after="60"/>
+        <w:ind w:left="2016" w:hanging="2016"/>
+      </w:pPr>
+      <w:r>
+        <w:rPr>
+          <w:rFonts w:ascii="Times New Roman" w:hAnsi="Times New Roman"/>
+          <w:sz w:val="22"/>
+        </w:rPr>
+        <w:t xml:space="preserve">2023 – 2025</w:t>
+      </w:r>
+      <w:r>
+        <w:rPr>
+          <w:rFonts w:ascii="Times New Roman" w:hAnsi="Times New Roman"/>
+          <w:sz w:val="22"/>
+        </w:rPr>
+        <w:tab/>
+      </w:r>
       <w:r>
         <w:rPr>
           <w:rFonts w:ascii="Times New Roman" w:hAnsi="Times New Roman" w:cs="Times New Roman"/>
           <w:color w:val="000000" w:themeColor="text1"/>
           <w:u w:val="single"/>
         </w:rPr>
-        <w:t>Brachytherapy Equipment tracking:</w:t>
+        <w:t xml:space="preserve">Brachytherapy Equipment tracking</w:t>
+      </w:r>
+      <w:r>
+        <w:rPr>
+          <w:rFonts w:ascii="Times New Roman" w:hAnsi="Times New Roman" w:cs="Times New Roman"/>
+          <w:color w:val="000000" w:themeColor="text1"/>
+        </w:rPr>
+        <w:t xml:space="preserve">:</w:t>
       </w:r>
       <w:r>
         <w:rPr>
@@ -1722,21 +2005,40 @@
     </w:p>
     <w:p>
       <w:pPr>
-        <w:keepNext/>
-        <w:keepLines/>
-        <w:spacing w:after="60" w:line="240" w:lineRule="auto"/>
-        <w:rPr>
-          <w:rFonts w:ascii="Times New Roman" w:hAnsi="Times New Roman" w:cs="Times New Roman"/>
-          <w:color w:val="000000" w:themeColor="text1"/>
-        </w:rPr>
-      </w:pPr>
+        <w:tabs>
+          <w:tab w:val="left" w:pos="2016"/>
+        </w:tabs>
+        <w:spacing w:after="60"/>
+        <w:ind w:left="2016" w:hanging="2016"/>
+      </w:pPr>
+      <w:r>
+        <w:rPr>
+          <w:rFonts w:ascii="Times New Roman" w:hAnsi="Times New Roman"/>
+          <w:sz w:val="22"/>
+        </w:rPr>
+        <w:t xml:space="preserve">2023 – 2025</w:t>
+      </w:r>
+      <w:r>
+        <w:rPr>
+          <w:rFonts w:ascii="Times New Roman" w:hAnsi="Times New Roman"/>
+          <w:sz w:val="22"/>
+        </w:rPr>
+        <w:tab/>
+      </w:r>
       <w:r>
         <w:rPr>
           <w:rFonts w:ascii="Times New Roman" w:hAnsi="Times New Roman" w:cs="Times New Roman"/>
           <w:color w:val="000000" w:themeColor="text1"/>
           <w:u w:val="single"/>
         </w:rPr>
-        <w:t>DICOM Manipulation Tools:</w:t>
+        <w:t xml:space="preserve">DICOM Manipulation Tools</w:t>
+      </w:r>
+      <w:r>
+        <w:rPr>
+          <w:rFonts w:ascii="Times New Roman" w:hAnsi="Times New Roman" w:cs="Times New Roman"/>
+          <w:color w:val="000000" w:themeColor="text1"/>
+        </w:rPr>
+        <w:t xml:space="preserve">:</w:t>
       </w:r>
       <w:r>
         <w:rPr>
@@ -1748,21 +2050,40 @@
     </w:p>
     <w:p>
       <w:pPr>
-        <w:keepNext/>
-        <w:keepLines/>
-        <w:spacing w:after="60" w:line="240" w:lineRule="auto"/>
-        <w:rPr>
-          <w:rFonts w:ascii="Times New Roman" w:hAnsi="Times New Roman" w:cs="Times New Roman"/>
-          <w:color w:val="000000" w:themeColor="text1"/>
-        </w:rPr>
-      </w:pPr>
+        <w:tabs>
+          <w:tab w:val="left" w:pos="2016"/>
+        </w:tabs>
+        <w:spacing w:after="60"/>
+        <w:ind w:left="2016" w:hanging="2016"/>
+      </w:pPr>
+      <w:r>
+        <w:rPr>
+          <w:rFonts w:ascii="Times New Roman" w:hAnsi="Times New Roman"/>
+          <w:sz w:val="22"/>
+        </w:rPr>
+        <w:t xml:space="preserve">2023 – 2025</w:t>
+      </w:r>
+      <w:r>
+        <w:rPr>
+          <w:rFonts w:ascii="Times New Roman" w:hAnsi="Times New Roman"/>
+          <w:sz w:val="22"/>
+        </w:rPr>
+        <w:tab/>
+      </w:r>
       <w:r>
         <w:rPr>
           <w:rFonts w:ascii="Times New Roman" w:hAnsi="Times New Roman" w:cs="Times New Roman"/>
           <w:color w:val="000000" w:themeColor="text1"/>
           <w:u w:val="single"/>
         </w:rPr>
-        <w:t>DICOM transfer server:</w:t>
+        <w:t xml:space="preserve">DICOM transfer server</w:t>
+      </w:r>
+      <w:r>
+        <w:rPr>
+          <w:rFonts w:ascii="Times New Roman" w:hAnsi="Times New Roman" w:cs="Times New Roman"/>
+          <w:color w:val="000000" w:themeColor="text1"/>
+        </w:rPr>
+        <w:t xml:space="preserve">:</w:t>
       </w:r>
       <w:r>
         <w:rPr>
@@ -1793,20 +2114,40 @@
     </w:p>
     <w:p>
       <w:pPr>
-        <w:keepNext/>
-        <w:keepLines/>
-        <w:spacing w:after="60" w:line="240" w:lineRule="auto"/>
-        <w:rPr>
-          <w:rFonts w:ascii="Times New Roman" w:hAnsi="Times New Roman" w:cs="Times New Roman"/>
-          <w:color w:val="000000" w:themeColor="text1"/>
-        </w:rPr>
-      </w:pPr>
-      <w:r>
-        <w:rPr>
-          <w:rFonts w:ascii="Times New Roman" w:hAnsi="Times New Roman" w:cs="Times New Roman"/>
-          <w:color w:val="000000" w:themeColor="text1"/>
-        </w:rPr>
-        <w:t>University of North Carolina, Chapel Hill Research Retreat: 1</w:t>
+        <w:tabs>
+          <w:tab w:val="left" w:pos="2016"/>
+        </w:tabs>
+        <w:spacing w:after="60"/>
+        <w:ind w:left="2016" w:hanging="2016"/>
+      </w:pPr>
+      <w:r>
+        <w:rPr>
+          <w:rFonts w:ascii="Times New Roman" w:hAnsi="Times New Roman"/>
+          <w:sz w:val="22"/>
+        </w:rPr>
+        <w:t xml:space="preserve">2025</w:t>
+      </w:r>
+      <w:r>
+        <w:rPr>
+          <w:rFonts w:ascii="Times New Roman" w:hAnsi="Times New Roman"/>
+          <w:sz w:val="22"/>
+        </w:rPr>
+        <w:tab/>
+      </w:r>
+      <w:r>
+        <w:rPr>
+          <w:rFonts w:ascii="Times New Roman" w:hAnsi="Times New Roman" w:cs="Times New Roman"/>
+          <w:color w:val="000000" w:themeColor="text1"/>
+          <w:u w:val="single"/>
+        </w:rPr>
+        <w:t xml:space="preserve">University of North Carolina, Chapel Hill Research Retreat</w:t>
+      </w:r>
+      <w:r>
+        <w:rPr>
+          <w:rFonts w:ascii="Times New Roman" w:hAnsi="Times New Roman" w:cs="Times New Roman"/>
+          <w:color w:val="000000" w:themeColor="text1"/>
+        </w:rPr>
+        <w:t xml:space="preserve">: 1</w:t>
       </w:r>
       <w:r>
         <w:rPr>
@@ -1821,77 +2162,143 @@
           <w:rFonts w:ascii="Times New Roman" w:hAnsi="Times New Roman" w:cs="Times New Roman"/>
           <w:color w:val="000000" w:themeColor="text1"/>
         </w:rPr>
-        <w:t xml:space="preserve"> place poster in Physics/DHE Research (2025)</w:t>
-      </w:r>
-    </w:p>
-    <w:p>
-      <w:pPr>
-        <w:keepNext/>
-        <w:keepLines/>
-        <w:spacing w:after="60" w:line="240" w:lineRule="auto"/>
-        <w:rPr>
-          <w:rFonts w:ascii="Times New Roman" w:hAnsi="Times New Roman" w:cs="Times New Roman"/>
-          <w:color w:val="000000" w:themeColor="text1"/>
-        </w:rPr>
-      </w:pPr>
-      <w:r>
-        <w:rPr>
-          <w:rFonts w:ascii="Times New Roman" w:hAnsi="Times New Roman" w:cs="Times New Roman"/>
-          <w:color w:val="000000" w:themeColor="text1"/>
-        </w:rPr>
-        <w:t xml:space="preserve">AAPM Annual Meeting, Jack Krohmer Early Career Investigator Competition Winner – EPIDEEP: Predicting In-Vivo EPID Transit Images – a Deep Learning Approach (2022)</w:t>
-      </w:r>
-    </w:p>
-    <w:p>
-      <w:pPr>
-        <w:keepNext/>
-        <w:keepLines/>
-        <w:spacing w:after="60" w:line="240" w:lineRule="auto"/>
-        <w:rPr>
-          <w:rFonts w:ascii="Times New Roman" w:hAnsi="Times New Roman" w:cs="Times New Roman"/>
-          <w:color w:val="000000" w:themeColor="text1"/>
-        </w:rPr>
-      </w:pPr>
-      <w:r>
-        <w:rPr>
-          <w:rFonts w:ascii="Times New Roman" w:hAnsi="Times New Roman" w:cs="Times New Roman"/>
-          <w:color w:val="000000" w:themeColor="text1"/>
-        </w:rPr>
-        <w:t xml:space="preserve">MD Anderson, Alfred G. Knudson Jr. Outstanding Dissertation Award: $5,000 Award established by MD Anderson Cancer Center to honor the late Dr. Knudson in recognition of the top selected PhD dissertation. (2022)</w:t>
-      </w:r>
-    </w:p>
-    <w:p>
-      <w:pPr>
-        <w:keepNext/>
-        <w:keepLines/>
-        <w:spacing w:after="60" w:line="240" w:lineRule="auto"/>
-        <w:rPr>
-          <w:rFonts w:ascii="Times New Roman" w:hAnsi="Times New Roman" w:cs="Times New Roman"/>
-          <w:color w:val="000000" w:themeColor="text1"/>
-        </w:rPr>
-      </w:pPr>
-      <w:r>
-        <w:rPr>
-          <w:rFonts w:ascii="Times New Roman" w:hAnsi="Times New Roman" w:cs="Times New Roman"/>
-          <w:color w:val="000000" w:themeColor="text1"/>
-        </w:rPr>
-        <w:t xml:space="preserve">AAPM Practical Big Data Workshop, Early Career Investigator – Impact Award (2021)</w:t>
-      </w:r>
-    </w:p>
-    <w:p>
-      <w:pPr>
-        <w:keepNext/>
-        <w:keepLines/>
-        <w:spacing w:after="60" w:line="240" w:lineRule="auto"/>
-        <w:rPr>
-          <w:rFonts w:ascii="Times New Roman" w:hAnsi="Times New Roman" w:cs="Times New Roman"/>
-          <w:color w:val="000000" w:themeColor="text1"/>
-        </w:rPr>
-      </w:pPr>
-      <w:r>
-        <w:rPr>
-          <w:rFonts w:ascii="Times New Roman" w:hAnsi="Times New Roman" w:cs="Times New Roman"/>
-          <w:color w:val="000000" w:themeColor="text1"/>
+        <w:t xml:space="preserve"> place poster in Physics/DHE Research</w:t>
+      </w:r>
+    </w:p>
+    <w:p>
+      <w:pPr>
+        <w:tabs>
+          <w:tab w:val="left" w:pos="2016"/>
+        </w:tabs>
+        <w:spacing w:after="60"/>
+        <w:ind w:left="2016" w:hanging="2016"/>
+      </w:pPr>
+      <w:r>
+        <w:rPr>
+          <w:rFonts w:ascii="Times New Roman" w:hAnsi="Times New Roman"/>
+          <w:sz w:val="22"/>
+        </w:rPr>
+        <w:t xml:space="preserve">2022</w:t>
+      </w:r>
+      <w:r>
+        <w:rPr>
+          <w:rFonts w:ascii="Times New Roman" w:hAnsi="Times New Roman"/>
+          <w:sz w:val="22"/>
+        </w:rPr>
+        <w:tab/>
+      </w:r>
+      <w:r>
+        <w:rPr>
+          <w:rFonts w:ascii="Times New Roman" w:hAnsi="Times New Roman" w:cs="Times New Roman"/>
+          <w:color w:val="000000" w:themeColor="text1"/>
+          <w:u w:val="single"/>
+        </w:rPr>
+        <w:t xml:space="preserve">AAPM Annual Meeting, Jack Krohmer Early Career Investigator Competition Winner</w:t>
+      </w:r>
+      <w:r>
+        <w:rPr>
+          <w:rFonts w:ascii="Times New Roman" w:hAnsi="Times New Roman" w:cs="Times New Roman"/>
+          <w:color w:val="000000" w:themeColor="text1"/>
+        </w:rPr>
+        <w:t xml:space="preserve"> – EPIDEEP: Predicting In-Vivo EPID Transit Images – a Deep Learning Approach</w:t>
+      </w:r>
+    </w:p>
+    <w:p>
+      <w:pPr>
+        <w:tabs>
+          <w:tab w:val="left" w:pos="2016"/>
+        </w:tabs>
+        <w:spacing w:after="60"/>
+        <w:ind w:left="2016" w:hanging="2016"/>
+      </w:pPr>
+      <w:r>
+        <w:rPr>
+          <w:rFonts w:ascii="Times New Roman" w:hAnsi="Times New Roman"/>
+          <w:sz w:val="22"/>
+        </w:rPr>
+        <w:t xml:space="preserve">2022</w:t>
+      </w:r>
+      <w:r>
+        <w:rPr>
+          <w:rFonts w:ascii="Times New Roman" w:hAnsi="Times New Roman"/>
+          <w:sz w:val="22"/>
+        </w:rPr>
+        <w:tab/>
+      </w:r>
+      <w:r>
+        <w:rPr>
+          <w:rFonts w:ascii="Times New Roman" w:hAnsi="Times New Roman" w:cs="Times New Roman"/>
+          <w:color w:val="000000" w:themeColor="text1"/>
+          <w:u w:val="single"/>
+        </w:rPr>
+        <w:t xml:space="preserve">MD Anderson, Alfred G. Knudson Jr. Outstanding Dissertation Award</w:t>
+      </w:r>
+      <w:r>
+        <w:rPr>
+          <w:rFonts w:ascii="Times New Roman" w:hAnsi="Times New Roman" w:cs="Times New Roman"/>
+          <w:color w:val="000000" w:themeColor="text1"/>
+        </w:rPr>
+        <w:t xml:space="preserve">: $5,000 Award established by MD Anderson Cancer Center to honor the late Dr. Knudson in recognition of the top selected PhD dissertation.</w:t>
+      </w:r>
+    </w:p>
+    <w:p>
+      <w:pPr>
+        <w:tabs>
+          <w:tab w:val="left" w:pos="2016"/>
+        </w:tabs>
+        <w:spacing w:after="60"/>
+        <w:ind w:left="2016" w:hanging="2016"/>
+      </w:pPr>
+      <w:r>
+        <w:rPr>
+          <w:rFonts w:ascii="Times New Roman" w:hAnsi="Times New Roman"/>
+          <w:sz w:val="22"/>
+        </w:rPr>
+        <w:t xml:space="preserve">2021</w:t>
+      </w:r>
+      <w:r>
+        <w:rPr>
+          <w:rFonts w:ascii="Times New Roman" w:hAnsi="Times New Roman"/>
+          <w:sz w:val="22"/>
+        </w:rPr>
+        <w:tab/>
+      </w:r>
+      <w:r>
+        <w:rPr>
+          <w:rFonts w:ascii="Times New Roman" w:hAnsi="Times New Roman" w:cs="Times New Roman"/>
+          <w:color w:val="000000" w:themeColor="text1"/>
+          <w:u w:val="single"/>
+        </w:rPr>
+        <w:t xml:space="preserve">AAPM Practical Big Data Workshop, Early Career Investigator – Impact Award</w:t>
+      </w:r>
+    </w:p>
+    <w:p>
+      <w:pPr>
+        <w:tabs>
+          <w:tab w:val="left" w:pos="2016"/>
+        </w:tabs>
+        <w:spacing w:after="60"/>
+        <w:ind w:left="2016" w:hanging="2016"/>
+      </w:pPr>
+      <w:r>
+        <w:rPr>
+          <w:rFonts w:ascii="Times New Roman" w:hAnsi="Times New Roman"/>
+          <w:sz w:val="22"/>
+        </w:rPr>
+        <w:t xml:space="preserve">2019</w:t>
+      </w:r>
+      <w:r>
+        <w:rPr>
+          <w:rFonts w:ascii="Times New Roman" w:hAnsi="Times New Roman"/>
+          <w:sz w:val="22"/>
+        </w:rPr>
+        <w:tab/>
+      </w:r>
+      <w:r>
+        <w:rPr>
+          <w:rFonts w:ascii="Times New Roman" w:hAnsi="Times New Roman" w:cs="Times New Roman"/>
+          <w:color w:val="000000" w:themeColor="text1"/>
+          <w:u w:val="single"/>
         </w:rPr>
         <w:t xml:space="preserve">MD Anderson, Association of Science Communication (ASC) Oral Competition 1</w:t>
       </w:r>
@@ -1900,6 +2307,7 @@
           <w:rFonts w:ascii="Times New Roman" w:hAnsi="Times New Roman" w:cs="Times New Roman"/>
           <w:color w:val="000000" w:themeColor="text1"/>
           <w:vertAlign w:val="superscript"/>
+          <w:u w:val="single"/>
         </w:rPr>
         <w:t>st</w:t>
       </w:r>
@@ -1907,60 +2315,121 @@
         <w:rPr>
           <w:rFonts w:ascii="Times New Roman" w:hAnsi="Times New Roman" w:cs="Times New Roman"/>
           <w:color w:val="000000" w:themeColor="text1"/>
-        </w:rPr>
-        <w:t xml:space="preserve"> place: ‘Why is scientific communication important?’ (2019)</w:t>
-      </w:r>
-    </w:p>
-    <w:p>
-      <w:pPr>
-        <w:keepNext/>
-        <w:keepLines/>
-        <w:spacing w:after="60" w:line="240" w:lineRule="auto"/>
-        <w:rPr>
-          <w:rFonts w:ascii="Times New Roman" w:hAnsi="Times New Roman" w:cs="Times New Roman"/>
-          <w:color w:val="000000" w:themeColor="text1"/>
-        </w:rPr>
-      </w:pPr>
-      <w:r>
-        <w:rPr>
-          <w:rFonts w:ascii="Times New Roman" w:hAnsi="Times New Roman" w:cs="Times New Roman"/>
-          <w:color w:val="000000" w:themeColor="text1"/>
-        </w:rPr>
-        <w:t xml:space="preserve">AAPM, Science Council Session “Deep Learning for Rapid Deformable Image Registration of Liver CT Scans” (2019)</w:t>
-      </w:r>
-    </w:p>
-    <w:p>
-      <w:pPr>
-        <w:keepNext/>
-        <w:keepLines/>
-        <w:spacing w:after="60" w:line="240" w:lineRule="auto"/>
-        <w:rPr>
-          <w:rFonts w:ascii="Times New Roman" w:hAnsi="Times New Roman" w:cs="Times New Roman"/>
-          <w:color w:val="000000" w:themeColor="text1"/>
-        </w:rPr>
-      </w:pPr>
-      <w:r>
-        <w:rPr>
-          <w:rFonts w:ascii="Times New Roman" w:hAnsi="Times New Roman" w:cs="Times New Roman"/>
-          <w:color w:val="000000" w:themeColor="text1"/>
-        </w:rPr>
-        <w:t xml:space="preserve">AAPM, People’s Choice Award for Medical Physics Slam: Monetary award for winning the people’s choice in presentation of research to a lay audience of non-medical physicists (2018)</w:t>
-      </w:r>
-    </w:p>
-    <w:p>
-      <w:pPr>
-        <w:keepNext/>
-        <w:keepLines/>
-        <w:spacing w:after="60" w:line="240" w:lineRule="auto"/>
-        <w:rPr>
-          <w:rFonts w:ascii="Times New Roman" w:hAnsi="Times New Roman" w:cs="Times New Roman"/>
-          <w:color w:val="000000" w:themeColor="text1"/>
-        </w:rPr>
-      </w:pPr>
-      <w:r>
-        <w:rPr>
-          <w:rFonts w:ascii="Times New Roman" w:hAnsi="Times New Roman" w:cs="Times New Roman"/>
-          <w:color w:val="000000" w:themeColor="text1"/>
+          <w:u w:val="single"/>
+        </w:rPr>
+        <w:t xml:space="preserve"> place</w:t>
+      </w:r>
+      <w:r>
+        <w:rPr>
+          <w:rFonts w:ascii="Times New Roman" w:hAnsi="Times New Roman" w:cs="Times New Roman"/>
+          <w:color w:val="000000" w:themeColor="text1"/>
+        </w:rPr>
+        <w:t xml:space="preserve">: ‘Why is scientific communication important?’</w:t>
+      </w:r>
+    </w:p>
+    <w:p>
+      <w:pPr>
+        <w:tabs>
+          <w:tab w:val="left" w:pos="2016"/>
+        </w:tabs>
+        <w:spacing w:after="60"/>
+        <w:ind w:left="2016" w:hanging="2016"/>
+      </w:pPr>
+      <w:r>
+        <w:rPr>
+          <w:rFonts w:ascii="Times New Roman" w:hAnsi="Times New Roman"/>
+          <w:sz w:val="22"/>
+        </w:rPr>
+        <w:t xml:space="preserve">2019</w:t>
+      </w:r>
+      <w:r>
+        <w:rPr>
+          <w:rFonts w:ascii="Times New Roman" w:hAnsi="Times New Roman"/>
+          <w:sz w:val="22"/>
+        </w:rPr>
+        <w:tab/>
+      </w:r>
+      <w:r>
+        <w:rPr>
+          <w:rFonts w:ascii="Times New Roman" w:hAnsi="Times New Roman" w:cs="Times New Roman"/>
+          <w:color w:val="000000" w:themeColor="text1"/>
+          <w:u w:val="single"/>
+        </w:rPr>
+        <w:t xml:space="preserve">AAPM, Science Council Session</w:t>
+      </w:r>
+      <w:r>
+        <w:rPr>
+          <w:rFonts w:ascii="Times New Roman" w:hAnsi="Times New Roman" w:cs="Times New Roman"/>
+          <w:color w:val="000000" w:themeColor="text1"/>
+        </w:rPr>
+        <w:t xml:space="preserve"> “Deep Learning for Rapid Deformable Image Registration of Liver CT Scans”</w:t>
+      </w:r>
+    </w:p>
+    <w:p>
+      <w:pPr>
+        <w:tabs>
+          <w:tab w:val="left" w:pos="2016"/>
+        </w:tabs>
+        <w:spacing w:after="60"/>
+        <w:ind w:left="2016" w:hanging="2016"/>
+      </w:pPr>
+      <w:r>
+        <w:rPr>
+          <w:rFonts w:ascii="Times New Roman" w:hAnsi="Times New Roman"/>
+          <w:sz w:val="22"/>
+        </w:rPr>
+        <w:t xml:space="preserve">2018</w:t>
+      </w:r>
+      <w:r>
+        <w:rPr>
+          <w:rFonts w:ascii="Times New Roman" w:hAnsi="Times New Roman"/>
+          <w:sz w:val="22"/>
+        </w:rPr>
+        <w:tab/>
+      </w:r>
+      <w:r>
+        <w:rPr>
+          <w:rFonts w:ascii="Times New Roman" w:hAnsi="Times New Roman" w:cs="Times New Roman"/>
+          <w:color w:val="000000" w:themeColor="text1"/>
+          <w:u w:val="single"/>
+        </w:rPr>
+        <w:t xml:space="preserve">AAPM, People’s Choice Award for Medical Physics Slam</w:t>
+      </w:r>
+      <w:r>
+        <w:rPr>
+          <w:rFonts w:ascii="Times New Roman" w:hAnsi="Times New Roman" w:cs="Times New Roman"/>
+          <w:color w:val="000000" w:themeColor="text1"/>
+        </w:rPr>
+        <w:t xml:space="preserve">: Monetary award for winning the people’s choice in presentation of research to a lay audience of non-medical physicists</w:t>
+      </w:r>
+    </w:p>
+    <w:p>
+      <w:pPr>
+        <w:tabs>
+          <w:tab w:val="left" w:pos="2016"/>
+        </w:tabs>
+        <w:spacing w:after="60"/>
+        <w:ind w:left="2016" w:hanging="2016"/>
+      </w:pPr>
+      <w:r>
+        <w:rPr>
+          <w:rFonts w:ascii="Times New Roman" w:hAnsi="Times New Roman"/>
+          <w:sz w:val="22"/>
+        </w:rPr>
+        <w:t xml:space="preserve">2018</w:t>
+      </w:r>
+      <w:r>
+        <w:rPr>
+          <w:rFonts w:ascii="Times New Roman" w:hAnsi="Times New Roman"/>
+          <w:sz w:val="22"/>
+        </w:rPr>
+        <w:tab/>
+      </w:r>
+      <w:r>
+        <w:rPr>
+          <w:rFonts w:ascii="Times New Roman" w:hAnsi="Times New Roman" w:cs="Times New Roman"/>
+          <w:color w:val="000000" w:themeColor="text1"/>
+          <w:u w:val="single"/>
         </w:rPr>
         <w:t xml:space="preserve">Southwest AAPM, 1</w:t>
       </w:r>
@@ -1969,6 +2438,7 @@
           <w:rFonts w:ascii="Times New Roman" w:hAnsi="Times New Roman" w:cs="Times New Roman"/>
           <w:color w:val="000000" w:themeColor="text1"/>
           <w:vertAlign w:val="superscript"/>
+          <w:u w:val="single"/>
         </w:rPr>
         <w:t>st</w:t>
       </w:r>
@@ -1976,24 +2446,45 @@
         <w:rPr>
           <w:rFonts w:ascii="Times New Roman" w:hAnsi="Times New Roman" w:cs="Times New Roman"/>
           <w:color w:val="000000" w:themeColor="text1"/>
-        </w:rPr>
-        <w:t xml:space="preserve"> Place Medical Physics Slam: Challenge where students have 3 minutes to present their research to community members outside of the medical physics profession, received travel award to compete in the Medical Physics Slam in the annual meeting (2018)</w:t>
-      </w:r>
-    </w:p>
-    <w:p>
-      <w:pPr>
-        <w:keepNext/>
-        <w:keepLines/>
-        <w:spacing w:after="60" w:line="240" w:lineRule="auto"/>
-        <w:rPr>
-          <w:rFonts w:ascii="Times New Roman" w:hAnsi="Times New Roman" w:cs="Times New Roman"/>
-          <w:color w:val="000000" w:themeColor="text1"/>
-        </w:rPr>
-      </w:pPr>
-      <w:r>
-        <w:rPr>
-          <w:rFonts w:ascii="Times New Roman" w:hAnsi="Times New Roman" w:cs="Times New Roman"/>
-          <w:color w:val="000000" w:themeColor="text1"/>
+          <w:u w:val="single"/>
+        </w:rPr>
+        <w:t xml:space="preserve"> Place Medical Physics Slam</w:t>
+      </w:r>
+      <w:r>
+        <w:rPr>
+          <w:rFonts w:ascii="Times New Roman" w:hAnsi="Times New Roman" w:cs="Times New Roman"/>
+          <w:color w:val="000000" w:themeColor="text1"/>
+        </w:rPr>
+        <w:t xml:space="preserve">: Challenge where students have 3 minutes to present their research to community members outside of the medical physics profession, received travel award to compete in the Medical Physics Slam in the annual meeting</w:t>
+      </w:r>
+    </w:p>
+    <w:p>
+      <w:pPr>
+        <w:tabs>
+          <w:tab w:val="left" w:pos="2016"/>
+        </w:tabs>
+        <w:spacing w:after="60"/>
+        <w:ind w:left="2016" w:hanging="2016"/>
+      </w:pPr>
+      <w:r>
+        <w:rPr>
+          <w:rFonts w:ascii="Times New Roman" w:hAnsi="Times New Roman"/>
+          <w:sz w:val="22"/>
+        </w:rPr>
+        <w:t xml:space="preserve">2018</w:t>
+      </w:r>
+      <w:r>
+        <w:rPr>
+          <w:rFonts w:ascii="Times New Roman" w:hAnsi="Times New Roman"/>
+          <w:sz w:val="22"/>
+        </w:rPr>
+        <w:tab/>
+      </w:r>
+      <w:r>
+        <w:rPr>
+          <w:rFonts w:ascii="Times New Roman" w:hAnsi="Times New Roman" w:cs="Times New Roman"/>
+          <w:color w:val="000000" w:themeColor="text1"/>
+          <w:u w:val="single"/>
         </w:rPr>
         <w:t xml:space="preserve">Southwest AAPM 1</w:t>
       </w:r>
@@ -2002,6 +2493,7 @@
           <w:rFonts w:ascii="Times New Roman" w:hAnsi="Times New Roman" w:cs="Times New Roman"/>
           <w:color w:val="000000" w:themeColor="text1"/>
           <w:vertAlign w:val="superscript"/>
+          <w:u w:val="single"/>
         </w:rPr>
         <w:t>st</w:t>
       </w:r>
@@ -2009,42 +2501,83 @@
         <w:rPr>
           <w:rFonts w:ascii="Times New Roman" w:hAnsi="Times New Roman" w:cs="Times New Roman"/>
           <w:color w:val="000000" w:themeColor="text1"/>
-        </w:rPr>
-        <w:t xml:space="preserve"> Place Young Investigator Award: Monetary award from SWAAPM chapter for best work presented at SWAAPM (2018)</w:t>
-      </w:r>
-    </w:p>
-    <w:p>
-      <w:pPr>
-        <w:keepNext/>
-        <w:keepLines/>
-        <w:spacing w:after="60" w:line="240" w:lineRule="auto"/>
-        <w:rPr>
-          <w:rFonts w:ascii="Times New Roman" w:hAnsi="Times New Roman" w:cs="Times New Roman"/>
-          <w:color w:val="000000" w:themeColor="text1"/>
-        </w:rPr>
-      </w:pPr>
-      <w:r>
-        <w:rPr>
-          <w:rFonts w:ascii="Times New Roman" w:hAnsi="Times New Roman" w:cs="Times New Roman"/>
-          <w:color w:val="000000" w:themeColor="text1"/>
-        </w:rPr>
-        <w:t xml:space="preserve">Winter Institute of Medical Physics Early Career Medical Physicist Scholar: Travel and monetary award (2018)</w:t>
-      </w:r>
-    </w:p>
-    <w:p>
-      <w:pPr>
-        <w:keepNext/>
-        <w:keepLines/>
-        <w:spacing w:after="60" w:line="240" w:lineRule="auto"/>
-        <w:rPr>
-          <w:rFonts w:ascii="Times New Roman" w:hAnsi="Times New Roman" w:cs="Times New Roman"/>
-          <w:color w:val="000000" w:themeColor="text1"/>
-        </w:rPr>
-      </w:pPr>
-      <w:r>
-        <w:rPr>
-          <w:rFonts w:ascii="Times New Roman" w:hAnsi="Times New Roman" w:cs="Times New Roman"/>
-          <w:color w:val="000000" w:themeColor="text1"/>
+          <w:u w:val="single"/>
+        </w:rPr>
+        <w:t xml:space="preserve"> Place Young Investigator Award</w:t>
+      </w:r>
+      <w:r>
+        <w:rPr>
+          <w:rFonts w:ascii="Times New Roman" w:hAnsi="Times New Roman" w:cs="Times New Roman"/>
+          <w:color w:val="000000" w:themeColor="text1"/>
+        </w:rPr>
+        <w:t xml:space="preserve">: Monetary award from SWAAPM chapter for best work presented at SWAAPM</w:t>
+      </w:r>
+    </w:p>
+    <w:p>
+      <w:pPr>
+        <w:tabs>
+          <w:tab w:val="left" w:pos="2016"/>
+        </w:tabs>
+        <w:spacing w:after="60"/>
+        <w:ind w:left="2016" w:hanging="2016"/>
+      </w:pPr>
+      <w:r>
+        <w:rPr>
+          <w:rFonts w:ascii="Times New Roman" w:hAnsi="Times New Roman"/>
+          <w:sz w:val="22"/>
+        </w:rPr>
+        <w:t xml:space="preserve">2018</w:t>
+      </w:r>
+      <w:r>
+        <w:rPr>
+          <w:rFonts w:ascii="Times New Roman" w:hAnsi="Times New Roman"/>
+          <w:sz w:val="22"/>
+        </w:rPr>
+        <w:tab/>
+      </w:r>
+      <w:r>
+        <w:rPr>
+          <w:rFonts w:ascii="Times New Roman" w:hAnsi="Times New Roman" w:cs="Times New Roman"/>
+          <w:color w:val="000000" w:themeColor="text1"/>
+          <w:u w:val="single"/>
+        </w:rPr>
+        <w:t xml:space="preserve">Winter Institute of Medical Physics Early Career Medical Physicist Scholar</w:t>
+      </w:r>
+      <w:r>
+        <w:rPr>
+          <w:rFonts w:ascii="Times New Roman" w:hAnsi="Times New Roman" w:cs="Times New Roman"/>
+          <w:color w:val="000000" w:themeColor="text1"/>
+        </w:rPr>
+        <w:t xml:space="preserve">: Travel and monetary award</w:t>
+      </w:r>
+    </w:p>
+    <w:p>
+      <w:pPr>
+        <w:tabs>
+          <w:tab w:val="left" w:pos="2016"/>
+        </w:tabs>
+        <w:spacing w:after="60"/>
+        <w:ind w:left="2016" w:hanging="2016"/>
+      </w:pPr>
+      <w:r>
+        <w:rPr>
+          <w:rFonts w:ascii="Times New Roman" w:hAnsi="Times New Roman"/>
+          <w:sz w:val="22"/>
+        </w:rPr>
+        <w:t xml:space="preserve">2017</w:t>
+      </w:r>
+      <w:r>
+        <w:rPr>
+          <w:rFonts w:ascii="Times New Roman" w:hAnsi="Times New Roman"/>
+          <w:sz w:val="22"/>
+        </w:rPr>
+        <w:tab/>
+      </w:r>
+      <w:r>
+        <w:rPr>
+          <w:rFonts w:ascii="Times New Roman" w:hAnsi="Times New Roman" w:cs="Times New Roman"/>
+          <w:color w:val="000000" w:themeColor="text1"/>
+          <w:u w:val="single"/>
         </w:rPr>
         <w:t xml:space="preserve">MD Anderson, Summer Student Research Retreat, 2</w:t>
       </w:r>
@@ -2053,6 +2586,7 @@
           <w:rFonts w:ascii="Times New Roman" w:hAnsi="Times New Roman" w:cs="Times New Roman"/>
           <w:color w:val="000000" w:themeColor="text1"/>
           <w:vertAlign w:val="superscript"/>
+          <w:u w:val="single"/>
         </w:rPr>
         <w:t>nd</w:t>
       </w:r>
@@ -2060,26 +2594,116 @@
         <w:rPr>
           <w:rFonts w:ascii="Times New Roman" w:hAnsi="Times New Roman" w:cs="Times New Roman"/>
           <w:color w:val="000000" w:themeColor="text1"/>
-        </w:rPr>
-        <w:t xml:space="preserve"> Place: Students are invited to present their research for a monetary prize (2017)</w:t>
-      </w:r>
-    </w:p>
-    <w:p>
-      <w:pPr>
-        <w:keepNext/>
-        <w:keepLines/>
-        <w:spacing w:after="60" w:line="240" w:lineRule="auto"/>
-        <w:rPr>
-          <w:rFonts w:ascii="Times New Roman" w:hAnsi="Times New Roman" w:cs="Times New Roman"/>
-          <w:color w:val="000000" w:themeColor="text1"/>
-        </w:rPr>
-      </w:pPr>
-      <w:r>
-        <w:rPr>
-          <w:rFonts w:ascii="Times New Roman" w:hAnsi="Times New Roman" w:cs="Times New Roman"/>
-          <w:color w:val="000000" w:themeColor="text1"/>
-        </w:rPr>
-        <w:t xml:space="preserve">Georgia Institute of Technology, Graduation with Highest Honors (2015)</w:t>
+          <w:u w:val="single"/>
+        </w:rPr>
+        <w:t xml:space="preserve"> Place</w:t>
+      </w:r>
+      <w:r>
+        <w:rPr>
+          <w:rFonts w:ascii="Times New Roman" w:hAnsi="Times New Roman" w:cs="Times New Roman"/>
+          <w:color w:val="000000" w:themeColor="text1"/>
+        </w:rPr>
+        <w:t xml:space="preserve">: Students are invited to present their research for a monetary prize</w:t>
+      </w:r>
+    </w:p>
+    <w:p>
+      <w:pPr>
+        <w:tabs>
+          <w:tab w:val="left" w:pos="2016"/>
+        </w:tabs>
+        <w:spacing w:after="60"/>
+        <w:ind w:left="2016" w:hanging="2016"/>
+      </w:pPr>
+      <w:r>
+        <w:rPr>
+          <w:rFonts w:ascii="Times New Roman" w:hAnsi="Times New Roman"/>
+          <w:sz w:val="22"/>
+        </w:rPr>
+        <w:t xml:space="preserve">2015</w:t>
+      </w:r>
+      <w:r>
+        <w:rPr>
+          <w:rFonts w:ascii="Times New Roman" w:hAnsi="Times New Roman"/>
+          <w:sz w:val="22"/>
+        </w:rPr>
+        <w:tab/>
+      </w:r>
+      <w:r>
+        <w:rPr>
+          <w:rFonts w:ascii="Times New Roman" w:hAnsi="Times New Roman" w:cs="Times New Roman"/>
+          <w:color w:val="000000" w:themeColor="text1"/>
+          <w:u w:val="single"/>
+        </w:rPr>
+        <w:t xml:space="preserve">Georgia Institute of Technology, Graduation with Highest Honors</w:t>
+      </w:r>
+    </w:p>
+    <w:p>
+      <w:pPr>
+        <w:tabs>
+          <w:tab w:val="left" w:pos="2016"/>
+        </w:tabs>
+        <w:spacing w:after="60"/>
+        <w:ind w:left="2016" w:hanging="2016"/>
+      </w:pPr>
+      <w:r>
+        <w:rPr>
+          <w:rFonts w:ascii="Times New Roman" w:hAnsi="Times New Roman"/>
+          <w:sz w:val="22"/>
+        </w:rPr>
+        <w:t xml:space="preserve">2014</w:t>
+      </w:r>
+      <w:r>
+        <w:rPr>
+          <w:rFonts w:ascii="Times New Roman" w:hAnsi="Times New Roman"/>
+          <w:sz w:val="22"/>
+        </w:rPr>
+        <w:tab/>
+      </w:r>
+      <w:r>
+        <w:rPr>
+          <w:rFonts w:ascii="Times New Roman" w:hAnsi="Times New Roman" w:cs="Times New Roman"/>
+          <w:color w:val="000000" w:themeColor="text1"/>
+          <w:u w:val="single"/>
+        </w:rPr>
+        <w:t xml:space="preserve">Georgia Institute of Technology, Presidents Undergraduate Research Award (PURA)</w:t>
+      </w:r>
+      <w:r>
+        <w:rPr>
+          <w:rFonts w:ascii="Times New Roman" w:hAnsi="Times New Roman" w:cs="Times New Roman"/>
+          <w:color w:val="000000" w:themeColor="text1"/>
+        </w:rPr>
+        <w:t xml:space="preserve">: Research studying radio resistivity of CHO cell lines, dependent on cell cycle phase</w:t>
+      </w:r>
+    </w:p>
+    <w:p>
+      <w:pPr>
+        <w:pStyle w:val="Heading1"/>
+        <w:keepLines/>
+        <w:spacing w:after="120"/>
+        <w:rPr>
+          <w:rFonts w:cs="Times New Roman"/>
+          <w:color w:val="000000" w:themeColor="text1"/>
+        </w:rPr>
+      </w:pPr>
+      <w:r>
+        <w:rPr>
+          <w:rFonts w:cs="Times New Roman"/>
+          <w:color w:val="000000" w:themeColor="text1"/>
+        </w:rPr>
+        <w:t>Research Experience</w:t>
+      </w:r>
+    </w:p>
+    <w:p>
+      <w:pPr>
+        <w:spacing w:before="80" w:after="40"/>
+      </w:pPr>
+      <w:r>
+        <w:rPr>
+          <w:rFonts w:ascii="Times New Roman" w:hAnsi="Times New Roman"/>
+          <w:b/>
+          <w:u w:val="single"/>
+        </w:rPr>
+        <w:t>University of California, San Diego</w:t>
       </w:r>
     </w:p>
     <w:p>
@@ -2097,25 +2721,25 @@
           <w:rFonts w:ascii="Times New Roman" w:hAnsi="Times New Roman" w:cs="Times New Roman"/>
           <w:color w:val="000000" w:themeColor="text1"/>
         </w:rPr>
-        <w:t xml:space="preserve">Georgia Institute of Technology, Presidents Undergraduate Research Award (PURA): Research studying radio resistivity of CHO cell lines, dependent on cell cycle phase (2014)</w:t>
-      </w:r>
-    </w:p>
-    <w:p>
-      <w:pPr>
-        <w:pStyle w:val="Heading1"/>
-        <w:keepLines/>
-        <w:spacing w:after="120"/>
-        <w:rPr>
-          <w:rFonts w:cs="Times New Roman"/>
-          <w:color w:val="000000" w:themeColor="text1"/>
-        </w:rPr>
-      </w:pPr>
-      <w:r>
-        <w:rPr>
-          <w:rFonts w:cs="Times New Roman"/>
-          <w:color w:val="000000" w:themeColor="text1"/>
-        </w:rPr>
-        <w:t>Research Experience</w:t>
+        <w:t>Clinical Activity Web Suite: Designed and deployed a suite of services and dashboards that surface the department's treatment planning workflow as analyzable data. A query service polls the ARIA database and feeds panel-based activity dashboards, a configurable alert-rule engine, and automated notification of dosimetrists, physicians, and clinical chiefs when patients fall behind schedule or miss essential care tasks.</w:t>
+      </w:r>
+    </w:p>
+    <w:p>
+      <w:pPr>
+        <w:keepNext/>
+        <w:keepLines/>
+        <w:spacing w:after="120" w:line="240" w:lineRule="auto"/>
+        <w:rPr>
+          <w:rFonts w:ascii="Times New Roman" w:hAnsi="Times New Roman" w:cs="Times New Roman"/>
+          <w:color w:val="000000" w:themeColor="text1"/>
+        </w:rPr>
+      </w:pPr>
+      <w:r>
+        <w:rPr>
+          <w:rFonts w:ascii="Times New Roman" w:hAnsi="Times New Roman" w:cs="Times New Roman"/>
+          <w:color w:val="000000" w:themeColor="text1"/>
+        </w:rPr>
+        <w:t>Chair of Technical Innovation and Implementation: Directing departmental strategy for in-house software development and clinical deployment across Radiation Medicine &amp; Applied Sciences. Established the Technical Integration Catalog, a searchable inventory of every software tool the department has built: 66 projects at launch (2026), with automated monthly reconciliation. This ensures that existing work is found rather than rebuilt and single-maintainer risk is visible. Establishing minimum development standards, a validation and release process for clinical-facing tools aligned with AAPM guidance on in-house software QA, and PHI-handling guardrails for AI-assisted development.</w:t>
       </w:r>
     </w:p>
     <w:p>
@@ -2128,7 +2752,7 @@
           <w:b/>
           <w:u w:val="single"/>
         </w:rPr>
-        <w:t>University of California, San Diego</w:t>
+        <w:t>University of North Carolina, Chapel Hill</w:t>
       </w:r>
     </w:p>
     <w:p>
@@ -2146,7 +2770,7 @@
           <w:rFonts w:ascii="Times New Roman" w:hAnsi="Times New Roman" w:cs="Times New Roman"/>
           <w:color w:val="000000" w:themeColor="text1"/>
         </w:rPr>
-        <w:t>Clinical Activity Web Suite: Designed and deployed a suite of services and dashboards that surface the department's treatment planning workflow as analyzable data. A query service polls the ARIA database and feeds panel-based activity dashboards, a configurable alert-rule engine, and automated notification of dosimetrists, physicians, and clinical chiefs when patients fall behind schedule or miss essential care tasks.</w:t>
+        <w:t>Research focused on improving patient safety throughout the radiation oncology treatment planning process. Patient quality and safety improvements within the AHRQ grant. Part of this work is also in implementing automated treatment checks ‘DosCheck’ to provide added support to the dosimetrists and physicists.</w:t>
       </w:r>
     </w:p>
     <w:p>
@@ -2164,7 +2788,7 @@
           <w:rFonts w:ascii="Times New Roman" w:hAnsi="Times New Roman" w:cs="Times New Roman"/>
           <w:color w:val="000000" w:themeColor="text1"/>
         </w:rPr>
-        <w:t>Chair of Technical Innovation and Implementation: Directing departmental strategy for in-house software development and clinical deployment across Radiation Medicine &amp; Applied Sciences. Established the Technical Integration Catalog, a searchable inventory of every software tool the department has built: 66 projects at launch (2026), with automated monthly reconciliation. This ensures that existing work is found rather than rebuilt and single-maintainer risk is visible. Establishing minimum development standards, a validation and release process for clinical-facing tools aligned with AAPM guidance on in-house software QA, and PHI-handling guardrails for AI-assisted development.</w:t>
+        <w:t>Created a new data architecture which represents all aspects of a patient’s radiation plan (dose-volume histograms, region-of-interest volumes, treatment beams, modalities) in a dramatically compressed form. This architecture facilitates rapid information gathering for curating a specific dataset and answering clinical questions.</w:t>
       </w:r>
     </w:p>
     <w:p>
@@ -2177,74 +2801,45 @@
           <w:b/>
           <w:u w:val="single"/>
         </w:rPr>
-        <w:t>University of North Carolina, Chapel Hill</w:t>
-      </w:r>
-    </w:p>
-    <w:p>
-      <w:pPr>
-        <w:keepNext/>
-        <w:keepLines/>
-        <w:spacing w:after="120" w:line="240" w:lineRule="auto"/>
-        <w:rPr>
-          <w:rFonts w:ascii="Times New Roman" w:hAnsi="Times New Roman" w:cs="Times New Roman"/>
-          <w:color w:val="000000" w:themeColor="text1"/>
-        </w:rPr>
-      </w:pPr>
-      <w:r>
-        <w:rPr>
-          <w:rFonts w:ascii="Times New Roman" w:hAnsi="Times New Roman" w:cs="Times New Roman"/>
-          <w:color w:val="000000" w:themeColor="text1"/>
-        </w:rPr>
-        <w:t>Research focused on improving patient safety throughout the radiation oncology treatment planning process. Patient quality and safety improvements within the AHRQ grant. Part of this work is also in implementing automated treatment checks ‘DosCheck’ to provide added support to the dosimetrists and physicists.</w:t>
-      </w:r>
-    </w:p>
-    <w:p>
-      <w:pPr>
-        <w:keepNext/>
-        <w:keepLines/>
-        <w:spacing w:after="120" w:line="240" w:lineRule="auto"/>
-        <w:rPr>
-          <w:rFonts w:ascii="Times New Roman" w:hAnsi="Times New Roman" w:cs="Times New Roman"/>
-          <w:color w:val="000000" w:themeColor="text1"/>
-        </w:rPr>
-      </w:pPr>
-      <w:r>
-        <w:rPr>
-          <w:rFonts w:ascii="Times New Roman" w:hAnsi="Times New Roman" w:cs="Times New Roman"/>
-          <w:color w:val="000000" w:themeColor="text1"/>
-        </w:rPr>
-        <w:t>Created a new data architecture which represents all aspects of a patient’s radiation plan (dose-volume histograms, region-of-interest volumes, treatment beams, modalities) in a dramatically compressed form. This architecture facilitates rapid information gathering for curating a specific dataset and answering clinical questions.</w:t>
-      </w:r>
-    </w:p>
-    <w:p>
-      <w:pPr>
-        <w:spacing w:before="80" w:after="40"/>
-      </w:pPr>
-      <w:r>
-        <w:rPr>
-          <w:rFonts w:ascii="Times New Roman" w:hAnsi="Times New Roman"/>
-          <w:b/>
+        <w:t>MD Anderson Cancer Center</w:t>
+      </w:r>
+    </w:p>
+    <w:p>
+      <w:pPr>
+        <w:tabs>
+          <w:tab w:val="left" w:pos="2016"/>
+        </w:tabs>
+        <w:spacing w:after="60"/>
+        <w:ind w:left="2016" w:hanging="2016"/>
+      </w:pPr>
+      <w:r>
+        <w:rPr>
+          <w:rFonts w:ascii="Times New Roman" w:hAnsi="Times New Roman"/>
+          <w:sz w:val="22"/>
+        </w:rPr>
+        <w:t xml:space="preserve">2017 – 2021</w:t>
+      </w:r>
+      <w:r>
+        <w:rPr>
+          <w:rFonts w:ascii="Times New Roman" w:hAnsi="Times New Roman"/>
+          <w:sz w:val="22"/>
+        </w:rPr>
+        <w:tab/>
+      </w:r>
+      <w:r>
+        <w:rPr>
+          <w:rFonts w:ascii="Times New Roman" w:hAnsi="Times New Roman" w:cs="Times New Roman"/>
+          <w:color w:val="000000" w:themeColor="text1"/>
           <w:u w:val="single"/>
         </w:rPr>
-        <w:t>MD Anderson Cancer Center</w:t>
-      </w:r>
-    </w:p>
-    <w:p>
-      <w:pPr>
-        <w:keepNext/>
-        <w:keepLines/>
-        <w:spacing w:after="120" w:line="240" w:lineRule="auto"/>
-        <w:rPr>
-          <w:rFonts w:ascii="Times New Roman" w:hAnsi="Times New Roman" w:cs="Times New Roman"/>
-          <w:color w:val="000000" w:themeColor="text1"/>
-        </w:rPr>
-      </w:pPr>
-      <w:r>
-        <w:rPr>
-          <w:rFonts w:ascii="Times New Roman" w:hAnsi="Times New Roman" w:cs="Times New Roman"/>
-          <w:color w:val="000000" w:themeColor="text1"/>
-        </w:rPr>
-        <w:t xml:space="preserve">PhD Dissertation: “Improving Treatment of Local Liver Ablation Therapy with Deep Learning and Biomechanical Modeling” </w:t>
+        <w:t xml:space="preserve">PhD Dissertation</w:t>
+      </w:r>
+      <w:r>
+        <w:rPr>
+          <w:rFonts w:ascii="Times New Roman" w:hAnsi="Times New Roman" w:cs="Times New Roman"/>
+          <w:color w:val="000000" w:themeColor="text1"/>
+        </w:rPr>
+        <w:t xml:space="preserve">: “Improving Treatment of Local Liver Ablation Therapy with Deep Learning and Biomechanical Modeling” </w:t>
       </w:r>
       <w:hyperlink r:id="rId7" w:history="1">
         <w:r>
@@ -2260,27 +2855,46 @@
           <w:rFonts w:ascii="Times New Roman" w:hAnsi="Times New Roman" w:cs="Times New Roman"/>
           <w:color w:val="000000" w:themeColor="text1"/>
         </w:rPr>
-        <w:t xml:space="preserve"> (2017-2011)</w:t>
         <w:br/>
         <w:t xml:space="preserve">This work was largely focused on providing tools to improve needle guidance during local liver ablation therapy, and improving ablation assessment in a manner conducive to immediate additional ablation during the surgical procedure. This work directly led to the creation and success of a Phase 2 Clinal Trial (NCT04083378).</w:t>
       </w:r>
     </w:p>
     <w:p>
       <w:pPr>
-        <w:keepNext/>
-        <w:keepLines/>
-        <w:spacing w:after="120" w:line="240" w:lineRule="auto"/>
-        <w:rPr>
-          <w:rFonts w:ascii="Times New Roman" w:hAnsi="Times New Roman" w:cs="Times New Roman"/>
-          <w:color w:val="000000" w:themeColor="text1"/>
-        </w:rPr>
-      </w:pPr>
-      <w:r>
-        <w:rPr>
-          <w:rFonts w:ascii="Times New Roman" w:hAnsi="Times New Roman" w:cs="Times New Roman"/>
-          <w:color w:val="000000" w:themeColor="text1"/>
-        </w:rPr>
-        <w:t xml:space="preserve">Master’s Thesis: </w:t>
+        <w:tabs>
+          <w:tab w:val="left" w:pos="2016"/>
+        </w:tabs>
+        <w:spacing w:after="60"/>
+        <w:ind w:left="2016" w:hanging="2016"/>
+      </w:pPr>
+      <w:r>
+        <w:rPr>
+          <w:rFonts w:ascii="Times New Roman" w:hAnsi="Times New Roman"/>
+          <w:sz w:val="22"/>
+        </w:rPr>
+        <w:t xml:space="preserve">2015 – 2017</w:t>
+      </w:r>
+      <w:r>
+        <w:rPr>
+          <w:rFonts w:ascii="Times New Roman" w:hAnsi="Times New Roman"/>
+          <w:sz w:val="22"/>
+        </w:rPr>
+        <w:tab/>
+      </w:r>
+      <w:r>
+        <w:rPr>
+          <w:rFonts w:ascii="Times New Roman" w:hAnsi="Times New Roman" w:cs="Times New Roman"/>
+          <w:color w:val="000000" w:themeColor="text1"/>
+          <w:u w:val="single"/>
+        </w:rPr>
+        <w:t xml:space="preserve">Master’s Thesis</w:t>
+      </w:r>
+      <w:r>
+        <w:rPr>
+          <w:rFonts w:ascii="Times New Roman" w:hAnsi="Times New Roman" w:cs="Times New Roman"/>
+          <w:color w:val="000000" w:themeColor="text1"/>
+        </w:rPr>
+        <w:t xml:space="preserve">: </w:t>
       </w:r>
       <w:r>
         <w:rPr>
@@ -2289,13 +2903,6 @@
           <w:shd w:val="clear" w:color="auto" w:fill="FFFFFF"/>
         </w:rPr>
         <w:t xml:space="preserve">Computer-Aided Detection of Pathologically Enlarged Lymph Nodes on Non-Contrast CT in Cervical Cancer Patients for Low-Resource Settings</w:t>
-      </w:r>
-      <w:r>
-        <w:rPr>
-          <w:rFonts w:ascii="Times New Roman" w:hAnsi="Times New Roman" w:cs="Times New Roman"/>
-          <w:color w:val="000000" w:themeColor="text1"/>
-        </w:rPr>
-        <w:t xml:space="preserve"> (2015-2017)</w:t>
       </w:r>
     </w:p>
     <w:p>
@@ -7300,6 +7907,158 @@
     </w:p>
     <w:p>
       <w:pPr>
+        <w:tabs>
+          <w:tab w:val="left" w:pos="2016"/>
+        </w:tabs>
+        <w:spacing w:after="60"/>
+        <w:ind w:left="2016" w:hanging="2016"/>
+      </w:pPr>
+      <w:r>
+        <w:rPr>
+          <w:rFonts w:ascii="Times New Roman" w:hAnsi="Times New Roman"/>
+          <w:sz w:val="22"/>
+        </w:rPr>
+        <w:t xml:space="preserve">2022</w:t>
+      </w:r>
+      <w:r>
+        <w:rPr>
+          <w:rFonts w:ascii="Times New Roman" w:hAnsi="Times New Roman"/>
+          <w:sz w:val="22"/>
+        </w:rPr>
+        <w:tab/>
+      </w:r>
+      <w:r>
+        <w:rPr>
+          <w:rFonts w:ascii="Times New Roman" w:hAnsi="Times New Roman" w:cs="Times New Roman"/>
+          <w:color w:val="000000" w:themeColor="text1"/>
+          <w:u w:val="single"/>
+        </w:rPr>
+        <w:t xml:space="preserve">UCSD Patient Communication for Medical Physicists Workshop</w:t>
+      </w:r>
+      <w:r>
+        <w:rPr>
+          <w:rFonts w:ascii="Times New Roman" w:hAnsi="Times New Roman" w:cs="Times New Roman"/>
+          <w:color w:val="000000" w:themeColor="text1"/>
+        </w:rPr>
+        <w:t xml:space="preserve">: Two-day workshop focused on improving communication skills with physicists and patients. Paid actors simulated treatment meetings for patients receiving breast and prostate therapy</w:t>
+      </w:r>
+    </w:p>
+    <w:p>
+      <w:pPr>
+        <w:tabs>
+          <w:tab w:val="left" w:pos="2016"/>
+        </w:tabs>
+        <w:spacing w:after="60"/>
+        <w:ind w:left="2016" w:hanging="2016"/>
+      </w:pPr>
+      <w:r>
+        <w:rPr>
+          <w:rFonts w:ascii="Times New Roman" w:hAnsi="Times New Roman"/>
+          <w:sz w:val="22"/>
+        </w:rPr>
+        <w:t xml:space="preserve">2019</w:t>
+      </w:r>
+      <w:r>
+        <w:rPr>
+          <w:rFonts w:ascii="Times New Roman" w:hAnsi="Times New Roman"/>
+          <w:sz w:val="22"/>
+        </w:rPr>
+        <w:tab/>
+      </w:r>
+      <w:r>
+        <w:rPr>
+          <w:rFonts w:ascii="Times New Roman" w:hAnsi="Times New Roman" w:cs="Times New Roman"/>
+          <w:color w:val="000000" w:themeColor="text1"/>
+          <w:u w:val="single"/>
+        </w:rPr>
+        <w:t xml:space="preserve">European Society of Interventional Radiology</w:t>
+      </w:r>
+      <w:r>
+        <w:rPr>
+          <w:rFonts w:ascii="Times New Roman" w:hAnsi="Times New Roman" w:cs="Times New Roman"/>
+          <w:color w:val="000000" w:themeColor="text1"/>
+        </w:rPr>
+        <w:t xml:space="preserve">: Reliability in Percutaneous Tumour Ablation.</w:t>
+      </w:r>
+    </w:p>
+    <w:p>
+      <w:pPr>
+        <w:tabs>
+          <w:tab w:val="left" w:pos="2016"/>
+        </w:tabs>
+        <w:spacing w:after="60"/>
+        <w:ind w:left="2016" w:hanging="2016"/>
+      </w:pPr>
+      <w:r>
+        <w:rPr>
+          <w:rFonts w:ascii="Times New Roman" w:hAnsi="Times New Roman"/>
+          <w:sz w:val="22"/>
+        </w:rPr>
+        <w:t xml:space="preserve">2019</w:t>
+      </w:r>
+      <w:r>
+        <w:rPr>
+          <w:rFonts w:ascii="Times New Roman" w:hAnsi="Times New Roman"/>
+          <w:sz w:val="22"/>
+        </w:rPr>
+        <w:tab/>
+      </w:r>
+      <w:r>
+        <w:rPr>
+          <w:rFonts w:ascii="Times New Roman" w:hAnsi="Times New Roman" w:cs="Times New Roman"/>
+          <w:color w:val="000000" w:themeColor="text1"/>
+          <w:u w:val="single"/>
+        </w:rPr>
+        <w:t xml:space="preserve">MD Anderson, Gulf Coast Consortia workshop, Rigor and Reproducibility</w:t>
+      </w:r>
+      <w:r>
+        <w:rPr>
+          <w:rFonts w:ascii="Times New Roman" w:hAnsi="Times New Roman" w:cs="Times New Roman"/>
+          <w:color w:val="000000" w:themeColor="text1"/>
+        </w:rPr>
+        <w:t xml:space="preserve">: instructing researchers on the importance of robust research with unbiased analysis and reporting of results.</w:t>
+      </w:r>
+    </w:p>
+    <w:p>
+      <w:pPr>
+        <w:tabs>
+          <w:tab w:val="left" w:pos="2016"/>
+        </w:tabs>
+        <w:spacing w:after="60"/>
+        <w:ind w:left="2016" w:hanging="2016"/>
+      </w:pPr>
+      <w:r>
+        <w:rPr>
+          <w:rFonts w:ascii="Times New Roman" w:hAnsi="Times New Roman"/>
+          <w:sz w:val="22"/>
+        </w:rPr>
+        <w:t xml:space="preserve">2018</w:t>
+      </w:r>
+      <w:r>
+        <w:rPr>
+          <w:rFonts w:ascii="Times New Roman" w:hAnsi="Times New Roman"/>
+          <w:sz w:val="22"/>
+        </w:rPr>
+        <w:tab/>
+      </w:r>
+      <w:r>
+        <w:rPr>
+          <w:rFonts w:ascii="Times New Roman" w:hAnsi="Times New Roman" w:cs="Times New Roman"/>
+          <w:color w:val="000000" w:themeColor="text1"/>
+          <w:u w:val="single"/>
+        </w:rPr>
+        <w:t xml:space="preserve">BigData4Imaging</w:t>
+      </w:r>
+      <w:r>
+        <w:rPr>
+          <w:rFonts w:ascii="Times New Roman" w:hAnsi="Times New Roman" w:cs="Times New Roman"/>
+          <w:color w:val="000000" w:themeColor="text1"/>
+        </w:rPr>
+        <w:t xml:space="preserve">: Conference and workshop for training in machine and deep learning</w:t>
+      </w:r>
+    </w:p>
+    <w:p>
+      <w:pPr>
         <w:keepNext/>
         <w:keepLines/>
         <w:spacing w:after="120" w:line="240" w:lineRule="auto"/>
@@ -7308,78 +8067,6 @@
           <w:color w:val="000000" w:themeColor="text1"/>
         </w:rPr>
       </w:pPr>
-      <w:r>
-        <w:rPr>
-          <w:rFonts w:ascii="Times New Roman" w:hAnsi="Times New Roman" w:cs="Times New Roman"/>
-          <w:color w:val="000000" w:themeColor="text1"/>
-        </w:rPr>
-        <w:t xml:space="preserve">UCSD Patient Communication for Medical Physicists Workshop: Two-day workshop focused on improving communication skills with physicists and patients. Paid actors simulated treatment meetings for patients receiving breast and prostate therapy (2022)</w:t>
-      </w:r>
-    </w:p>
-    <w:p>
-      <w:pPr>
-        <w:keepNext/>
-        <w:keepLines/>
-        <w:spacing w:after="120" w:line="240" w:lineRule="auto"/>
-        <w:rPr>
-          <w:rFonts w:ascii="Times New Roman" w:hAnsi="Times New Roman" w:cs="Times New Roman"/>
-          <w:color w:val="000000" w:themeColor="text1"/>
-        </w:rPr>
-      </w:pPr>
-      <w:r>
-        <w:rPr>
-          <w:rFonts w:ascii="Times New Roman" w:hAnsi="Times New Roman" w:cs="Times New Roman"/>
-          <w:color w:val="000000" w:themeColor="text1"/>
-        </w:rPr>
-        <w:t>European Society of Interventional Radiology: Reliability in Percutaneous Tumour Ablation. (2019)</w:t>
-      </w:r>
-    </w:p>
-    <w:p>
-      <w:pPr>
-        <w:keepNext/>
-        <w:keepLines/>
-        <w:spacing w:after="120" w:line="240" w:lineRule="auto"/>
-        <w:rPr>
-          <w:rFonts w:ascii="Times New Roman" w:hAnsi="Times New Roman" w:cs="Times New Roman"/>
-          <w:color w:val="000000" w:themeColor="text1"/>
-        </w:rPr>
-      </w:pPr>
-      <w:r>
-        <w:rPr>
-          <w:rFonts w:ascii="Times New Roman" w:hAnsi="Times New Roman" w:cs="Times New Roman"/>
-          <w:color w:val="000000" w:themeColor="text1"/>
-        </w:rPr>
-        <w:t xml:space="preserve">MD Anderson, Gulf Coast Consortia workshop, Rigor and Reproducibility: instructing researchers on the importance of robust research with unbiased analysis and reporting of results. (2019)</w:t>
-      </w:r>
-    </w:p>
-    <w:p>
-      <w:pPr>
-        <w:keepNext/>
-        <w:keepLines/>
-        <w:spacing w:after="120" w:line="240" w:lineRule="auto"/>
-        <w:rPr>
-          <w:rFonts w:ascii="Times New Roman" w:hAnsi="Times New Roman" w:cs="Times New Roman"/>
-          <w:color w:val="000000" w:themeColor="text1"/>
-        </w:rPr>
-      </w:pPr>
-      <w:r>
-        <w:rPr>
-          <w:rFonts w:ascii="Times New Roman" w:hAnsi="Times New Roman" w:cs="Times New Roman"/>
-          <w:color w:val="000000" w:themeColor="text1"/>
-        </w:rPr>
-        <w:t>BigData4Imaging: Conference and workshop for training in machine and deep learning (2018)</w:t>
-      </w:r>
-    </w:p>
-    <w:p>
-      <w:pPr>
-        <w:keepNext/>
-        <w:keepLines/>
-        <w:spacing w:after="120" w:line="240" w:lineRule="auto"/>
-        <w:rPr>
-          <w:rFonts w:ascii="Times New Roman" w:hAnsi="Times New Roman" w:cs="Times New Roman"/>
-          <w:color w:val="000000" w:themeColor="text1"/>
-        </w:rPr>
-      </w:pPr>
     </w:p>
     <w:p>
       <w:pPr>
@@ -7401,14 +8088,26 @@
     </w:p>
     <w:p>
       <w:pPr>
-        <w:keepNext/>
-        <w:keepLines/>
-        <w:spacing w:after="60" w:line="240" w:lineRule="auto"/>
-        <w:rPr>
-          <w:rFonts w:ascii="Times New Roman" w:hAnsi="Times New Roman" w:cs="Times New Roman"/>
-          <w:color w:val="000000" w:themeColor="text1"/>
-        </w:rPr>
-      </w:pPr>
+        <w:tabs>
+          <w:tab w:val="left" w:pos="2016"/>
+        </w:tabs>
+        <w:spacing w:after="60"/>
+        <w:ind w:left="2016" w:hanging="2016"/>
+      </w:pPr>
+      <w:r>
+        <w:rPr>
+          <w:rFonts w:ascii="Times New Roman" w:hAnsi="Times New Roman"/>
+          <w:sz w:val="22"/>
+        </w:rPr>
+        <w:t xml:space="preserve">2022</w:t>
+      </w:r>
+      <w:r>
+        <w:rPr>
+          <w:rFonts w:ascii="Times New Roman" w:hAnsi="Times New Roman"/>
+          <w:sz w:val="22"/>
+        </w:rPr>
+        <w:tab/>
+      </w:r>
       <w:r>
         <w:rPr>
           <w:rFonts w:ascii="Times New Roman" w:hAnsi="Times New Roman" w:cs="Times New Roman"/>
@@ -7422,23 +8121,31 @@
           <w:rFonts w:ascii="Times New Roman" w:hAnsi="Times New Roman" w:cs="Times New Roman"/>
           <w:color w:val="000000" w:themeColor="text1"/>
         </w:rPr>
-        <w:t xml:space="preserve">: Received ordination to minister for the wedding of friends (2022)</w:t>
-      </w:r>
-    </w:p>
-    <w:p>
-      <w:pPr>
-        <w:keepNext/>
-        <w:keepLines/>
-        <w:widowControl/>
-        <w:autoSpaceDE w:val="0"/>
-        <w:autoSpaceDN w:val="0"/>
-        <w:adjustRightInd w:val="0"/>
-        <w:spacing w:after="60" w:line="240" w:lineRule="auto"/>
-        <w:rPr>
-          <w:rFonts w:ascii="Times New Roman" w:hAnsi="Times New Roman" w:cs="Times New Roman"/>
-          <w:color w:val="000000" w:themeColor="text1"/>
-        </w:rPr>
-      </w:pPr>
+        <w:t xml:space="preserve">: Received ordination to minister for the wedding of friends</w:t>
+      </w:r>
+    </w:p>
+    <w:p>
+      <w:pPr>
+        <w:tabs>
+          <w:tab w:val="left" w:pos="2016"/>
+        </w:tabs>
+        <w:spacing w:after="60"/>
+        <w:ind w:left="2016" w:hanging="2016"/>
+      </w:pPr>
+      <w:r>
+        <w:rPr>
+          <w:rFonts w:ascii="Times New Roman" w:hAnsi="Times New Roman"/>
+          <w:sz w:val="22"/>
+        </w:rPr>
+        <w:t xml:space="preserve">2008</w:t>
+      </w:r>
+      <w:r>
+        <w:rPr>
+          <w:rFonts w:ascii="Times New Roman" w:hAnsi="Times New Roman"/>
+          <w:sz w:val="22"/>
+        </w:rPr>
+        <w:tab/>
+      </w:r>
       <w:r>
         <w:rPr>
           <w:rFonts w:ascii="Times New Roman" w:hAnsi="Times New Roman" w:cs="Times New Roman"/>
@@ -7447,28 +8154,6 @@
         </w:rPr>
         <w:t>Eagle Scout</w:t>
       </w:r>
-      <w:r>
-        <w:rPr>
-          <w:rFonts w:ascii="Times New Roman" w:hAnsi="Times New Roman" w:cs="Times New Roman"/>
-          <w:color w:val="000000" w:themeColor="text1"/>
-        </w:rPr>
-        <w:t xml:space="preserve"> (2008)</w:t>
-      </w:r>
-    </w:p>
-    <w:p>
-      <w:pPr>
-        <w:keepNext/>
-        <w:keepLines/>
-        <w:widowControl/>
-        <w:autoSpaceDE w:val="0"/>
-        <w:autoSpaceDN w:val="0"/>
-        <w:adjustRightInd w:val="0"/>
-        <w:spacing w:after="60" w:line="240" w:lineRule="auto"/>
-        <w:rPr>
-          <w:rFonts w:ascii="Times New Roman" w:hAnsi="Times New Roman" w:cs="Times New Roman"/>
-          <w:color w:val="FFFFFF" w:themeColor="background1"/>
-        </w:rPr>
-      </w:pPr>
     </w:p>
     <w:sectPr>
       <w:headerReference w:type="default" r:id="rId8"/>

</xml_diff>

<commit_message>
Halve the date-column gap in Honors, Training, and Other
Every entry in Honors and Awards, Professional Training, and Other is a
bare 4-digit year (22pt), so the CV-wide 1.215" column left a 65.5pt gap
before the description. Move those 19 entries to a 0.76" column (1095
twips) — left indent, hanging indent, and tab stop together — halving the
gap to 32.75pt. Other sections keep the 1.215" layout for their date
ranges.

Co-Authored-By: Claude Opus 5 <noreply@anthropic.com>
</commit_message>
<xml_diff>
--- a/Clincal_CV/BMAnderson CV.docx
+++ b/Clincal_CV/BMAnderson CV.docx
@@ -2232,10 +2232,10 @@
     <w:p>
       <w:pPr>
         <w:tabs>
-          <w:tab w:val="left" w:pos="1750"/>
+          <w:tab w:pos="1095" w:val="left"/>
         </w:tabs>
         <w:spacing w:after="60"/>
-        <w:ind w:left="1750" w:hanging="1750"/>
+        <w:ind w:left="1095" w:hanging="1095"/>
       </w:pPr>
       <w:r>
         <w:rPr>
@@ -2283,10 +2283,10 @@
     <w:p>
       <w:pPr>
         <w:tabs>
-          <w:tab w:val="left" w:pos="1750"/>
+          <w:tab w:pos="1095" w:val="left"/>
         </w:tabs>
         <w:spacing w:after="60"/>
-        <w:ind w:left="1750" w:hanging="1750"/>
+        <w:ind w:left="1095" w:hanging="1095"/>
       </w:pPr>
       <w:r>
         <w:rPr>
@@ -2319,10 +2319,10 @@
     <w:p>
       <w:pPr>
         <w:tabs>
-          <w:tab w:val="left" w:pos="1750"/>
+          <w:tab w:pos="1095" w:val="left"/>
         </w:tabs>
         <w:spacing w:after="60"/>
-        <w:ind w:left="1750" w:hanging="1750"/>
+        <w:ind w:left="1095" w:hanging="1095"/>
       </w:pPr>
       <w:r>
         <w:rPr>
@@ -2355,10 +2355,10 @@
     <w:p>
       <w:pPr>
         <w:tabs>
-          <w:tab w:val="left" w:pos="1750"/>
+          <w:tab w:pos="1095" w:val="left"/>
         </w:tabs>
         <w:spacing w:after="60"/>
-        <w:ind w:left="1750" w:hanging="1750"/>
+        <w:ind w:left="1095" w:hanging="1095"/>
       </w:pPr>
       <w:r>
         <w:rPr>
@@ -2384,10 +2384,10 @@
     <w:p>
       <w:pPr>
         <w:tabs>
-          <w:tab w:val="left" w:pos="1750"/>
+          <w:tab w:pos="1095" w:val="left"/>
         </w:tabs>
         <w:spacing w:after="60"/>
-        <w:ind w:left="1750" w:hanging="1750"/>
+        <w:ind w:left="1095" w:hanging="1095"/>
       </w:pPr>
       <w:r>
         <w:rPr>
@@ -2454,10 +2454,10 @@
     <w:p>
       <w:pPr>
         <w:tabs>
-          <w:tab w:val="left" w:pos="1750"/>
+          <w:tab w:pos="1095" w:val="left"/>
         </w:tabs>
         <w:spacing w:after="60"/>
-        <w:ind w:left="1750" w:hanging="1750"/>
+        <w:ind w:left="1095" w:hanging="1095"/>
       </w:pPr>
       <w:r>
         <w:rPr>
@@ -2490,10 +2490,10 @@
     <w:p>
       <w:pPr>
         <w:tabs>
-          <w:tab w:val="left" w:pos="1750"/>
+          <w:tab w:pos="1095" w:val="left"/>
         </w:tabs>
         <w:spacing w:after="60"/>
-        <w:ind w:left="1750" w:hanging="1750"/>
+        <w:ind w:left="1095" w:hanging="1095"/>
       </w:pPr>
       <w:r>
         <w:rPr>
@@ -2542,10 +2542,10 @@
     <w:p>
       <w:pPr>
         <w:tabs>
-          <w:tab w:val="left" w:pos="1750"/>
+          <w:tab w:pos="1095" w:val="left"/>
         </w:tabs>
         <w:spacing w:after="60"/>
-        <w:ind w:left="1750" w:hanging="1750"/>
+        <w:ind w:left="1095" w:hanging="1095"/>
       </w:pPr>
       <w:r>
         <w:rPr>
@@ -2595,10 +2595,10 @@
     <w:p>
       <w:pPr>
         <w:tabs>
-          <w:tab w:val="left" w:pos="1750"/>
+          <w:tab w:pos="1095" w:val="left"/>
         </w:tabs>
         <w:spacing w:after="60"/>
-        <w:ind w:left="1750" w:hanging="1750"/>
+        <w:ind w:left="1095" w:hanging="1095"/>
       </w:pPr>
       <w:r>
         <w:rPr>
@@ -2648,10 +2648,10 @@
     <w:p>
       <w:pPr>
         <w:tabs>
-          <w:tab w:val="left" w:pos="1750"/>
+          <w:tab w:pos="1095" w:val="left"/>
         </w:tabs>
         <w:spacing w:after="60"/>
-        <w:ind w:left="1750" w:hanging="1750"/>
+        <w:ind w:left="1095" w:hanging="1095"/>
       </w:pPr>
       <w:r>
         <w:rPr>
@@ -2684,10 +2684,10 @@
     <w:p>
       <w:pPr>
         <w:tabs>
-          <w:tab w:val="left" w:pos="1750"/>
+          <w:tab w:pos="1095" w:val="left"/>
         </w:tabs>
         <w:spacing w:after="60"/>
-        <w:ind w:left="1750" w:hanging="1750"/>
+        <w:ind w:left="1095" w:hanging="1095"/>
       </w:pPr>
       <w:r>
         <w:rPr>
@@ -2737,10 +2737,10 @@
     <w:p>
       <w:pPr>
         <w:tabs>
-          <w:tab w:val="left" w:pos="1750"/>
+          <w:tab w:pos="1095" w:val="left"/>
         </w:tabs>
         <w:spacing w:after="60"/>
-        <w:ind w:left="1750" w:hanging="1750"/>
+        <w:ind w:left="1095" w:hanging="1095"/>
       </w:pPr>
       <w:r>
         <w:rPr>
@@ -2766,10 +2766,10 @@
     <w:p>
       <w:pPr>
         <w:tabs>
-          <w:tab w:val="left" w:pos="1750"/>
+          <w:tab w:pos="1095" w:val="left"/>
         </w:tabs>
         <w:spacing w:after="60"/>
-        <w:ind w:left="1750" w:hanging="1750"/>
+        <w:ind w:left="1095" w:hanging="1095"/>
       </w:pPr>
       <w:r>
         <w:rPr>
@@ -9922,10 +9922,10 @@
     <w:p>
       <w:pPr>
         <w:tabs>
-          <w:tab w:val="left" w:pos="1750"/>
+          <w:tab w:pos="1095" w:val="left"/>
         </w:tabs>
         <w:spacing w:after="60"/>
-        <w:ind w:left="1750" w:hanging="1750"/>
+        <w:ind w:left="1095" w:hanging="1095"/>
       </w:pPr>
       <w:r>
         <w:rPr>
@@ -9958,10 +9958,10 @@
     <w:p>
       <w:pPr>
         <w:tabs>
-          <w:tab w:val="left" w:pos="1750"/>
+          <w:tab w:pos="1095" w:val="left"/>
         </w:tabs>
         <w:spacing w:after="60"/>
-        <w:ind w:left="1750" w:hanging="1750"/>
+        <w:ind w:left="1095" w:hanging="1095"/>
       </w:pPr>
       <w:r>
         <w:rPr>
@@ -10010,10 +10010,10 @@
     <w:p>
       <w:pPr>
         <w:tabs>
-          <w:tab w:val="left" w:pos="1750"/>
+          <w:tab w:pos="1095" w:val="left"/>
         </w:tabs>
         <w:spacing w:after="60"/>
-        <w:ind w:left="1750" w:hanging="1750"/>
+        <w:ind w:left="1095" w:hanging="1095"/>
       </w:pPr>
       <w:r>
         <w:rPr>
@@ -10046,10 +10046,10 @@
     <w:p>
       <w:pPr>
         <w:tabs>
-          <w:tab w:val="left" w:pos="1750"/>
+          <w:tab w:pos="1095" w:val="left"/>
         </w:tabs>
         <w:spacing w:after="60"/>
-        <w:ind w:left="1750" w:hanging="1750"/>
+        <w:ind w:left="1095" w:hanging="1095"/>
       </w:pPr>
       <w:r>
         <w:rPr>
@@ -10109,10 +10109,10 @@
     <w:p>
       <w:pPr>
         <w:tabs>
-          <w:tab w:val="left" w:pos="1750"/>
+          <w:tab w:pos="1095" w:val="left"/>
         </w:tabs>
         <w:spacing w:after="60"/>
-        <w:ind w:left="1750" w:hanging="1750"/>
+        <w:ind w:left="1095" w:hanging="1095"/>
       </w:pPr>
       <w:r>
         <w:rPr>
@@ -10145,10 +10145,10 @@
     <w:p>
       <w:pPr>
         <w:tabs>
-          <w:tab w:val="left" w:pos="1750"/>
+          <w:tab w:pos="1095" w:val="left"/>
         </w:tabs>
         <w:spacing w:after="60"/>
-        <w:ind w:left="1750" w:hanging="1750"/>
+        <w:ind w:left="1095" w:hanging="1095"/>
       </w:pPr>
       <w:r>
         <w:rPr>

</xml_diff>